<commit_message>
Enhance training document with Coursera-style structure
- Add course overview page: target audience, objectives, tech stack, prerequisites
- Add skills badges (GitHub, Claude Code, Automatisation IA, Veille, Production editoriale)
- Add learning outcomes with checkmarks for each module
- Add module metadata (duration, level, type)
- Add program summary table with 5 modules breakdown
- Add recap page with acquired competencies
- Improve visual hierarchy and readability

https://claude.ai/code/session_01AX8JiWSuFaZ7Un1Ws6Zwr3
</commit_message>
<xml_diff>
--- a/Formation_Newsletter_Banking_AresCo.docx
+++ b/Formation_Newsletter_Banking_AresCo.docx
@@ -4,7 +4,7 @@
   <w:body>
     <w:p>
       <w:pPr>
-        <w:spacing w:before="1600"/>
+        <w:spacing w:before="1200"/>
         <w:jc w:val="center"/>
       </w:pPr>
       <w:r>
@@ -33,13 +33,7 @@
     </w:p>
     <w:p>
       <w:pPr>
-        <w:spacing w:before="1000"/>
-        <w:jc w:val="center"/>
-      </w:pPr>
-    </w:p>
-    <w:p>
-      <w:pPr>
-        <w:spacing w:before="600"/>
+        <w:spacing w:before="800"/>
         <w:jc w:val="center"/>
       </w:pPr>
       <w:r>
@@ -47,9 +41,9 @@
           <w:rFonts w:ascii="Arial" w:hAnsi="Arial"/>
           <w:b/>
           <w:color w:val="57AEE0"/>
-          <w:sz w:val="28"/>
+          <w:sz w:val="24"/>
         </w:rPr>
-        <w:t>FICHE DE FORMATION</w:t>
+        <w:t>PROGRAMME DE FORMATION</w:t>
       </w:r>
     </w:p>
     <w:p>
@@ -62,7 +56,7 @@
           <w:rFonts w:ascii="Arial" w:hAnsi="Arial"/>
           <w:b/>
           <w:color w:val="051E3B"/>
-          <w:sz w:val="44"/>
+          <w:sz w:val="48"/>
         </w:rPr>
         <w:t>Production de la Newsletter Banking</w:t>
       </w:r>
@@ -78,19 +72,681 @@
           <w:color w:val="051E5B"/>
           <w:sz w:val="26"/>
         </w:rPr>
-        <w:t>Workflow GitHub &amp; Automatisation IA</w:t>
+        <w:t>Creer un MVP de generation de newsletter assiste par IA</w:t>
       </w:r>
+    </w:p>
+    <w:p>
+      <w:pPr>
+        <w:spacing w:before="500"/>
+        <w:jc w:val="center"/>
+      </w:pPr>
+      <w:r>
+        <w:rPr>
+          <w:rFonts w:ascii="Arial" w:hAnsi="Arial"/>
+          <w:b/>
+          <w:color w:val="57AEE0"/>
+          <w:sz w:val="18"/>
+        </w:rPr>
+        <w:t xml:space="preserve"> GitHub </w:t>
+      </w:r>
+      <w:r>
+        <w:rPr>
+          <w:color w:val="718096"/>
+        </w:rPr>
+        <w:t xml:space="preserve">  •  </w:t>
+      </w:r>
+      <w:r>
+        <w:rPr>
+          <w:rFonts w:ascii="Arial" w:hAnsi="Arial"/>
+          <w:b/>
+          <w:color w:val="57AEE0"/>
+          <w:sz w:val="18"/>
+        </w:rPr>
+        <w:t xml:space="preserve"> Claude Code </w:t>
+      </w:r>
+      <w:r>
+        <w:rPr>
+          <w:color w:val="718096"/>
+        </w:rPr>
+        <w:t xml:space="preserve">  •  </w:t>
+      </w:r>
+      <w:r>
+        <w:rPr>
+          <w:rFonts w:ascii="Arial" w:hAnsi="Arial"/>
+          <w:b/>
+          <w:color w:val="57AEE0"/>
+          <w:sz w:val="18"/>
+        </w:rPr>
+        <w:t xml:space="preserve"> Automatisation IA </w:t>
+      </w:r>
+      <w:r>
+        <w:rPr>
+          <w:color w:val="718096"/>
+        </w:rPr>
+        <w:t xml:space="preserve">  •  </w:t>
+      </w:r>
+      <w:r>
+        <w:rPr>
+          <w:rFonts w:ascii="Arial" w:hAnsi="Arial"/>
+          <w:b/>
+          <w:color w:val="57AEE0"/>
+          <w:sz w:val="18"/>
+        </w:rPr>
+        <w:t xml:space="preserve"> Veille sectorielle </w:t>
+      </w:r>
+      <w:r>
+        <w:rPr>
+          <w:color w:val="718096"/>
+        </w:rPr>
+        <w:t xml:space="preserve">  •  </w:t>
+      </w:r>
+      <w:r>
+        <w:rPr>
+          <w:rFonts w:ascii="Arial" w:hAnsi="Arial"/>
+          <w:b/>
+          <w:color w:val="57AEE0"/>
+          <w:sz w:val="18"/>
+        </w:rPr>
+        <w:t xml:space="preserve"> Production editoriale </w:t>
+      </w:r>
+    </w:p>
+    <w:p>
+      <w:pPr>
+        <w:spacing w:before="80" w:after="80"/>
+        <w:pBdr>
+          <w:bottom w:val="single" w:sz="4" w:space="1" w:color="E2E8F0"/>
+        </w:pBdr>
+      </w:pPr>
     </w:p>
     <w:p/>
     <w:tbl>
       <w:tblPr>
+        <w:tblStyle w:val="TableGrid"/>
+        <w:tblW w:type="auto" w:w="0"/>
+        <w:jc w:val="left"/>
+        <w:tblLook w:firstColumn="1" w:firstRow="1" w:lastColumn="0" w:lastRow="0" w:noHBand="0" w:noVBand="1" w:val="04A0"/>
+      </w:tblPr>
+      <w:tblGrid>
+        <w:gridCol w:w="4703"/>
+        <w:gridCol w:w="4703"/>
+      </w:tblGrid>
+      <w:tr>
+        <w:tc>
+          <w:tcPr>
+            <w:tcW w:type="dxa" w:w="2268"/>
+            <w:shd w:fill="F0F4F8"/>
+          </w:tcPr>
+          <w:p>
+            <w:pPr>
+              <w:spacing w:before="40" w:after="40"/>
+            </w:pPr>
+            <w:r/>
+            <w:r>
+              <w:rPr>
+                <w:rFonts w:ascii="Arial" w:hAnsi="Arial"/>
+                <w:b/>
+                <w:color w:val="051E3B"/>
+                <w:sz w:val="18"/>
+              </w:rPr>
+              <w:t>Niveau</w:t>
+            </w:r>
+          </w:p>
+        </w:tc>
+        <w:tc>
+          <w:tcPr>
+            <w:tcW w:type="dxa" w:w="6803"/>
+          </w:tcPr>
+          <w:p>
+            <w:pPr>
+              <w:spacing w:before="40" w:after="40"/>
+            </w:pPr>
+            <w:r/>
+            <w:r>
+              <w:rPr>
+                <w:rFonts w:ascii="Arial" w:hAnsi="Arial"/>
+                <w:b w:val="0"/>
+                <w:color w:val="2D3748"/>
+                <w:sz w:val="18"/>
+              </w:rPr>
+              <w:t>Debutant - Aucune competence technique requise</w:t>
+            </w:r>
+          </w:p>
+        </w:tc>
+      </w:tr>
+      <w:tr>
+        <w:tc>
+          <w:tcPr>
+            <w:tcW w:type="dxa" w:w="2268"/>
+            <w:shd w:fill="F0F4F8"/>
+          </w:tcPr>
+          <w:p>
+            <w:pPr>
+              <w:spacing w:before="40" w:after="40"/>
+            </w:pPr>
+            <w:r/>
+            <w:r>
+              <w:rPr>
+                <w:rFonts w:ascii="Arial" w:hAnsi="Arial"/>
+                <w:b/>
+                <w:color w:val="051E3B"/>
+                <w:sz w:val="18"/>
+              </w:rPr>
+              <w:t>Duree totale</w:t>
+            </w:r>
+          </w:p>
+        </w:tc>
+        <w:tc>
+          <w:tcPr>
+            <w:tcW w:type="dxa" w:w="6803"/>
+          </w:tcPr>
+          <w:p>
+            <w:pPr>
+              <w:spacing w:before="40" w:after="40"/>
+            </w:pPr>
+            <w:r/>
+            <w:r>
+              <w:rPr>
+                <w:rFonts w:ascii="Arial" w:hAnsi="Arial"/>
+                <w:b w:val="0"/>
+                <w:color w:val="2D3748"/>
+                <w:sz w:val="18"/>
+              </w:rPr>
+              <w:t>1h30 (45 min theorie + 45 min pratique)</w:t>
+            </w:r>
+          </w:p>
+        </w:tc>
+      </w:tr>
+      <w:tr>
+        <w:tc>
+          <w:tcPr>
+            <w:tcW w:type="dxa" w:w="2268"/>
+            <w:shd w:fill="F0F4F8"/>
+          </w:tcPr>
+          <w:p>
+            <w:pPr>
+              <w:spacing w:before="40" w:after="40"/>
+            </w:pPr>
+            <w:r/>
+            <w:r>
+              <w:rPr>
+                <w:rFonts w:ascii="Arial" w:hAnsi="Arial"/>
+                <w:b/>
+                <w:color w:val="051E3B"/>
+                <w:sz w:val="18"/>
+              </w:rPr>
+              <w:t>Format</w:t>
+            </w:r>
+          </w:p>
+        </w:tc>
+        <w:tc>
+          <w:tcPr>
+            <w:tcW w:type="dxa" w:w="6803"/>
+          </w:tcPr>
+          <w:p>
+            <w:pPr>
+              <w:spacing w:before="40" w:after="40"/>
+            </w:pPr>
+            <w:r/>
+            <w:r>
+              <w:rPr>
+                <w:rFonts w:ascii="Arial" w:hAnsi="Arial"/>
+                <w:b w:val="0"/>
+                <w:color w:val="2D3748"/>
+                <w:sz w:val="18"/>
+              </w:rPr>
+              <w:t>Presentiel avec demo live et exercices guides</w:t>
+            </w:r>
+          </w:p>
+        </w:tc>
+      </w:tr>
+      <w:tr>
+        <w:tc>
+          <w:tcPr>
+            <w:tcW w:type="dxa" w:w="2268"/>
+            <w:shd w:fill="F0F4F8"/>
+          </w:tcPr>
+          <w:p>
+            <w:pPr>
+              <w:spacing w:before="40" w:after="40"/>
+            </w:pPr>
+            <w:r/>
+            <w:r>
+              <w:rPr>
+                <w:rFonts w:ascii="Arial" w:hAnsi="Arial"/>
+                <w:b/>
+                <w:color w:val="051E3B"/>
+                <w:sz w:val="18"/>
+              </w:rPr>
+              <w:t>Langue</w:t>
+            </w:r>
+          </w:p>
+        </w:tc>
+        <w:tc>
+          <w:tcPr>
+            <w:tcW w:type="dxa" w:w="6803"/>
+          </w:tcPr>
+          <w:p>
+            <w:pPr>
+              <w:spacing w:before="40" w:after="40"/>
+            </w:pPr>
+            <w:r/>
+            <w:r>
+              <w:rPr>
+                <w:rFonts w:ascii="Arial" w:hAnsi="Arial"/>
+                <w:b w:val="0"/>
+                <w:color w:val="2D3748"/>
+                <w:sz w:val="18"/>
+              </w:rPr>
+              <w:t>Francais</w:t>
+            </w:r>
+          </w:p>
+        </w:tc>
+      </w:tr>
+    </w:tbl>
+    <w:p/>
+    <w:p>
+      <w:pPr>
+        <w:spacing w:before="300"/>
+      </w:pPr>
+      <w:r>
+        <w:rPr>
+          <w:rFonts w:ascii="Arial" w:hAnsi="Arial"/>
+          <w:b/>
+          <w:color w:val="051E3B"/>
+          <w:sz w:val="28"/>
+        </w:rPr>
+        <w:t>Ce que vous apprendrez</w:t>
+      </w:r>
+    </w:p>
+    <w:p>
+      <w:pPr>
+        <w:spacing w:before="60" w:after="60"/>
+        <w:ind w:left="567"/>
+      </w:pPr>
+      <w:r>
+        <w:rPr>
+          <w:rFonts w:ascii="Arial" w:hAnsi="Arial"/>
+          <w:b/>
+          <w:color w:val="059669"/>
+          <w:sz w:val="20"/>
+        </w:rPr>
+        <w:t xml:space="preserve">✓  </w:t>
+      </w:r>
+      <w:r>
+        <w:rPr>
+          <w:rFonts w:ascii="Arial" w:hAnsi="Arial"/>
+          <w:color w:val="2D3748"/>
+          <w:sz w:val="20"/>
+        </w:rPr>
+        <w:t>Comprendre le fonctionnement d'un pipeline de generation de contenu assiste par IA</w:t>
+      </w:r>
+    </w:p>
+    <w:p>
+      <w:pPr>
+        <w:spacing w:before="60" w:after="60"/>
+        <w:ind w:left="567"/>
+      </w:pPr>
+      <w:r>
+        <w:rPr>
+          <w:rFonts w:ascii="Arial" w:hAnsi="Arial"/>
+          <w:b/>
+          <w:color w:val="059669"/>
+          <w:sz w:val="20"/>
+        </w:rPr>
+        <w:t xml:space="preserve">✓  </w:t>
+      </w:r>
+      <w:r>
+        <w:rPr>
+          <w:rFonts w:ascii="Arial" w:hAnsi="Arial"/>
+          <w:color w:val="2D3748"/>
+          <w:sz w:val="20"/>
+        </w:rPr>
+        <w:t>Naviguer dans un projet GitHub sans etre developpeur</w:t>
+      </w:r>
+    </w:p>
+    <w:p>
+      <w:pPr>
+        <w:spacing w:before="60" w:after="60"/>
+        <w:ind w:left="567"/>
+      </w:pPr>
+      <w:r>
+        <w:rPr>
+          <w:rFonts w:ascii="Arial" w:hAnsi="Arial"/>
+          <w:b/>
+          <w:color w:val="059669"/>
+          <w:sz w:val="20"/>
+        </w:rPr>
+        <w:t xml:space="preserve">✓  </w:t>
+      </w:r>
+      <w:r>
+        <w:rPr>
+          <w:rFonts w:ascii="Arial" w:hAnsi="Arial"/>
+          <w:color w:val="2D3748"/>
+          <w:sz w:val="20"/>
+        </w:rPr>
+        <w:t>Piloter la production d'une newsletter via Issues, Milestones et Pull Requests</w:t>
+      </w:r>
+    </w:p>
+    <w:p>
+      <w:pPr>
+        <w:spacing w:before="60" w:after="60"/>
+        <w:ind w:left="567"/>
+      </w:pPr>
+      <w:r>
+        <w:rPr>
+          <w:rFonts w:ascii="Arial" w:hAnsi="Arial"/>
+          <w:b/>
+          <w:color w:val="059669"/>
+          <w:sz w:val="20"/>
+        </w:rPr>
+        <w:t xml:space="preserve">✓  </w:t>
+      </w:r>
+      <w:r>
+        <w:rPr>
+          <w:rFonts w:ascii="Arial" w:hAnsi="Arial"/>
+          <w:color w:val="2D3748"/>
+          <w:sz w:val="20"/>
+        </w:rPr>
+        <w:t>Lancer une generation de newsletter en ligne de commande</w:t>
+      </w:r>
+    </w:p>
+    <w:p>
+      <w:pPr>
+        <w:spacing w:before="60" w:after="60"/>
+        <w:ind w:left="567"/>
+      </w:pPr>
+      <w:r>
+        <w:rPr>
+          <w:rFonts w:ascii="Arial" w:hAnsi="Arial"/>
+          <w:b/>
+          <w:color w:val="059669"/>
+          <w:sz w:val="20"/>
+        </w:rPr>
+        <w:t xml:space="preserve">✓  </w:t>
+      </w:r>
+      <w:r>
+        <w:rPr>
+          <w:rFonts w:ascii="Arial" w:hAnsi="Arial"/>
+          <w:color w:val="2D3748"/>
+          <w:sz w:val="20"/>
+        </w:rPr>
+        <w:t>Modifier les sources RSS et les themes editoriaux en autonomie</w:t>
+      </w:r>
+    </w:p>
+    <w:p>
+      <w:r>
+        <w:br w:type="page"/>
+      </w:r>
+    </w:p>
+    <w:p>
+      <w:pPr>
+        <w:pStyle w:val="Heading1"/>
+      </w:pPr>
+      <w:r>
+        <w:t>Presentation de la formation</w:t>
+      </w:r>
+    </w:p>
+    <w:p>
+      <w:pPr>
+        <w:pStyle w:val="Heading2"/>
+      </w:pPr>
+      <w:r>
+        <w:t>A qui s'adresse cette formation ?</w:t>
+      </w:r>
+    </w:p>
+    <w:p>
+      <w:pPr>
+        <w:spacing w:after="120"/>
+      </w:pPr>
+      <w:r>
+        <w:rPr>
+          <w:rFonts w:ascii="Arial" w:hAnsi="Arial"/>
+          <w:color w:val="2D3748"/>
+          <w:sz w:val="20"/>
+        </w:rPr>
+        <w:t>Cette formation est concue pour les collaborateurs Ares &amp; Co impliques dans la production ou la gouvernance de la newsletter Banking mensuelle :</w:t>
+      </w:r>
+    </w:p>
+    <w:p>
+      <w:pPr>
+        <w:pStyle w:val="ListBullet"/>
+        <w:spacing w:before="40" w:after="40"/>
+        <w:ind w:left="850"/>
+      </w:pPr>
+      <w:r>
+        <w:rPr>
+          <w:rFonts w:ascii="Arial" w:hAnsi="Arial"/>
+          <w:b/>
+          <w:color w:val="2D3748"/>
+          <w:sz w:val="20"/>
+        </w:rPr>
+        <w:t xml:space="preserve">Membres du CODEV : </w:t>
+      </w:r>
+      <w:r>
+        <w:rPr>
+          <w:rFonts w:ascii="Arial" w:hAnsi="Arial"/>
+          <w:color w:val="2D3748"/>
+          <w:sz w:val="20"/>
+        </w:rPr>
+        <w:t>pilotage editorial, validation des orientations thematiques, feedback</w:t>
+      </w:r>
+    </w:p>
+    <w:p>
+      <w:pPr>
+        <w:pStyle w:val="ListBullet"/>
+        <w:spacing w:before="40" w:after="40"/>
+        <w:ind w:left="850"/>
+      </w:pPr>
+      <w:r>
+        <w:rPr>
+          <w:rFonts w:ascii="Arial" w:hAnsi="Arial"/>
+          <w:b/>
+          <w:color w:val="2D3748"/>
+          <w:sz w:val="20"/>
+        </w:rPr>
+        <w:t xml:space="preserve">Contributeurs terrain : </w:t>
+      </w:r>
+      <w:r>
+        <w:rPr>
+          <w:rFonts w:ascii="Arial" w:hAnsi="Arial"/>
+          <w:color w:val="2D3748"/>
+          <w:sz w:val="20"/>
+        </w:rPr>
+        <w:t>remontee de cas clients pour la rubrique "Terrain Ares &amp; Co"</w:t>
+      </w:r>
+    </w:p>
+    <w:p>
+      <w:pPr>
+        <w:pStyle w:val="ListBullet"/>
+        <w:spacing w:before="40" w:after="40"/>
+        <w:ind w:left="850"/>
+      </w:pPr>
+      <w:r>
+        <w:rPr>
+          <w:rFonts w:ascii="Arial" w:hAnsi="Arial"/>
+          <w:b/>
+          <w:color w:val="2D3748"/>
+          <w:sz w:val="20"/>
+        </w:rPr>
+        <w:t xml:space="preserve">Futurs pilotes newsletter : </w:t>
+      </w:r>
+      <w:r>
+        <w:rPr>
+          <w:rFonts w:ascii="Arial" w:hAnsi="Arial"/>
+          <w:color w:val="2D3748"/>
+          <w:sz w:val="20"/>
+        </w:rPr>
+        <w:t>autonomie complete sur le cycle de production</w:t>
+      </w:r>
+    </w:p>
+    <w:p>
+      <w:pPr>
+        <w:spacing w:after="120"/>
+      </w:pPr>
+      <w:r>
+        <w:rPr>
+          <w:rFonts w:ascii="Arial" w:hAnsi="Arial"/>
+          <w:color w:val="2D3748"/>
+          <w:sz w:val="20"/>
+        </w:rPr>
+        <w:t>Aucune competence en developpement n'est requise. La formation est accessible a tout profil consultant ou manager.</w:t>
+      </w:r>
+    </w:p>
+    <w:p>
+      <w:pPr>
+        <w:spacing w:before="80" w:after="80"/>
+        <w:pBdr>
+          <w:bottom w:val="single" w:sz="4" w:space="1" w:color="E2E8F0"/>
+        </w:pBdr>
+      </w:pPr>
+    </w:p>
+    <w:p>
+      <w:pPr>
+        <w:pStyle w:val="Heading2"/>
+      </w:pPr>
+      <w:r>
+        <w:t>Objectif de la formation</w:t>
+      </w:r>
+    </w:p>
+    <w:p>
+      <w:r>
+        <w:rPr>
+          <w:rFonts w:ascii="Arial" w:hAnsi="Arial"/>
+          <w:b/>
+          <w:color w:val="051E5B"/>
+          <w:sz w:val="22"/>
+        </w:rPr>
+        <w:t>Creer rapidement un MVP de generation de newsletter assiste par IA</w:t>
+      </w:r>
+    </w:p>
+    <w:p>
+      <w:pPr>
+        <w:spacing w:after="120"/>
+      </w:pPr>
+      <w:r>
+        <w:rPr>
+          <w:rFonts w:ascii="Arial" w:hAnsi="Arial"/>
+          <w:color w:val="2D3748"/>
+          <w:sz w:val="20"/>
+        </w:rPr>
+        <w:t>A l'issue de la formation, les participants seront capables de :</w:t>
+      </w:r>
+    </w:p>
+    <w:p>
+      <w:pPr>
+        <w:pStyle w:val="ListBullet"/>
+        <w:spacing w:before="40" w:after="40"/>
+        <w:ind w:left="850"/>
+      </w:pPr>
+      <w:r>
+        <w:rPr>
+          <w:rFonts w:ascii="Arial" w:hAnsi="Arial"/>
+          <w:color w:val="2D3748"/>
+          <w:sz w:val="20"/>
+        </w:rPr>
+        <w:t>Comprendre l'architecture du pipeline (collecte → curation → redaction → publication)</w:t>
+      </w:r>
+    </w:p>
+    <w:p>
+      <w:pPr>
+        <w:pStyle w:val="ListBullet"/>
+        <w:spacing w:before="40" w:after="40"/>
+        <w:ind w:left="850"/>
+      </w:pPr>
+      <w:r>
+        <w:rPr>
+          <w:rFonts w:ascii="Arial" w:hAnsi="Arial"/>
+          <w:color w:val="2D3748"/>
+          <w:sz w:val="20"/>
+        </w:rPr>
+        <w:t>Utiliser GitHub comme outil de pilotage editorial (sans coder)</w:t>
+      </w:r>
+    </w:p>
+    <w:p>
+      <w:pPr>
+        <w:pStyle w:val="ListBullet"/>
+        <w:spacing w:before="40" w:after="40"/>
+        <w:ind w:left="850"/>
+      </w:pPr>
+      <w:r>
+        <w:rPr>
+          <w:rFonts w:ascii="Arial" w:hAnsi="Arial"/>
+          <w:color w:val="2D3748"/>
+          <w:sz w:val="20"/>
+        </w:rPr>
+        <w:t>Declencher une generation de newsletter et controler le resultat</w:t>
+      </w:r>
+    </w:p>
+    <w:p>
+      <w:pPr>
+        <w:pStyle w:val="ListBullet"/>
+        <w:spacing w:before="40" w:after="40"/>
+        <w:ind w:left="850"/>
+      </w:pPr>
+      <w:r>
+        <w:rPr>
+          <w:rFonts w:ascii="Arial" w:hAnsi="Arial"/>
+          <w:color w:val="2D3748"/>
+          <w:sz w:val="20"/>
+        </w:rPr>
+        <w:t>Proposer des ajustements (sources, themes, ton) de maniere autonome</w:t>
+      </w:r>
+    </w:p>
+    <w:p>
+      <w:pPr>
+        <w:pStyle w:val="ListBullet"/>
+        <w:spacing w:before="40" w:after="40"/>
+        <w:ind w:left="850"/>
+      </w:pPr>
+      <w:r>
+        <w:rPr>
+          <w:rFonts w:ascii="Arial" w:hAnsi="Arial"/>
+          <w:color w:val="2D3748"/>
+          <w:sz w:val="20"/>
+        </w:rPr>
+        <w:t>Collaborer efficacement avec l'equipe technique via Issues et Pull Requests</w:t>
+      </w:r>
+    </w:p>
+    <w:p>
+      <w:pPr>
+        <w:spacing w:before="80" w:after="80"/>
+        <w:pBdr>
+          <w:bottom w:val="single" w:sz="4" w:space="1" w:color="E2E8F0"/>
+        </w:pBdr>
+      </w:pPr>
+    </w:p>
+    <w:p>
+      <w:pPr>
+        <w:pStyle w:val="Heading2"/>
+      </w:pPr>
+      <w:r>
+        <w:t>Stack technique</w:t>
+      </w:r>
+    </w:p>
+    <w:p>
+      <w:pPr>
+        <w:spacing w:after="120"/>
+      </w:pPr>
+      <w:r>
+        <w:rPr>
+          <w:rFonts w:ascii="Arial" w:hAnsi="Arial"/>
+          <w:color w:val="2D3748"/>
+          <w:sz w:val="20"/>
+        </w:rPr>
+        <w:t>La solution repose sur les briques suivantes :</w:t>
+      </w:r>
+    </w:p>
+    <w:tbl>
+      <w:tblPr>
+        <w:tblStyle w:val="TableGrid"/>
         <w:tblW w:type="auto" w:w="0"/>
         <w:jc w:val="center"/>
         <w:tblLook w:firstColumn="1" w:firstRow="1" w:lastColumn="0" w:lastRow="0" w:noHBand="0" w:noVBand="1" w:val="04A0"/>
       </w:tblPr>
       <w:tblGrid>
-        <w:gridCol w:w="4703"/>
-        <w:gridCol w:w="4703"/>
+        <w:gridCol w:w="3135"/>
+        <w:gridCol w:w="3135"/>
+        <w:gridCol w:w="3135"/>
       </w:tblGrid>
       <w:tr>
         <w:tc>
@@ -108,37 +764,15 @@
                 <w:rFonts w:ascii="Arial" w:hAnsi="Arial"/>
                 <w:b/>
                 <w:color w:val="FFFFFF"/>
-                <w:sz w:val="20"/>
+                <w:sz w:val="18"/>
               </w:rPr>
-              <w:t>Public</w:t>
+              <w:t>Brique</w:t>
             </w:r>
           </w:p>
         </w:tc>
         <w:tc>
           <w:tcPr>
-            <w:tcW w:type="dxa" w:w="5669"/>
-          </w:tcPr>
-          <w:p>
-            <w:pPr>
-              <w:spacing w:before="40" w:after="40"/>
-            </w:pPr>
-            <w:r/>
-            <w:r>
-              <w:rPr>
-                <w:rFonts w:ascii="Arial" w:hAnsi="Arial"/>
-                <w:b w:val="0"/>
-                <w:color w:val="2D3748"/>
-                <w:sz w:val="20"/>
-              </w:rPr>
-              <w:t>Membres CODEV + contributeurs terrain</w:t>
-            </w:r>
-          </w:p>
-        </w:tc>
-      </w:tr>
-      <w:tr>
-        <w:tc>
-          <w:tcPr>
-            <w:tcW w:type="dxa" w:w="1701"/>
+            <w:tcW w:type="dxa" w:w="3118"/>
             <w:shd w:fill="051E3B"/>
           </w:tcPr>
           <w:p>
@@ -151,37 +785,15 @@
                 <w:rFonts w:ascii="Arial" w:hAnsi="Arial"/>
                 <w:b/>
                 <w:color w:val="FFFFFF"/>
-                <w:sz w:val="20"/>
+                <w:sz w:val="18"/>
               </w:rPr>
-              <w:t>Duree</w:t>
+              <w:t>Role</w:t>
             </w:r>
           </w:p>
         </w:tc>
         <w:tc>
           <w:tcPr>
-            <w:tcW w:type="dxa" w:w="5669"/>
-          </w:tcPr>
-          <w:p>
-            <w:pPr>
-              <w:spacing w:before="40" w:after="40"/>
-            </w:pPr>
-            <w:r/>
-            <w:r>
-              <w:rPr>
-                <w:rFonts w:ascii="Arial" w:hAnsi="Arial"/>
-                <w:b w:val="0"/>
-                <w:color w:val="2D3748"/>
-                <w:sz w:val="20"/>
-              </w:rPr>
-              <w:t>1h30 (45 min presentation + 45 min pratique)</w:t>
-            </w:r>
-          </w:p>
-        </w:tc>
-      </w:tr>
-      <w:tr>
-        <w:tc>
-          <w:tcPr>
-            <w:tcW w:type="dxa" w:w="1701"/>
+            <w:tcW w:type="dxa" w:w="3969"/>
             <w:shd w:fill="051E3B"/>
           </w:tcPr>
           <w:p>
@@ -194,15 +806,17 @@
                 <w:rFonts w:ascii="Arial" w:hAnsi="Arial"/>
                 <w:b/>
                 <w:color w:val="FFFFFF"/>
-                <w:sz w:val="20"/>
+                <w:sz w:val="18"/>
               </w:rPr>
-              <w:t>Prerequis</w:t>
+              <w:t>Usage participant</w:t>
             </w:r>
           </w:p>
         </w:tc>
+      </w:tr>
+      <w:tr>
         <w:tc>
           <w:tcPr>
-            <w:tcW w:type="dxa" w:w="5669"/>
+            <w:tcW w:type="dxa" w:w="1701"/>
           </w:tcPr>
           <w:p>
             <w:pPr>
@@ -214,9 +828,49 @@
                 <w:rFonts w:ascii="Arial" w:hAnsi="Arial"/>
                 <w:b w:val="0"/>
                 <w:color w:val="2D3748"/>
-                <w:sz w:val="20"/>
+                <w:sz w:val="18"/>
               </w:rPr>
-              <w:t>Compte GitHub avec acces au repo genesis</w:t>
+              <w:t>GitHub</w:t>
+            </w:r>
+          </w:p>
+        </w:tc>
+        <w:tc>
+          <w:tcPr>
+            <w:tcW w:type="dxa" w:w="3118"/>
+          </w:tcPr>
+          <w:p>
+            <w:pPr>
+              <w:spacing w:before="40" w:after="40"/>
+            </w:pPr>
+            <w:r/>
+            <w:r>
+              <w:rPr>
+                <w:rFonts w:ascii="Arial" w:hAnsi="Arial"/>
+                <w:b w:val="0"/>
+                <w:color w:val="2D3748"/>
+                <w:sz w:val="18"/>
+              </w:rPr>
+              <w:t>Hebergement du code et pilotage</w:t>
+            </w:r>
+          </w:p>
+        </w:tc>
+        <w:tc>
+          <w:tcPr>
+            <w:tcW w:type="dxa" w:w="3969"/>
+          </w:tcPr>
+          <w:p>
+            <w:pPr>
+              <w:spacing w:before="40" w:after="40"/>
+            </w:pPr>
+            <w:r/>
+            <w:r>
+              <w:rPr>
+                <w:rFonts w:ascii="Arial" w:hAnsi="Arial"/>
+                <w:b w:val="0"/>
+                <w:color w:val="2D3748"/>
+                <w:sz w:val="18"/>
+              </w:rPr>
+              <w:t>Navigation, Issues, PR (interface web)</w:t>
             </w:r>
           </w:p>
         </w:tc>
@@ -225,6 +879,444 @@
         <w:tc>
           <w:tcPr>
             <w:tcW w:type="dxa" w:w="1701"/>
+            <w:shd w:fill="F0F4F8"/>
+          </w:tcPr>
+          <w:p>
+            <w:pPr>
+              <w:spacing w:before="40" w:after="40"/>
+            </w:pPr>
+            <w:r/>
+            <w:r>
+              <w:rPr>
+                <w:rFonts w:ascii="Arial" w:hAnsi="Arial"/>
+                <w:b w:val="0"/>
+                <w:color w:val="2D3748"/>
+                <w:sz w:val="18"/>
+              </w:rPr>
+              <w:t>Claude Code</w:t>
+            </w:r>
+          </w:p>
+        </w:tc>
+        <w:tc>
+          <w:tcPr>
+            <w:tcW w:type="dxa" w:w="3118"/>
+            <w:shd w:fill="F0F4F8"/>
+          </w:tcPr>
+          <w:p>
+            <w:pPr>
+              <w:spacing w:before="40" w:after="40"/>
+            </w:pPr>
+            <w:r/>
+            <w:r>
+              <w:rPr>
+                <w:rFonts w:ascii="Arial" w:hAnsi="Arial"/>
+                <w:b w:val="0"/>
+                <w:color w:val="2D3748"/>
+                <w:sz w:val="18"/>
+              </w:rPr>
+              <w:t>Assistant IA de developpement</w:t>
+            </w:r>
+          </w:p>
+        </w:tc>
+        <w:tc>
+          <w:tcPr>
+            <w:tcW w:type="dxa" w:w="3969"/>
+            <w:shd w:fill="F0F4F8"/>
+          </w:tcPr>
+          <w:p>
+            <w:pPr>
+              <w:spacing w:before="40" w:after="40"/>
+            </w:pPr>
+            <w:r/>
+            <w:r>
+              <w:rPr>
+                <w:rFonts w:ascii="Arial" w:hAnsi="Arial"/>
+                <w:b w:val="0"/>
+                <w:color w:val="2D3748"/>
+                <w:sz w:val="18"/>
+              </w:rPr>
+              <w:t>Evolutions futures, debug</w:t>
+            </w:r>
+          </w:p>
+        </w:tc>
+      </w:tr>
+      <w:tr>
+        <w:tc>
+          <w:tcPr>
+            <w:tcW w:type="dxa" w:w="1701"/>
+          </w:tcPr>
+          <w:p>
+            <w:pPr>
+              <w:spacing w:before="40" w:after="40"/>
+            </w:pPr>
+            <w:r/>
+            <w:r>
+              <w:rPr>
+                <w:rFonts w:ascii="Arial" w:hAnsi="Arial"/>
+                <w:b w:val="0"/>
+                <w:color w:val="2D3748"/>
+                <w:sz w:val="18"/>
+              </w:rPr>
+              <w:t>Claude API</w:t>
+            </w:r>
+          </w:p>
+        </w:tc>
+        <w:tc>
+          <w:tcPr>
+            <w:tcW w:type="dxa" w:w="3118"/>
+          </w:tcPr>
+          <w:p>
+            <w:pPr>
+              <w:spacing w:before="40" w:after="40"/>
+            </w:pPr>
+            <w:r/>
+            <w:r>
+              <w:rPr>
+                <w:rFonts w:ascii="Arial" w:hAnsi="Arial"/>
+                <w:b w:val="0"/>
+                <w:color w:val="2D3748"/>
+                <w:sz w:val="18"/>
+              </w:rPr>
+              <w:t>Moteur d'analyse et redaction</w:t>
+            </w:r>
+          </w:p>
+        </w:tc>
+        <w:tc>
+          <w:tcPr>
+            <w:tcW w:type="dxa" w:w="3969"/>
+          </w:tcPr>
+          <w:p>
+            <w:pPr>
+              <w:spacing w:before="40" w:after="40"/>
+            </w:pPr>
+            <w:r/>
+            <w:r>
+              <w:rPr>
+                <w:rFonts w:ascii="Arial" w:hAnsi="Arial"/>
+                <w:b w:val="0"/>
+                <w:color w:val="2D3748"/>
+                <w:sz w:val="18"/>
+              </w:rPr>
+              <w:t>Transparent (appele par le pipeline)</w:t>
+            </w:r>
+          </w:p>
+        </w:tc>
+      </w:tr>
+      <w:tr>
+        <w:tc>
+          <w:tcPr>
+            <w:tcW w:type="dxa" w:w="1701"/>
+            <w:shd w:fill="F0F4F8"/>
+          </w:tcPr>
+          <w:p>
+            <w:pPr>
+              <w:spacing w:before="40" w:after="40"/>
+            </w:pPr>
+            <w:r/>
+            <w:r>
+              <w:rPr>
+                <w:rFonts w:ascii="Arial" w:hAnsi="Arial"/>
+                <w:b w:val="0"/>
+                <w:color w:val="2D3748"/>
+                <w:sz w:val="18"/>
+              </w:rPr>
+              <w:t>Python</w:t>
+            </w:r>
+          </w:p>
+        </w:tc>
+        <w:tc>
+          <w:tcPr>
+            <w:tcW w:type="dxa" w:w="3118"/>
+            <w:shd w:fill="F0F4F8"/>
+          </w:tcPr>
+          <w:p>
+            <w:pPr>
+              <w:spacing w:before="40" w:after="40"/>
+            </w:pPr>
+            <w:r/>
+            <w:r>
+              <w:rPr>
+                <w:rFonts w:ascii="Arial" w:hAnsi="Arial"/>
+                <w:b w:val="0"/>
+                <w:color w:val="2D3748"/>
+                <w:sz w:val="18"/>
+              </w:rPr>
+              <w:t>Langage du pipeline</w:t>
+            </w:r>
+          </w:p>
+        </w:tc>
+        <w:tc>
+          <w:tcPr>
+            <w:tcW w:type="dxa" w:w="3969"/>
+            <w:shd w:fill="F0F4F8"/>
+          </w:tcPr>
+          <w:p>
+            <w:pPr>
+              <w:spacing w:before="40" w:after="40"/>
+            </w:pPr>
+            <w:r/>
+            <w:r>
+              <w:rPr>
+                <w:rFonts w:ascii="Arial" w:hAnsi="Arial"/>
+                <w:b w:val="0"/>
+                <w:color w:val="2D3748"/>
+                <w:sz w:val="18"/>
+              </w:rPr>
+              <w:t>Transparent (execution en 1 commande)</w:t>
+            </w:r>
+          </w:p>
+        </w:tc>
+      </w:tr>
+      <w:tr>
+        <w:tc>
+          <w:tcPr>
+            <w:tcW w:type="dxa" w:w="1701"/>
+          </w:tcPr>
+          <w:p>
+            <w:pPr>
+              <w:spacing w:before="40" w:after="40"/>
+            </w:pPr>
+            <w:r/>
+            <w:r>
+              <w:rPr>
+                <w:rFonts w:ascii="Arial" w:hAnsi="Arial"/>
+                <w:b w:val="0"/>
+                <w:color w:val="2D3748"/>
+                <w:sz w:val="18"/>
+              </w:rPr>
+              <w:t>YAML</w:t>
+            </w:r>
+          </w:p>
+        </w:tc>
+        <w:tc>
+          <w:tcPr>
+            <w:tcW w:type="dxa" w:w="3118"/>
+          </w:tcPr>
+          <w:p>
+            <w:pPr>
+              <w:spacing w:before="40" w:after="40"/>
+            </w:pPr>
+            <w:r/>
+            <w:r>
+              <w:rPr>
+                <w:rFonts w:ascii="Arial" w:hAnsi="Arial"/>
+                <w:b w:val="0"/>
+                <w:color w:val="2D3748"/>
+                <w:sz w:val="18"/>
+              </w:rPr>
+              <w:t>Fichiers de configuration</w:t>
+            </w:r>
+          </w:p>
+        </w:tc>
+        <w:tc>
+          <w:tcPr>
+            <w:tcW w:type="dxa" w:w="3969"/>
+          </w:tcPr>
+          <w:p>
+            <w:pPr>
+              <w:spacing w:before="40" w:after="40"/>
+            </w:pPr>
+            <w:r/>
+            <w:r>
+              <w:rPr>
+                <w:rFonts w:ascii="Arial" w:hAnsi="Arial"/>
+                <w:b w:val="0"/>
+                <w:color w:val="2D3748"/>
+                <w:sz w:val="18"/>
+              </w:rPr>
+              <w:t>Modification sources/themes (texte simple)</w:t>
+            </w:r>
+          </w:p>
+        </w:tc>
+      </w:tr>
+    </w:tbl>
+    <w:p>
+      <w:pPr>
+        <w:spacing w:before="80" w:after="80"/>
+        <w:pBdr>
+          <w:bottom w:val="single" w:sz="4" w:space="1" w:color="E2E8F0"/>
+        </w:pBdr>
+      </w:pPr>
+    </w:p>
+    <w:p>
+      <w:pPr>
+        <w:pStyle w:val="Heading2"/>
+      </w:pPr>
+      <w:r>
+        <w:t>Prerequisites</w:t>
+      </w:r>
+    </w:p>
+    <w:tbl>
+      <w:tblPr>
+        <w:tblStyle w:val="TableGrid"/>
+        <w:tblW w:type="auto" w:w="0"/>
+        <w:jc w:val="left"/>
+        <w:tblLook w:firstColumn="1" w:firstRow="1" w:lastColumn="0" w:lastRow="0" w:noHBand="0" w:noVBand="1" w:val="04A0"/>
+      </w:tblPr>
+      <w:tblGrid>
+        <w:gridCol w:w="4703"/>
+        <w:gridCol w:w="4703"/>
+      </w:tblGrid>
+      <w:tr>
+        <w:tc>
+          <w:tcPr>
+            <w:tcW w:type="dxa" w:w="2268"/>
+            <w:shd w:fill="F0F4F8"/>
+          </w:tcPr>
+          <w:p>
+            <w:pPr>
+              <w:spacing w:before="40" w:after="40"/>
+            </w:pPr>
+            <w:r/>
+            <w:r>
+              <w:rPr>
+                <w:rFonts w:ascii="Arial" w:hAnsi="Arial"/>
+                <w:b/>
+                <w:color w:val="051E3B"/>
+                <w:sz w:val="18"/>
+              </w:rPr>
+              <w:t>Compte GitHub</w:t>
+            </w:r>
+          </w:p>
+        </w:tc>
+        <w:tc>
+          <w:tcPr>
+            <w:tcW w:type="dxa" w:w="6803"/>
+          </w:tcPr>
+          <w:p>
+            <w:pPr>
+              <w:spacing w:before="40" w:after="40"/>
+            </w:pPr>
+            <w:r/>
+            <w:r>
+              <w:rPr>
+                <w:rFonts w:ascii="Arial" w:hAnsi="Arial"/>
+                <w:b w:val="0"/>
+                <w:color w:val="2D3748"/>
+                <w:sz w:val="18"/>
+              </w:rPr>
+              <w:t>Acces au repo genesis (lecture minimum, ecriture recommande)</w:t>
+            </w:r>
+          </w:p>
+        </w:tc>
+      </w:tr>
+      <w:tr>
+        <w:tc>
+          <w:tcPr>
+            <w:tcW w:type="dxa" w:w="2268"/>
+            <w:shd w:fill="F0F4F8"/>
+          </w:tcPr>
+          <w:p>
+            <w:pPr>
+              <w:spacing w:before="40" w:after="40"/>
+            </w:pPr>
+            <w:r/>
+            <w:r>
+              <w:rPr>
+                <w:rFonts w:ascii="Arial" w:hAnsi="Arial"/>
+                <w:b/>
+                <w:color w:val="051E3B"/>
+                <w:sz w:val="18"/>
+              </w:rPr>
+              <w:t>Acces terminal</w:t>
+            </w:r>
+          </w:p>
+        </w:tc>
+        <w:tc>
+          <w:tcPr>
+            <w:tcW w:type="dxa" w:w="6803"/>
+          </w:tcPr>
+          <w:p>
+            <w:pPr>
+              <w:spacing w:before="40" w:after="40"/>
+            </w:pPr>
+            <w:r/>
+            <w:r>
+              <w:rPr>
+                <w:rFonts w:ascii="Arial" w:hAnsi="Arial"/>
+                <w:b w:val="0"/>
+                <w:color w:val="2D3748"/>
+                <w:sz w:val="18"/>
+              </w:rPr>
+              <w:t>Pour lancer la commande de generation (optionnel si delegue)</w:t>
+            </w:r>
+          </w:p>
+        </w:tc>
+      </w:tr>
+      <w:tr>
+        <w:tc>
+          <w:tcPr>
+            <w:tcW w:type="dxa" w:w="2268"/>
+            <w:shd w:fill="F0F4F8"/>
+          </w:tcPr>
+          <w:p>
+            <w:pPr>
+              <w:spacing w:before="40" w:after="40"/>
+            </w:pPr>
+            <w:r/>
+            <w:r>
+              <w:rPr>
+                <w:rFonts w:ascii="Arial" w:hAnsi="Arial"/>
+                <w:b/>
+                <w:color w:val="051E3B"/>
+                <w:sz w:val="18"/>
+              </w:rPr>
+              <w:t>Navigateur web</w:t>
+            </w:r>
+          </w:p>
+        </w:tc>
+        <w:tc>
+          <w:tcPr>
+            <w:tcW w:type="dxa" w:w="6803"/>
+          </w:tcPr>
+          <w:p>
+            <w:pPr>
+              <w:spacing w:before="40" w:after="40"/>
+            </w:pPr>
+            <w:r/>
+            <w:r>
+              <w:rPr>
+                <w:rFonts w:ascii="Arial" w:hAnsi="Arial"/>
+                <w:b w:val="0"/>
+                <w:color w:val="2D3748"/>
+                <w:sz w:val="18"/>
+              </w:rPr>
+              <w:t>Pour consulter GitHub et les newsletters generees</w:t>
+            </w:r>
+          </w:p>
+        </w:tc>
+      </w:tr>
+    </w:tbl>
+    <w:p>
+      <w:r>
+        <w:br w:type="page"/>
+      </w:r>
+    </w:p>
+    <w:p>
+      <w:pPr>
+        <w:pStyle w:val="Heading1"/>
+      </w:pPr>
+      <w:r>
+        <w:t>Programme detaille</w:t>
+      </w:r>
+    </w:p>
+    <w:tbl>
+      <w:tblPr>
+        <w:tblStyle w:val="TableGrid"/>
+        <w:tblW w:type="auto" w:w="0"/>
+        <w:jc w:val="center"/>
+        <w:tblLook w:firstColumn="1" w:firstRow="1" w:lastColumn="0" w:lastRow="0" w:noHBand="0" w:noVBand="1" w:val="04A0"/>
+      </w:tblPr>
+      <w:tblGrid>
+        <w:gridCol w:w="2351"/>
+        <w:gridCol w:w="2351"/>
+        <w:gridCol w:w="2351"/>
+        <w:gridCol w:w="2351"/>
+      </w:tblGrid>
+      <w:tr>
+        <w:tc>
+          <w:tcPr>
+            <w:tcW w:type="dxa" w:w="1134"/>
             <w:shd w:fill="051E3B"/>
           </w:tcPr>
           <w:p>
@@ -237,15 +1329,80 @@
                 <w:rFonts w:ascii="Arial" w:hAnsi="Arial"/>
                 <w:b/>
                 <w:color w:val="FFFFFF"/>
-                <w:sz w:val="20"/>
+                <w:sz w:val="18"/>
               </w:rPr>
-              <w:t>Support</w:t>
+              <w:t>Module</w:t>
             </w:r>
           </w:p>
         </w:tc>
         <w:tc>
           <w:tcPr>
-            <w:tcW w:type="dxa" w:w="5669"/>
+            <w:tcW w:type="dxa" w:w="2551"/>
+            <w:shd w:fill="051E3B"/>
+          </w:tcPr>
+          <w:p>
+            <w:pPr>
+              <w:spacing w:before="40" w:after="40"/>
+            </w:pPr>
+            <w:r/>
+            <w:r>
+              <w:rPr>
+                <w:rFonts w:ascii="Arial" w:hAnsi="Arial"/>
+                <w:b/>
+                <w:color w:val="FFFFFF"/>
+                <w:sz w:val="18"/>
+              </w:rPr>
+              <w:t>Titre</w:t>
+            </w:r>
+          </w:p>
+        </w:tc>
+        <w:tc>
+          <w:tcPr>
+            <w:tcW w:type="dxa" w:w="1417"/>
+            <w:shd w:fill="051E3B"/>
+          </w:tcPr>
+          <w:p>
+            <w:pPr>
+              <w:spacing w:before="40" w:after="40"/>
+            </w:pPr>
+            <w:r/>
+            <w:r>
+              <w:rPr>
+                <w:rFonts w:ascii="Arial" w:hAnsi="Arial"/>
+                <w:b/>
+                <w:color w:val="FFFFFF"/>
+                <w:sz w:val="18"/>
+              </w:rPr>
+              <w:t>Duree</w:t>
+            </w:r>
+          </w:p>
+        </w:tc>
+        <w:tc>
+          <w:tcPr>
+            <w:tcW w:type="dxa" w:w="3969"/>
+            <w:shd w:fill="051E3B"/>
+          </w:tcPr>
+          <w:p>
+            <w:pPr>
+              <w:spacing w:before="40" w:after="40"/>
+            </w:pPr>
+            <w:r/>
+            <w:r>
+              <w:rPr>
+                <w:rFonts w:ascii="Arial" w:hAnsi="Arial"/>
+                <w:b/>
+                <w:color w:val="FFFFFF"/>
+                <w:sz w:val="18"/>
+              </w:rPr>
+              <w:t>Contenu cle</w:t>
+            </w:r>
+          </w:p>
+        </w:tc>
+      </w:tr>
+      <w:tr>
+        <w:tc>
+          <w:tcPr>
+            <w:tcW w:type="dxa" w:w="1134"/>
           </w:tcPr>
           <w:p>
             <w:pPr>
@@ -257,14 +1414,424 @@
                 <w:rFonts w:ascii="Arial" w:hAnsi="Arial"/>
                 <w:b w:val="0"/>
                 <w:color w:val="2D3748"/>
-                <w:sz w:val="20"/>
+                <w:sz w:val="18"/>
               </w:rPr>
-              <w:t>Demo live + ce document</w:t>
+              <w:t>1</w:t>
+            </w:r>
+          </w:p>
+        </w:tc>
+        <w:tc>
+          <w:tcPr>
+            <w:tcW w:type="dxa" w:w="2551"/>
+          </w:tcPr>
+          <w:p>
+            <w:pPr>
+              <w:spacing w:before="40" w:after="40"/>
+            </w:pPr>
+            <w:r/>
+            <w:r>
+              <w:rPr>
+                <w:rFonts w:ascii="Arial" w:hAnsi="Arial"/>
+                <w:b w:val="0"/>
+                <w:color w:val="2D3748"/>
+                <w:sz w:val="18"/>
+              </w:rPr>
+              <w:t>Vue d'ensemble</w:t>
+            </w:r>
+          </w:p>
+        </w:tc>
+        <w:tc>
+          <w:tcPr>
+            <w:tcW w:type="dxa" w:w="1417"/>
+          </w:tcPr>
+          <w:p>
+            <w:pPr>
+              <w:spacing w:before="40" w:after="40"/>
+            </w:pPr>
+            <w:r/>
+            <w:r>
+              <w:rPr>
+                <w:rFonts w:ascii="Arial" w:hAnsi="Arial"/>
+                <w:b w:val="0"/>
+                <w:color w:val="2D3748"/>
+                <w:sz w:val="18"/>
+              </w:rPr>
+              <w:t>15 min</w:t>
+            </w:r>
+          </w:p>
+        </w:tc>
+        <w:tc>
+          <w:tcPr>
+            <w:tcW w:type="dxa" w:w="3969"/>
+          </w:tcPr>
+          <w:p>
+            <w:pPr>
+              <w:spacing w:before="40" w:after="40"/>
+            </w:pPr>
+            <w:r/>
+            <w:r>
+              <w:rPr>
+                <w:rFonts w:ascii="Arial" w:hAnsi="Arial"/>
+                <w:b w:val="0"/>
+                <w:color w:val="2D3748"/>
+                <w:sz w:val="18"/>
+              </w:rPr>
+              <w:t>Pipeline, sources, calendrier editorial</w:t>
+            </w:r>
+          </w:p>
+        </w:tc>
+      </w:tr>
+      <w:tr>
+        <w:tc>
+          <w:tcPr>
+            <w:tcW w:type="dxa" w:w="1134"/>
+            <w:shd w:fill="F0F4F8"/>
+          </w:tcPr>
+          <w:p>
+            <w:pPr>
+              <w:spacing w:before="40" w:after="40"/>
+            </w:pPr>
+            <w:r/>
+            <w:r>
+              <w:rPr>
+                <w:rFonts w:ascii="Arial" w:hAnsi="Arial"/>
+                <w:b w:val="0"/>
+                <w:color w:val="2D3748"/>
+                <w:sz w:val="18"/>
+              </w:rPr>
+              <w:t>2</w:t>
+            </w:r>
+          </w:p>
+        </w:tc>
+        <w:tc>
+          <w:tcPr>
+            <w:tcW w:type="dxa" w:w="2551"/>
+            <w:shd w:fill="F0F4F8"/>
+          </w:tcPr>
+          <w:p>
+            <w:pPr>
+              <w:spacing w:before="40" w:after="40"/>
+            </w:pPr>
+            <w:r/>
+            <w:r>
+              <w:rPr>
+                <w:rFonts w:ascii="Arial" w:hAnsi="Arial"/>
+                <w:b w:val="0"/>
+                <w:color w:val="2D3748"/>
+                <w:sz w:val="18"/>
+              </w:rPr>
+              <w:t>Naviguer dans GitHub</w:t>
+            </w:r>
+          </w:p>
+        </w:tc>
+        <w:tc>
+          <w:tcPr>
+            <w:tcW w:type="dxa" w:w="1417"/>
+            <w:shd w:fill="F0F4F8"/>
+          </w:tcPr>
+          <w:p>
+            <w:pPr>
+              <w:spacing w:before="40" w:after="40"/>
+            </w:pPr>
+            <w:r/>
+            <w:r>
+              <w:rPr>
+                <w:rFonts w:ascii="Arial" w:hAnsi="Arial"/>
+                <w:b w:val="0"/>
+                <w:color w:val="2D3748"/>
+                <w:sz w:val="18"/>
+              </w:rPr>
+              <w:t>15 min</w:t>
+            </w:r>
+          </w:p>
+        </w:tc>
+        <w:tc>
+          <w:tcPr>
+            <w:tcW w:type="dxa" w:w="3969"/>
+            <w:shd w:fill="F0F4F8"/>
+          </w:tcPr>
+          <w:p>
+            <w:pPr>
+              <w:spacing w:before="40" w:after="40"/>
+            </w:pPr>
+            <w:r/>
+            <w:r>
+              <w:rPr>
+                <w:rFonts w:ascii="Arial" w:hAnsi="Arial"/>
+                <w:b w:val="0"/>
+                <w:color w:val="2D3748"/>
+                <w:sz w:val="18"/>
+              </w:rPr>
+              <w:t>Structure repo, fichiers cles, actions non-dev</w:t>
+            </w:r>
+          </w:p>
+        </w:tc>
+      </w:tr>
+      <w:tr>
+        <w:tc>
+          <w:tcPr>
+            <w:tcW w:type="dxa" w:w="1134"/>
+          </w:tcPr>
+          <w:p>
+            <w:pPr>
+              <w:spacing w:before="40" w:after="40"/>
+            </w:pPr>
+            <w:r/>
+            <w:r>
+              <w:rPr>
+                <w:rFonts w:ascii="Arial" w:hAnsi="Arial"/>
+                <w:b w:val="0"/>
+                <w:color w:val="2D3748"/>
+                <w:sz w:val="18"/>
+              </w:rPr>
+              <w:t>3</w:t>
+            </w:r>
+          </w:p>
+        </w:tc>
+        <w:tc>
+          <w:tcPr>
+            <w:tcW w:type="dxa" w:w="2551"/>
+          </w:tcPr>
+          <w:p>
+            <w:pPr>
+              <w:spacing w:before="40" w:after="40"/>
+            </w:pPr>
+            <w:r/>
+            <w:r>
+              <w:rPr>
+                <w:rFonts w:ascii="Arial" w:hAnsi="Arial"/>
+                <w:b w:val="0"/>
+                <w:color w:val="2D3748"/>
+                <w:sz w:val="18"/>
+              </w:rPr>
+              <w:t>Piloter via GitHub</w:t>
+            </w:r>
+          </w:p>
+        </w:tc>
+        <w:tc>
+          <w:tcPr>
+            <w:tcW w:type="dxa" w:w="1417"/>
+          </w:tcPr>
+          <w:p>
+            <w:pPr>
+              <w:spacing w:before="40" w:after="40"/>
+            </w:pPr>
+            <w:r/>
+            <w:r>
+              <w:rPr>
+                <w:rFonts w:ascii="Arial" w:hAnsi="Arial"/>
+                <w:b w:val="0"/>
+                <w:color w:val="2D3748"/>
+                <w:sz w:val="18"/>
+              </w:rPr>
+              <w:t>15 min</w:t>
+            </w:r>
+          </w:p>
+        </w:tc>
+        <w:tc>
+          <w:tcPr>
+            <w:tcW w:type="dxa" w:w="3969"/>
+          </w:tcPr>
+          <w:p>
+            <w:pPr>
+              <w:spacing w:before="40" w:after="40"/>
+            </w:pPr>
+            <w:r/>
+            <w:r>
+              <w:rPr>
+                <w:rFonts w:ascii="Arial" w:hAnsi="Arial"/>
+                <w:b w:val="0"/>
+                <w:color w:val="2D3748"/>
+                <w:sz w:val="18"/>
+              </w:rPr>
+              <w:t>Issues, Milestones, PR, workflow edition</w:t>
+            </w:r>
+          </w:p>
+        </w:tc>
+      </w:tr>
+      <w:tr>
+        <w:tc>
+          <w:tcPr>
+            <w:tcW w:type="dxa" w:w="1134"/>
+            <w:shd w:fill="F0F4F8"/>
+          </w:tcPr>
+          <w:p>
+            <w:pPr>
+              <w:spacing w:before="40" w:after="40"/>
+            </w:pPr>
+            <w:r/>
+            <w:r>
+              <w:rPr>
+                <w:rFonts w:ascii="Arial" w:hAnsi="Arial"/>
+                <w:b w:val="0"/>
+                <w:color w:val="2D3748"/>
+                <w:sz w:val="18"/>
+              </w:rPr>
+              <w:t>4</w:t>
+            </w:r>
+          </w:p>
+        </w:tc>
+        <w:tc>
+          <w:tcPr>
+            <w:tcW w:type="dxa" w:w="2551"/>
+            <w:shd w:fill="F0F4F8"/>
+          </w:tcPr>
+          <w:p>
+            <w:pPr>
+              <w:spacing w:before="40" w:after="40"/>
+            </w:pPr>
+            <w:r/>
+            <w:r>
+              <w:rPr>
+                <w:rFonts w:ascii="Arial" w:hAnsi="Arial"/>
+                <w:b w:val="0"/>
+                <w:color w:val="2D3748"/>
+                <w:sz w:val="18"/>
+              </w:rPr>
+              <w:t>Lancer une edition</w:t>
+            </w:r>
+          </w:p>
+        </w:tc>
+        <w:tc>
+          <w:tcPr>
+            <w:tcW w:type="dxa" w:w="1417"/>
+            <w:shd w:fill="F0F4F8"/>
+          </w:tcPr>
+          <w:p>
+            <w:pPr>
+              <w:spacing w:before="40" w:after="40"/>
+            </w:pPr>
+            <w:r/>
+            <w:r>
+              <w:rPr>
+                <w:rFonts w:ascii="Arial" w:hAnsi="Arial"/>
+                <w:b w:val="0"/>
+                <w:color w:val="2D3748"/>
+                <w:sz w:val="18"/>
+              </w:rPr>
+              <w:t>20 min</w:t>
+            </w:r>
+          </w:p>
+        </w:tc>
+        <w:tc>
+          <w:tcPr>
+            <w:tcW w:type="dxa" w:w="3969"/>
+            <w:shd w:fill="F0F4F8"/>
+          </w:tcPr>
+          <w:p>
+            <w:pPr>
+              <w:spacing w:before="40" w:after="40"/>
+            </w:pPr>
+            <w:r/>
+            <w:r>
+              <w:rPr>
+                <w:rFonts w:ascii="Arial" w:hAnsi="Arial"/>
+                <w:b w:val="0"/>
+                <w:color w:val="2D3748"/>
+                <w:sz w:val="18"/>
+              </w:rPr>
+              <w:t>Commandes, controle qualite, exercice complet</w:t>
+            </w:r>
+          </w:p>
+        </w:tc>
+      </w:tr>
+      <w:tr>
+        <w:tc>
+          <w:tcPr>
+            <w:tcW w:type="dxa" w:w="1134"/>
+          </w:tcPr>
+          <w:p>
+            <w:pPr>
+              <w:spacing w:before="40" w:after="40"/>
+            </w:pPr>
+            <w:r/>
+            <w:r>
+              <w:rPr>
+                <w:rFonts w:ascii="Arial" w:hAnsi="Arial"/>
+                <w:b w:val="0"/>
+                <w:color w:val="2D3748"/>
+                <w:sz w:val="18"/>
+              </w:rPr>
+              <w:t>5</w:t>
+            </w:r>
+          </w:p>
+        </w:tc>
+        <w:tc>
+          <w:tcPr>
+            <w:tcW w:type="dxa" w:w="2551"/>
+          </w:tcPr>
+          <w:p>
+            <w:pPr>
+              <w:spacing w:before="40" w:after="40"/>
+            </w:pPr>
+            <w:r/>
+            <w:r>
+              <w:rPr>
+                <w:rFonts w:ascii="Arial" w:hAnsi="Arial"/>
+                <w:b w:val="0"/>
+                <w:color w:val="2D3748"/>
+                <w:sz w:val="18"/>
+              </w:rPr>
+              <w:t>Personnalisation</w:t>
+            </w:r>
+          </w:p>
+        </w:tc>
+        <w:tc>
+          <w:tcPr>
+            <w:tcW w:type="dxa" w:w="1417"/>
+          </w:tcPr>
+          <w:p>
+            <w:pPr>
+              <w:spacing w:before="40" w:after="40"/>
+            </w:pPr>
+            <w:r/>
+            <w:r>
+              <w:rPr>
+                <w:rFonts w:ascii="Arial" w:hAnsi="Arial"/>
+                <w:b w:val="0"/>
+                <w:color w:val="2D3748"/>
+                <w:sz w:val="18"/>
+              </w:rPr>
+              <w:t>15 min</w:t>
+            </w:r>
+          </w:p>
+        </w:tc>
+        <w:tc>
+          <w:tcPr>
+            <w:tcW w:type="dxa" w:w="3969"/>
+          </w:tcPr>
+          <w:p>
+            <w:pPr>
+              <w:spacing w:before="40" w:after="40"/>
+            </w:pPr>
+            <w:r/>
+            <w:r>
+              <w:rPr>
+                <w:rFonts w:ascii="Arial" w:hAnsi="Arial"/>
+                <w:b w:val="0"/>
+                <w:color w:val="2D3748"/>
+                <w:sz w:val="18"/>
+              </w:rPr>
+              <w:t>Matrice autonomie, modifications courantes</w:t>
             </w:r>
           </w:p>
         </w:tc>
       </w:tr>
     </w:tbl>
+    <w:p>
+      <w:pPr>
+        <w:spacing w:before="300"/>
+      </w:pPr>
+      <w:r>
+        <w:rPr>
+          <w:rFonts w:ascii="Arial" w:hAnsi="Arial"/>
+          <w:i/>
+          <w:color w:val="718096"/>
+          <w:sz w:val="20"/>
+        </w:rPr>
+        <w:t>+ Exercices pratiques integres a chaque module</w:t>
+      </w:r>
+    </w:p>
     <w:p>
       <w:r>
         <w:br w:type="page"/>
@@ -282,17 +1849,30 @@
       <w:r>
         <w:rPr>
           <w:rFonts w:ascii="Arial" w:hAnsi="Arial"/>
+          <w:color w:val="718096"/>
+          <w:sz w:val="18"/>
+        </w:rPr>
+        <w:t>Duree : 15 min  |  Niveau : Debutant  |  Type : Theorie</w:t>
+      </w:r>
+    </w:p>
+    <w:p>
+      <w:pPr>
+        <w:spacing w:before="200"/>
+      </w:pPr>
+      <w:r>
+        <w:rPr>
+          <w:rFonts w:ascii="Arial" w:hAnsi="Arial"/>
           <w:b/>
           <w:color w:val="57AEE0"/>
         </w:rPr>
-        <w:t xml:space="preserve">Objectif : </w:t>
+        <w:t xml:space="preserve">Objectif d'apprentissage : </w:t>
       </w:r>
       <w:r>
         <w:rPr>
           <w:rFonts w:ascii="Arial" w:hAnsi="Arial"/>
           <w:color w:val="2D3748"/>
         </w:rPr>
-        <w:t>Comprendre l'architecture et le flux de production de la newsletter</w:t>
+        <w:t>Comprendre l'architecture globale et le flux de production de la newsletter</w:t>
       </w:r>
     </w:p>
     <w:p>
@@ -337,7 +1917,7 @@
           <w:color w:val="2D3748"/>
           <w:sz w:val="20"/>
         </w:rPr>
-        <w:t xml:space="preserve">Collecte : </w:t>
+        <w:t xml:space="preserve">1. Collecte : </w:t>
       </w:r>
       <w:r>
         <w:rPr>
@@ -361,7 +1941,7 @@
           <w:color w:val="2D3748"/>
           <w:sz w:val="20"/>
         </w:rPr>
-        <w:t xml:space="preserve">Curation IA : </w:t>
+        <w:t xml:space="preserve">2. Curation IA : </w:t>
       </w:r>
       <w:r>
         <w:rPr>
@@ -385,7 +1965,7 @@
           <w:color w:val="2D3748"/>
           <w:sz w:val="20"/>
         </w:rPr>
-        <w:t xml:space="preserve">Redaction IA : </w:t>
+        <w:t xml:space="preserve">3. Redaction IA : </w:t>
       </w:r>
       <w:r>
         <w:rPr>
@@ -409,7 +1989,7 @@
           <w:color w:val="2D3748"/>
           <w:sz w:val="20"/>
         </w:rPr>
-        <w:t xml:space="preserve">Mise en page : </w:t>
+        <w:t xml:space="preserve">4. Mise en page : </w:t>
       </w:r>
       <w:r>
         <w:rPr>
@@ -513,7 +2093,7 @@
                 <w:color w:val="FFFFFF"/>
                 <w:sz w:val="18"/>
               </w:rPr>
-              <w:t>Couleur</w:t>
+              <w:t>Couleur associee</w:t>
             </w:r>
           </w:p>
         </w:tc>
@@ -1179,6 +2759,26 @@
       </w:tr>
     </w:tbl>
     <w:p>
+      <w:pPr>
+        <w:spacing w:before="240"/>
+      </w:pPr>
+      <w:r>
+        <w:rPr>
+          <w:rFonts w:ascii="Arial" w:hAnsi="Arial"/>
+          <w:b/>
+          <w:color w:val="059669"/>
+        </w:rPr>
+        <w:t xml:space="preserve">A retenir : </w:t>
+      </w:r>
+      <w:r>
+        <w:rPr>
+          <w:rFonts w:ascii="Arial" w:hAnsi="Arial"/>
+          <w:color w:val="2D3748"/>
+        </w:rPr>
+        <w:t>Le pipeline transforme automatiquement 17 flux RSS en une newsletter structuree. L'intervention humaine se limite au choix du theme et a la validation finale.</w:t>
+      </w:r>
+    </w:p>
+    <w:p>
       <w:r>
         <w:br w:type="page"/>
       </w:r>
@@ -1195,17 +2795,30 @@
       <w:r>
         <w:rPr>
           <w:rFonts w:ascii="Arial" w:hAnsi="Arial"/>
+          <w:color w:val="718096"/>
+          <w:sz w:val="18"/>
+        </w:rPr>
+        <w:t>Duree : 15 min  |  Niveau : Debutant  |  Type : Theorie + Demo</w:t>
+      </w:r>
+    </w:p>
+    <w:p>
+      <w:pPr>
+        <w:spacing w:before="200"/>
+      </w:pPr>
+      <w:r>
+        <w:rPr>
+          <w:rFonts w:ascii="Arial" w:hAnsi="Arial"/>
           <w:b/>
           <w:color w:val="57AEE0"/>
         </w:rPr>
-        <w:t xml:space="preserve">Objectif : </w:t>
+        <w:t xml:space="preserve">Objectif d'apprentissage : </w:t>
       </w:r>
       <w:r>
         <w:rPr>
           <w:rFonts w:ascii="Arial" w:hAnsi="Arial"/>
           <w:color w:val="2D3748"/>
         </w:rPr>
-        <w:t>Etre a l'aise dans le repo sans etre developpeur</w:t>
+        <w:t>Etre a l'aise dans le repo GitHub sans etre developpeur</w:t>
       </w:r>
     </w:p>
     <w:p>
@@ -1232,13 +2845,14 @@
         <w:tblLook w:firstColumn="1" w:firstRow="1" w:lastColumn="0" w:lastRow="0" w:noHBand="0" w:noVBand="1" w:val="04A0"/>
       </w:tblPr>
       <w:tblGrid>
-        <w:gridCol w:w="4703"/>
-        <w:gridCol w:w="4703"/>
+        <w:gridCol w:w="3135"/>
+        <w:gridCol w:w="3135"/>
+        <w:gridCol w:w="3135"/>
       </w:tblGrid>
       <w:tr>
         <w:tc>
           <w:tcPr>
-            <w:tcW w:type="dxa" w:w="3402"/>
+            <w:tcW w:type="dxa" w:w="3118"/>
             <w:shd w:fill="051E3B"/>
           </w:tcPr>
           <w:p>
@@ -1259,7 +2873,7 @@
         </w:tc>
         <w:tc>
           <w:tcPr>
-            <w:tcW w:type="dxa" w:w="5669"/>
+            <w:tcW w:type="dxa" w:w="3402"/>
             <w:shd w:fill="051E3B"/>
           </w:tcPr>
           <w:p>
@@ -1278,11 +2892,32 @@
             </w:r>
           </w:p>
         </w:tc>
+        <w:tc>
+          <w:tcPr>
+            <w:tcW w:type="dxa" w:w="2268"/>
+            <w:shd w:fill="051E3B"/>
+          </w:tcPr>
+          <w:p>
+            <w:pPr>
+              <w:spacing w:before="40" w:after="40"/>
+            </w:pPr>
+            <w:r/>
+            <w:r>
+              <w:rPr>
+                <w:rFonts w:ascii="Arial" w:hAnsi="Arial"/>
+                <w:b/>
+                <w:color w:val="FFFFFF"/>
+                <w:sz w:val="18"/>
+              </w:rPr>
+              <w:t>Modifiable ?</w:t>
+            </w:r>
+          </w:p>
+        </w:tc>
       </w:tr>
       <w:tr>
         <w:tc>
           <w:tcPr>
-            <w:tcW w:type="dxa" w:w="3402"/>
+            <w:tcW w:type="dxa" w:w="3118"/>
           </w:tcPr>
           <w:p>
             <w:pPr>
@@ -1302,7 +2937,7 @@
         </w:tc>
         <w:tc>
           <w:tcPr>
-            <w:tcW w:type="dxa" w:w="5669"/>
+            <w:tcW w:type="dxa" w:w="3402"/>
           </w:tcPr>
           <w:p>
             <w:pPr>
@@ -1316,7 +2951,27 @@
                 <w:color w:val="2D3748"/>
                 <w:sz w:val="18"/>
               </w:rPr>
-              <w:t>Liste des 17 flux RSS (modifiable)</w:t>
+              <w:t>Liste des 17 flux RSS</w:t>
+            </w:r>
+          </w:p>
+        </w:tc>
+        <w:tc>
+          <w:tcPr>
+            <w:tcW w:type="dxa" w:w="2268"/>
+          </w:tcPr>
+          <w:p>
+            <w:pPr>
+              <w:spacing w:before="40" w:after="40"/>
+            </w:pPr>
+            <w:r/>
+            <w:r>
+              <w:rPr>
+                <w:rFonts w:ascii="Arial" w:hAnsi="Arial"/>
+                <w:b w:val="0"/>
+                <w:color w:val="2D3748"/>
+                <w:sz w:val="18"/>
+              </w:rPr>
+              <w:t>Oui - Facile</w:t>
             </w:r>
           </w:p>
         </w:tc>
@@ -1324,7 +2979,7 @@
       <w:tr>
         <w:tc>
           <w:tcPr>
-            <w:tcW w:type="dxa" w:w="3402"/>
+            <w:tcW w:type="dxa" w:w="3118"/>
             <w:shd w:fill="F0F4F8"/>
           </w:tcPr>
           <w:p>
@@ -1345,7 +3000,7 @@
         </w:tc>
         <w:tc>
           <w:tcPr>
-            <w:tcW w:type="dxa" w:w="5669"/>
+            <w:tcW w:type="dxa" w:w="3402"/>
             <w:shd w:fill="F0F4F8"/>
           </w:tcPr>
           <w:p>
@@ -1360,7 +3015,28 @@
                 <w:color w:val="2D3748"/>
                 <w:sz w:val="18"/>
               </w:rPr>
-              <w:t>Les 6 territoires editoriaux (modifiable)</w:t>
+              <w:t>Les 6 territoires editoriaux</w:t>
+            </w:r>
+          </w:p>
+        </w:tc>
+        <w:tc>
+          <w:tcPr>
+            <w:tcW w:type="dxa" w:w="2268"/>
+            <w:shd w:fill="F0F4F8"/>
+          </w:tcPr>
+          <w:p>
+            <w:pPr>
+              <w:spacing w:before="40" w:after="40"/>
+            </w:pPr>
+            <w:r/>
+            <w:r>
+              <w:rPr>
+                <w:rFonts w:ascii="Arial" w:hAnsi="Arial"/>
+                <w:b w:val="0"/>
+                <w:color w:val="2D3748"/>
+                <w:sz w:val="18"/>
+              </w:rPr>
+              <w:t>Oui - Facile</w:t>
             </w:r>
           </w:p>
         </w:tc>
@@ -1368,7 +3044,7 @@
       <w:tr>
         <w:tc>
           <w:tcPr>
-            <w:tcW w:type="dxa" w:w="3402"/>
+            <w:tcW w:type="dxa" w:w="3118"/>
           </w:tcPr>
           <w:p>
             <w:pPr>
@@ -1388,7 +3064,7 @@
         </w:tc>
         <w:tc>
           <w:tcPr>
-            <w:tcW w:type="dxa" w:w="5669"/>
+            <w:tcW w:type="dxa" w:w="3402"/>
           </w:tcPr>
           <w:p>
             <w:pPr>
@@ -1406,11 +3082,31 @@
             </w:r>
           </w:p>
         </w:tc>
+        <w:tc>
+          <w:tcPr>
+            <w:tcW w:type="dxa" w:w="2268"/>
+          </w:tcPr>
+          <w:p>
+            <w:pPr>
+              <w:spacing w:before="40" w:after="40"/>
+            </w:pPr>
+            <w:r/>
+            <w:r>
+              <w:rPr>
+                <w:rFonts w:ascii="Arial" w:hAnsi="Arial"/>
+                <w:b w:val="0"/>
+                <w:color w:val="2D3748"/>
+                <w:sz w:val="18"/>
+              </w:rPr>
+              <w:t>Non</w:t>
+            </w:r>
+          </w:p>
+        </w:tc>
       </w:tr>
       <w:tr>
         <w:tc>
           <w:tcPr>
-            <w:tcW w:type="dxa" w:w="3402"/>
+            <w:tcW w:type="dxa" w:w="3118"/>
             <w:shd w:fill="F0F4F8"/>
           </w:tcPr>
           <w:p>
@@ -1431,7 +3127,7 @@
         </w:tc>
         <w:tc>
           <w:tcPr>
-            <w:tcW w:type="dxa" w:w="5669"/>
+            <w:tcW w:type="dxa" w:w="3402"/>
             <w:shd w:fill="F0F4F8"/>
           </w:tcPr>
           <w:p>
@@ -1450,11 +3146,32 @@
             </w:r>
           </w:p>
         </w:tc>
+        <w:tc>
+          <w:tcPr>
+            <w:tcW w:type="dxa" w:w="2268"/>
+            <w:shd w:fill="F0F4F8"/>
+          </w:tcPr>
+          <w:p>
+            <w:pPr>
+              <w:spacing w:before="40" w:after="40"/>
+            </w:pPr>
+            <w:r/>
+            <w:r>
+              <w:rPr>
+                <w:rFonts w:ascii="Arial" w:hAnsi="Arial"/>
+                <w:b w:val="0"/>
+                <w:color w:val="2D3748"/>
+                <w:sz w:val="18"/>
+              </w:rPr>
+              <w:t>Non</w:t>
+            </w:r>
+          </w:p>
+        </w:tc>
       </w:tr>
       <w:tr>
         <w:tc>
           <w:tcPr>
-            <w:tcW w:type="dxa" w:w="3402"/>
+            <w:tcW w:type="dxa" w:w="3118"/>
           </w:tcPr>
           <w:p>
             <w:pPr>
@@ -1474,7 +3191,7 @@
         </w:tc>
         <w:tc>
           <w:tcPr>
-            <w:tcW w:type="dxa" w:w="5669"/>
+            <w:tcW w:type="dxa" w:w="3402"/>
           </w:tcPr>
           <w:p>
             <w:pPr>
@@ -1488,7 +3205,27 @@
                 <w:color w:val="2D3748"/>
                 <w:sz w:val="18"/>
               </w:rPr>
-              <w:t>Selection et scoring IA des articles</w:t>
+              <w:t>Selection et scoring IA</w:t>
+            </w:r>
+          </w:p>
+        </w:tc>
+        <w:tc>
+          <w:tcPr>
+            <w:tcW w:type="dxa" w:w="2268"/>
+          </w:tcPr>
+          <w:p>
+            <w:pPr>
+              <w:spacing w:before="40" w:after="40"/>
+            </w:pPr>
+            <w:r/>
+            <w:r>
+              <w:rPr>
+                <w:rFonts w:ascii="Arial" w:hAnsi="Arial"/>
+                <w:b w:val="0"/>
+                <w:color w:val="2D3748"/>
+                <w:sz w:val="18"/>
+              </w:rPr>
+              <w:t>Non</w:t>
             </w:r>
           </w:p>
         </w:tc>
@@ -1496,7 +3233,7 @@
       <w:tr>
         <w:tc>
           <w:tcPr>
-            <w:tcW w:type="dxa" w:w="3402"/>
+            <w:tcW w:type="dxa" w:w="3118"/>
             <w:shd w:fill="F0F4F8"/>
           </w:tcPr>
           <w:p>
@@ -1517,7 +3254,7 @@
         </w:tc>
         <w:tc>
           <w:tcPr>
-            <w:tcW w:type="dxa" w:w="5669"/>
+            <w:tcW w:type="dxa" w:w="3402"/>
             <w:shd w:fill="F0F4F8"/>
           </w:tcPr>
           <w:p>
@@ -1532,7 +3269,28 @@
                 <w:color w:val="2D3748"/>
                 <w:sz w:val="18"/>
               </w:rPr>
-              <w:t>Redaction editoriale IA (prompt McKinsey)</w:t>
+              <w:t>Redaction editoriale IA</w:t>
+            </w:r>
+          </w:p>
+        </w:tc>
+        <w:tc>
+          <w:tcPr>
+            <w:tcW w:type="dxa" w:w="2268"/>
+            <w:shd w:fill="F0F4F8"/>
+          </w:tcPr>
+          <w:p>
+            <w:pPr>
+              <w:spacing w:before="40" w:after="40"/>
+            </w:pPr>
+            <w:r/>
+            <w:r>
+              <w:rPr>
+                <w:rFonts w:ascii="Arial" w:hAnsi="Arial"/>
+                <w:b w:val="0"/>
+                <w:color w:val="2D3748"/>
+                <w:sz w:val="18"/>
+              </w:rPr>
+              <w:t>Technique</w:t>
             </w:r>
           </w:p>
         </w:tc>
@@ -1540,7 +3298,7 @@
       <w:tr>
         <w:tc>
           <w:tcPr>
-            <w:tcW w:type="dxa" w:w="3402"/>
+            <w:tcW w:type="dxa" w:w="3118"/>
           </w:tcPr>
           <w:p>
             <w:pPr>
@@ -1560,7 +3318,7 @@
         </w:tc>
         <w:tc>
           <w:tcPr>
-            <w:tcW w:type="dxa" w:w="5669"/>
+            <w:tcW w:type="dxa" w:w="3402"/>
           </w:tcPr>
           <w:p>
             <w:pPr>
@@ -1574,7 +3332,27 @@
                 <w:color w:val="2D3748"/>
                 <w:sz w:val="18"/>
               </w:rPr>
-              <w:t>Gabarit HTML de la newsletter</w:t>
+              <w:t>Gabarit HTML</w:t>
+            </w:r>
+          </w:p>
+        </w:tc>
+        <w:tc>
+          <w:tcPr>
+            <w:tcW w:type="dxa" w:w="2268"/>
+          </w:tcPr>
+          <w:p>
+            <w:pPr>
+              <w:spacing w:before="40" w:after="40"/>
+            </w:pPr>
+            <w:r/>
+            <w:r>
+              <w:rPr>
+                <w:rFonts w:ascii="Arial" w:hAnsi="Arial"/>
+                <w:b w:val="0"/>
+                <w:color w:val="2D3748"/>
+                <w:sz w:val="18"/>
+              </w:rPr>
+              <w:t>Technique</w:t>
             </w:r>
           </w:p>
         </w:tc>
@@ -1582,7 +3360,7 @@
       <w:tr>
         <w:tc>
           <w:tcPr>
-            <w:tcW w:type="dxa" w:w="3402"/>
+            <w:tcW w:type="dxa" w:w="3118"/>
             <w:shd w:fill="F0F4F8"/>
           </w:tcPr>
           <w:p>
@@ -1603,7 +3381,7 @@
         </w:tc>
         <w:tc>
           <w:tcPr>
-            <w:tcW w:type="dxa" w:w="5669"/>
+            <w:tcW w:type="dxa" w:w="3402"/>
             <w:shd w:fill="F0F4F8"/>
           </w:tcPr>
           <w:p>
@@ -1618,7 +3396,28 @@
                 <w:color w:val="2D3748"/>
                 <w:sz w:val="18"/>
               </w:rPr>
-              <w:t>Editions generees et consultables</w:t>
+              <w:t>Editions generees consultables</w:t>
+            </w:r>
+          </w:p>
+        </w:tc>
+        <w:tc>
+          <w:tcPr>
+            <w:tcW w:type="dxa" w:w="2268"/>
+            <w:shd w:fill="F0F4F8"/>
+          </w:tcPr>
+          <w:p>
+            <w:pPr>
+              <w:spacing w:before="40" w:after="40"/>
+            </w:pPr>
+            <w:r/>
+            <w:r>
+              <w:rPr>
+                <w:rFonts w:ascii="Arial" w:hAnsi="Arial"/>
+                <w:b w:val="0"/>
+                <w:color w:val="2D3748"/>
+                <w:sz w:val="18"/>
+              </w:rPr>
+              <w:t>Lecture seule</w:t>
             </w:r>
           </w:p>
         </w:tc>
@@ -1626,7 +3425,7 @@
       <w:tr>
         <w:tc>
           <w:tcPr>
-            <w:tcW w:type="dxa" w:w="3402"/>
+            <w:tcW w:type="dxa" w:w="3118"/>
           </w:tcPr>
           <w:p>
             <w:pPr>
@@ -1646,7 +3445,7 @@
         </w:tc>
         <w:tc>
           <w:tcPr>
-            <w:tcW w:type="dxa" w:w="5669"/>
+            <w:tcW w:type="dxa" w:w="3402"/>
           </w:tcPr>
           <w:p>
             <w:pPr>
@@ -1661,6 +3460,26 @@
                 <w:sz w:val="18"/>
               </w:rPr>
               <w:t>Reference charte graphique</w:t>
+            </w:r>
+          </w:p>
+        </w:tc>
+        <w:tc>
+          <w:tcPr>
+            <w:tcW w:type="dxa" w:w="2268"/>
+          </w:tcPr>
+          <w:p>
+            <w:pPr>
+              <w:spacing w:before="40" w:after="40"/>
+            </w:pPr>
+            <w:r/>
+            <w:r>
+              <w:rPr>
+                <w:rFonts w:ascii="Arial" w:hAnsi="Arial"/>
+                <w:b w:val="0"/>
+                <w:color w:val="2D3748"/>
+                <w:sz w:val="18"/>
+              </w:rPr>
+              <w:t>Lecture seule</w:t>
             </w:r>
           </w:p>
         </w:tc>
@@ -1816,6 +3635,26 @@
       </w:r>
     </w:p>
     <w:p>
+      <w:pPr>
+        <w:spacing w:before="240"/>
+      </w:pPr>
+      <w:r>
+        <w:rPr>
+          <w:rFonts w:ascii="Arial" w:hAnsi="Arial"/>
+          <w:b/>
+          <w:color w:val="059669"/>
+        </w:rPr>
+        <w:t xml:space="preserve">A retenir : </w:t>
+      </w:r>
+      <w:r>
+        <w:rPr>
+          <w:rFonts w:ascii="Arial" w:hAnsi="Arial"/>
+          <w:color w:val="2D3748"/>
+        </w:rPr>
+        <w:t>Les fichiers YAML dans config/ sont les seuls que vous modifierez directement. Le reste est geré par l'equipe technique ou via Claude Code.</w:t>
+      </w:r>
+    </w:p>
+    <w:p>
       <w:r>
         <w:br w:type="page"/>
       </w:r>
@@ -1832,10 +3671,23 @@
       <w:r>
         <w:rPr>
           <w:rFonts w:ascii="Arial" w:hAnsi="Arial"/>
+          <w:color w:val="718096"/>
+          <w:sz w:val="18"/>
+        </w:rPr>
+        <w:t>Duree : 15 min  |  Niveau : Debutant  |  Type : Theorie + Demo</w:t>
+      </w:r>
+    </w:p>
+    <w:p>
+      <w:pPr>
+        <w:spacing w:before="200"/>
+      </w:pPr>
+      <w:r>
+        <w:rPr>
+          <w:rFonts w:ascii="Arial" w:hAnsi="Arial"/>
           <w:b/>
           <w:color w:val="57AEE0"/>
         </w:rPr>
-        <w:t xml:space="preserve">Objectif : </w:t>
+        <w:t xml:space="preserve">Objectif d'apprentissage : </w:t>
       </w:r>
       <w:r>
         <w:rPr>
@@ -1869,8 +3721,9 @@
         <w:tblLook w:firstColumn="1" w:firstRow="1" w:lastColumn="0" w:lastRow="0" w:noHBand="0" w:noVBand="1" w:val="04A0"/>
       </w:tblPr>
       <w:tblGrid>
-        <w:gridCol w:w="4703"/>
-        <w:gridCol w:w="4703"/>
+        <w:gridCol w:w="3135"/>
+        <w:gridCol w:w="3135"/>
+        <w:gridCol w:w="3135"/>
       </w:tblGrid>
       <w:tr>
         <w:tc>
@@ -1896,7 +3749,7 @@
         </w:tc>
         <w:tc>
           <w:tcPr>
-            <w:tcW w:type="dxa" w:w="6803"/>
+            <w:tcW w:type="dxa" w:w="3969"/>
             <w:shd w:fill="051E3B"/>
           </w:tcPr>
           <w:p>
@@ -1912,6 +3765,27 @@
                 <w:sz w:val="18"/>
               </w:rPr>
               <w:t>Usage newsletter</w:t>
+            </w:r>
+          </w:p>
+        </w:tc>
+        <w:tc>
+          <w:tcPr>
+            <w:tcW w:type="dxa" w:w="2268"/>
+            <w:shd w:fill="051E3B"/>
+          </w:tcPr>
+          <w:p>
+            <w:pPr>
+              <w:spacing w:before="40" w:after="40"/>
+            </w:pPr>
+            <w:r/>
+            <w:r>
+              <w:rPr>
+                <w:rFonts w:ascii="Arial" w:hAnsi="Arial"/>
+                <w:b/>
+                <w:color w:val="FFFFFF"/>
+                <w:sz w:val="18"/>
+              </w:rPr>
+              <w:t>Qui l'utilise</w:t>
             </w:r>
           </w:p>
         </w:tc>
@@ -1939,7 +3813,7 @@
         </w:tc>
         <w:tc>
           <w:tcPr>
-            <w:tcW w:type="dxa" w:w="6803"/>
+            <w:tcW w:type="dxa" w:w="3969"/>
           </w:tcPr>
           <w:p>
             <w:pPr>
@@ -1953,7 +3827,27 @@
                 <w:color w:val="2D3748"/>
                 <w:sz w:val="18"/>
               </w:rPr>
-              <w:t>Demandes d'ajustement, suggestions de sources, retours lecteurs</w:t>
+              <w:t>Demandes, suggestions, retours</w:t>
+            </w:r>
+          </w:p>
+        </w:tc>
+        <w:tc>
+          <w:tcPr>
+            <w:tcW w:type="dxa" w:w="2268"/>
+          </w:tcPr>
+          <w:p>
+            <w:pPr>
+              <w:spacing w:before="40" w:after="40"/>
+            </w:pPr>
+            <w:r/>
+            <w:r>
+              <w:rPr>
+                <w:rFonts w:ascii="Arial" w:hAnsi="Arial"/>
+                <w:b w:val="0"/>
+                <w:color w:val="2D3748"/>
+                <w:sz w:val="18"/>
+              </w:rPr>
+              <w:t>Tous</w:t>
             </w:r>
           </w:p>
         </w:tc>
@@ -1982,7 +3876,7 @@
         </w:tc>
         <w:tc>
           <w:tcPr>
-            <w:tcW w:type="dxa" w:w="6803"/>
+            <w:tcW w:type="dxa" w:w="3969"/>
             <w:shd w:fill="F0F4F8"/>
           </w:tcPr>
           <w:p>
@@ -1997,7 +3891,28 @@
                 <w:color w:val="2D3748"/>
                 <w:sz w:val="18"/>
               </w:rPr>
-              <w:t>edition-mars, source, editorial, bug, terrain</w:t>
+              <w:t>edition-mars, source, editorial...</w:t>
+            </w:r>
+          </w:p>
+        </w:tc>
+        <w:tc>
+          <w:tcPr>
+            <w:tcW w:type="dxa" w:w="2268"/>
+            <w:shd w:fill="F0F4F8"/>
+          </w:tcPr>
+          <w:p>
+            <w:pPr>
+              <w:spacing w:before="40" w:after="40"/>
+            </w:pPr>
+            <w:r/>
+            <w:r>
+              <w:rPr>
+                <w:rFonts w:ascii="Arial" w:hAnsi="Arial"/>
+                <w:b w:val="0"/>
+                <w:color w:val="2D3748"/>
+                <w:sz w:val="18"/>
+              </w:rPr>
+              <w:t>Pilote</w:t>
             </w:r>
           </w:p>
         </w:tc>
@@ -2025,7 +3940,7 @@
         </w:tc>
         <w:tc>
           <w:tcPr>
-            <w:tcW w:type="dxa" w:w="6803"/>
+            <w:tcW w:type="dxa" w:w="3969"/>
           </w:tcPr>
           <w:p>
             <w:pPr>
@@ -2039,7 +3954,27 @@
                 <w:color w:val="2D3748"/>
                 <w:sz w:val="18"/>
               </w:rPr>
-              <w:t>Une milestone par edition mensuelle</w:t>
+              <w:t>Une par edition mensuelle</w:t>
+            </w:r>
+          </w:p>
+        </w:tc>
+        <w:tc>
+          <w:tcPr>
+            <w:tcW w:type="dxa" w:w="2268"/>
+          </w:tcPr>
+          <w:p>
+            <w:pPr>
+              <w:spacing w:before="40" w:after="40"/>
+            </w:pPr>
+            <w:r/>
+            <w:r>
+              <w:rPr>
+                <w:rFonts w:ascii="Arial" w:hAnsi="Arial"/>
+                <w:b w:val="0"/>
+                <w:color w:val="2D3748"/>
+                <w:sz w:val="18"/>
+              </w:rPr>
+              <w:t>Pilote</w:t>
             </w:r>
           </w:p>
         </w:tc>
@@ -2068,7 +4003,7 @@
         </w:tc>
         <w:tc>
           <w:tcPr>
-            <w:tcW w:type="dxa" w:w="6803"/>
+            <w:tcW w:type="dxa" w:w="3969"/>
             <w:shd w:fill="F0F4F8"/>
           </w:tcPr>
           <w:p>
@@ -2083,7 +4018,28 @@
                 <w:color w:val="2D3748"/>
                 <w:sz w:val="18"/>
               </w:rPr>
-              <w:t>Echanges CODEV sur les orientations editoriales</w:t>
+              <w:t>Orientations editoriales CODEV</w:t>
+            </w:r>
+          </w:p>
+        </w:tc>
+        <w:tc>
+          <w:tcPr>
+            <w:tcW w:type="dxa" w:w="2268"/>
+            <w:shd w:fill="F0F4F8"/>
+          </w:tcPr>
+          <w:p>
+            <w:pPr>
+              <w:spacing w:before="40" w:after="40"/>
+            </w:pPr>
+            <w:r/>
+            <w:r>
+              <w:rPr>
+                <w:rFonts w:ascii="Arial" w:hAnsi="Arial"/>
+                <w:b w:val="0"/>
+                <w:color w:val="2D3748"/>
+                <w:sz w:val="18"/>
+              </w:rPr>
+              <w:t>CODEV</w:t>
             </w:r>
           </w:p>
         </w:tc>
@@ -2111,7 +4067,7 @@
         </w:tc>
         <w:tc>
           <w:tcPr>
-            <w:tcW w:type="dxa" w:w="6803"/>
+            <w:tcW w:type="dxa" w:w="3969"/>
           </w:tcPr>
           <w:p>
             <w:pPr>
@@ -2125,7 +4081,27 @@
                 <w:color w:val="2D3748"/>
                 <w:sz w:val="18"/>
               </w:rPr>
-              <w:t>Revue des modifications avant integration</w:t>
+              <w:t>Revue avant integration</w:t>
+            </w:r>
+          </w:p>
+        </w:tc>
+        <w:tc>
+          <w:tcPr>
+            <w:tcW w:type="dxa" w:w="2268"/>
+          </w:tcPr>
+          <w:p>
+            <w:pPr>
+              <w:spacing w:before="40" w:after="40"/>
+            </w:pPr>
+            <w:r/>
+            <w:r>
+              <w:rPr>
+                <w:rFonts w:ascii="Arial" w:hAnsi="Arial"/>
+                <w:b w:val="0"/>
+                <w:color w:val="2D3748"/>
+                <w:sz w:val="18"/>
+              </w:rPr>
+              <w:t>Pilote + Tech</w:t>
             </w:r>
           </w:p>
         </w:tc>
@@ -2369,10 +4345,23 @@
       <w:r>
         <w:rPr>
           <w:rFonts w:ascii="Arial" w:hAnsi="Arial"/>
+          <w:color w:val="718096"/>
+          <w:sz w:val="18"/>
+        </w:rPr>
+        <w:t>Duree : 20 min  |  Niveau : Debutant  |  Type : Pratique</w:t>
+      </w:r>
+    </w:p>
+    <w:p>
+      <w:pPr>
+        <w:spacing w:before="200"/>
+      </w:pPr>
+      <w:r>
+        <w:rPr>
+          <w:rFonts w:ascii="Arial" w:hAnsi="Arial"/>
           <w:b/>
           <w:color w:val="57AEE0"/>
         </w:rPr>
-        <w:t xml:space="preserve">Objectif : </w:t>
+        <w:t xml:space="preserve">Objectif d'apprentissage : </w:t>
       </w:r>
       <w:r>
         <w:rPr>
@@ -2499,7 +4488,7 @@
         <w:pStyle w:val="Heading2"/>
       </w:pPr>
       <w:r>
-        <w:t>Points de controle avant envoi</w:t>
+        <w:t>Checklist de controle qualite</w:t>
       </w:r>
     </w:p>
     <w:p>
@@ -2620,6 +4609,26 @@
       </w:r>
     </w:p>
     <w:p>
+      <w:pPr>
+        <w:spacing w:before="240"/>
+      </w:pPr>
+      <w:r>
+        <w:rPr>
+          <w:rFonts w:ascii="Arial" w:hAnsi="Arial"/>
+          <w:b/>
+          <w:color w:val="059669"/>
+        </w:rPr>
+        <w:t xml:space="preserve">A retenir : </w:t>
+      </w:r>
+      <w:r>
+        <w:rPr>
+          <w:rFonts w:ascii="Arial" w:hAnsi="Arial"/>
+          <w:color w:val="2D3748"/>
+        </w:rPr>
+        <w:t>Une seule commande genere la newsletter complete. Le controle qualite humain reste indispensable avant diffusion.</w:t>
+      </w:r>
+    </w:p>
+    <w:p>
       <w:r>
         <w:br w:type="page"/>
       </w:r>
@@ -2636,10 +4645,23 @@
       <w:r>
         <w:rPr>
           <w:rFonts w:ascii="Arial" w:hAnsi="Arial"/>
+          <w:color w:val="718096"/>
+          <w:sz w:val="18"/>
+        </w:rPr>
+        <w:t>Duree : 15 min  |  Niveau : Debutant a Intermediaire  |  Type : Reference</w:t>
+      </w:r>
+    </w:p>
+    <w:p>
+      <w:pPr>
+        <w:spacing w:before="200"/>
+      </w:pPr>
+      <w:r>
+        <w:rPr>
+          <w:rFonts w:ascii="Arial" w:hAnsi="Arial"/>
           <w:b/>
           <w:color w:val="57AEE0"/>
         </w:rPr>
-        <w:t xml:space="preserve">Objectif : </w:t>
+        <w:t xml:space="preserve">Objectif d'apprentissage : </w:t>
       </w:r>
       <w:r>
         <w:rPr>
@@ -2673,14 +4695,15 @@
         <w:tblLook w:firstColumn="1" w:firstRow="1" w:lastColumn="0" w:lastRow="0" w:noHBand="0" w:noVBand="1" w:val="04A0"/>
       </w:tblPr>
       <w:tblGrid>
-        <w:gridCol w:w="3135"/>
-        <w:gridCol w:w="3135"/>
-        <w:gridCol w:w="3135"/>
+        <w:gridCol w:w="2351"/>
+        <w:gridCol w:w="2351"/>
+        <w:gridCol w:w="2351"/>
+        <w:gridCol w:w="2351"/>
       </w:tblGrid>
       <w:tr>
         <w:tc>
           <w:tcPr>
-            <w:tcW w:type="dxa" w:w="3118"/>
+            <w:tcW w:type="dxa" w:w="2835"/>
             <w:shd w:fill="051E3B"/>
           </w:tcPr>
           <w:p>
@@ -2701,7 +4724,7 @@
         </w:tc>
         <w:tc>
           <w:tcPr>
-            <w:tcW w:type="dxa" w:w="3118"/>
+            <w:tcW w:type="dxa" w:w="2835"/>
             <w:shd w:fill="051E3B"/>
           </w:tcPr>
           <w:p>
@@ -2722,7 +4745,7 @@
         </w:tc>
         <w:tc>
           <w:tcPr>
-            <w:tcW w:type="dxa" w:w="2835"/>
+            <w:tcW w:type="dxa" w:w="1701"/>
             <w:shd w:fill="051E3B"/>
           </w:tcPr>
           <w:p>
@@ -2741,11 +4764,32 @@
             </w:r>
           </w:p>
         </w:tc>
+        <w:tc>
+          <w:tcPr>
+            <w:tcW w:type="dxa" w:w="1701"/>
+            <w:shd w:fill="051E3B"/>
+          </w:tcPr>
+          <w:p>
+            <w:pPr>
+              <w:spacing w:before="40" w:after="40"/>
+            </w:pPr>
+            <w:r/>
+            <w:r>
+              <w:rPr>
+                <w:rFonts w:ascii="Arial" w:hAnsi="Arial"/>
+                <w:b/>
+                <w:color w:val="FFFFFF"/>
+                <w:sz w:val="18"/>
+              </w:rPr>
+              <w:t>Qui</w:t>
+            </w:r>
+          </w:p>
+        </w:tc>
       </w:tr>
       <w:tr>
         <w:tc>
           <w:tcPr>
-            <w:tcW w:type="dxa" w:w="3118"/>
+            <w:tcW w:type="dxa" w:w="2835"/>
           </w:tcPr>
           <w:p>
             <w:pPr>
@@ -2765,7 +4809,7 @@
         </w:tc>
         <w:tc>
           <w:tcPr>
-            <w:tcW w:type="dxa" w:w="3118"/>
+            <w:tcW w:type="dxa" w:w="2835"/>
           </w:tcPr>
           <w:p>
             <w:pPr>
@@ -2785,7 +4829,7 @@
         </w:tc>
         <w:tc>
           <w:tcPr>
-            <w:tcW w:type="dxa" w:w="2835"/>
+            <w:tcW w:type="dxa" w:w="1701"/>
           </w:tcPr>
           <w:p>
             <w:pPr>
@@ -2803,11 +4847,31 @@
             </w:r>
           </w:p>
         </w:tc>
+        <w:tc>
+          <w:tcPr>
+            <w:tcW w:type="dxa" w:w="1701"/>
+          </w:tcPr>
+          <w:p>
+            <w:pPr>
+              <w:spacing w:before="40" w:after="40"/>
+            </w:pPr>
+            <w:r/>
+            <w:r>
+              <w:rPr>
+                <w:rFonts w:ascii="Arial" w:hAnsi="Arial"/>
+                <w:b w:val="0"/>
+                <w:color w:val="2D3748"/>
+                <w:sz w:val="18"/>
+              </w:rPr>
+              <w:t>Pilote</w:t>
+            </w:r>
+          </w:p>
+        </w:tc>
       </w:tr>
       <w:tr>
         <w:tc>
           <w:tcPr>
-            <w:tcW w:type="dxa" w:w="3118"/>
+            <w:tcW w:type="dxa" w:w="2835"/>
             <w:shd w:fill="F0F4F8"/>
           </w:tcPr>
           <w:p>
@@ -2822,13 +4886,13 @@
                 <w:color w:val="2D3748"/>
                 <w:sz w:val="18"/>
               </w:rPr>
-              <w:t>Ajouter / supprimer une source RSS</w:t>
+              <w:t>Ajouter / supprimer source RSS</w:t>
             </w:r>
           </w:p>
         </w:tc>
         <w:tc>
           <w:tcPr>
-            <w:tcW w:type="dxa" w:w="3118"/>
+            <w:tcW w:type="dxa" w:w="2835"/>
             <w:shd w:fill="F0F4F8"/>
           </w:tcPr>
           <w:p>
@@ -2849,7 +4913,7 @@
         </w:tc>
         <w:tc>
           <w:tcPr>
-            <w:tcW w:type="dxa" w:w="2835"/>
+            <w:tcW w:type="dxa" w:w="1701"/>
             <w:shd w:fill="F0F4F8"/>
           </w:tcPr>
           <w:p>
@@ -2868,11 +4932,10 @@
             </w:r>
           </w:p>
         </w:tc>
-      </w:tr>
-      <w:tr>
         <w:tc>
           <w:tcPr>
-            <w:tcW w:type="dxa" w:w="3118"/>
+            <w:tcW w:type="dxa" w:w="1701"/>
+            <w:shd w:fill="F0F4F8"/>
           </w:tcPr>
           <w:p>
             <w:pPr>
@@ -2886,13 +4949,35 @@
                 <w:color w:val="2D3748"/>
                 <w:sz w:val="18"/>
               </w:rPr>
-              <w:t>Modifier les mots-cles d'un theme</w:t>
+              <w:t>Pilote</w:t>
+            </w:r>
+          </w:p>
+        </w:tc>
+      </w:tr>
+      <w:tr>
+        <w:tc>
+          <w:tcPr>
+            <w:tcW w:type="dxa" w:w="2835"/>
+          </w:tcPr>
+          <w:p>
+            <w:pPr>
+              <w:spacing w:before="40" w:after="40"/>
+            </w:pPr>
+            <w:r/>
+            <w:r>
+              <w:rPr>
+                <w:rFonts w:ascii="Arial" w:hAnsi="Arial"/>
+                <w:b w:val="0"/>
+                <w:color w:val="2D3748"/>
+                <w:sz w:val="18"/>
+              </w:rPr>
+              <w:t>Modifier mots-cles d'un theme</w:t>
             </w:r>
           </w:p>
         </w:tc>
         <w:tc>
           <w:tcPr>
-            <w:tcW w:type="dxa" w:w="3118"/>
+            <w:tcW w:type="dxa" w:w="2835"/>
           </w:tcPr>
           <w:p>
             <w:pPr>
@@ -2912,7 +4997,7 @@
         </w:tc>
         <w:tc>
           <w:tcPr>
-            <w:tcW w:type="dxa" w:w="2835"/>
+            <w:tcW w:type="dxa" w:w="1701"/>
           </w:tcPr>
           <w:p>
             <w:pPr>
@@ -2930,11 +5015,31 @@
             </w:r>
           </w:p>
         </w:tc>
+        <w:tc>
+          <w:tcPr>
+            <w:tcW w:type="dxa" w:w="1701"/>
+          </w:tcPr>
+          <w:p>
+            <w:pPr>
+              <w:spacing w:before="40" w:after="40"/>
+            </w:pPr>
+            <w:r/>
+            <w:r>
+              <w:rPr>
+                <w:rFonts w:ascii="Arial" w:hAnsi="Arial"/>
+                <w:b w:val="0"/>
+                <w:color w:val="2D3748"/>
+                <w:sz w:val="18"/>
+              </w:rPr>
+              <w:t>Pilote</w:t>
+            </w:r>
+          </w:p>
+        </w:tc>
       </w:tr>
       <w:tr>
         <w:tc>
           <w:tcPr>
-            <w:tcW w:type="dxa" w:w="3118"/>
+            <w:tcW w:type="dxa" w:w="2835"/>
             <w:shd w:fill="F0F4F8"/>
           </w:tcPr>
           <w:p>
@@ -2949,13 +5054,13 @@
                 <w:color w:val="2D3748"/>
                 <w:sz w:val="18"/>
               </w:rPr>
-              <w:t>Ajuster le ton de l'editorial</w:t>
+              <w:t>Ajuster le ton editorial</w:t>
             </w:r>
           </w:p>
         </w:tc>
         <w:tc>
           <w:tcPr>
-            <w:tcW w:type="dxa" w:w="3118"/>
+            <w:tcW w:type="dxa" w:w="2835"/>
             <w:shd w:fill="F0F4F8"/>
           </w:tcPr>
           <w:p>
@@ -2976,7 +5081,7 @@
         </w:tc>
         <w:tc>
           <w:tcPr>
-            <w:tcW w:type="dxa" w:w="2835"/>
+            <w:tcW w:type="dxa" w:w="1701"/>
             <w:shd w:fill="F0F4F8"/>
           </w:tcPr>
           <w:p>
@@ -2995,11 +5100,32 @@
             </w:r>
           </w:p>
         </w:tc>
+        <w:tc>
+          <w:tcPr>
+            <w:tcW w:type="dxa" w:w="1701"/>
+            <w:shd w:fill="F0F4F8"/>
+          </w:tcPr>
+          <w:p>
+            <w:pPr>
+              <w:spacing w:before="40" w:after="40"/>
+            </w:pPr>
+            <w:r/>
+            <w:r>
+              <w:rPr>
+                <w:rFonts w:ascii="Arial" w:hAnsi="Arial"/>
+                <w:b w:val="0"/>
+                <w:color w:val="2D3748"/>
+                <w:sz w:val="18"/>
+              </w:rPr>
+              <w:t>Tech</w:t>
+            </w:r>
+          </w:p>
+        </w:tc>
       </w:tr>
       <w:tr>
         <w:tc>
           <w:tcPr>
-            <w:tcW w:type="dxa" w:w="3118"/>
+            <w:tcW w:type="dxa" w:w="2835"/>
           </w:tcPr>
           <w:p>
             <w:pPr>
@@ -3019,7 +5145,7 @@
         </w:tc>
         <w:tc>
           <w:tcPr>
-            <w:tcW w:type="dxa" w:w="3118"/>
+            <w:tcW w:type="dxa" w:w="2835"/>
           </w:tcPr>
           <w:p>
             <w:pPr>
@@ -3033,13 +5159,13 @@
                 <w:color w:val="2D3748"/>
                 <w:sz w:val="18"/>
               </w:rPr>
-              <w:t>src/templates/newsletter_v2.html</w:t>
+              <w:t>templates/newsletter_v2.html</w:t>
             </w:r>
           </w:p>
         </w:tc>
         <w:tc>
           <w:tcPr>
-            <w:tcW w:type="dxa" w:w="2835"/>
+            <w:tcW w:type="dxa" w:w="1701"/>
           </w:tcPr>
           <w:p>
             <w:pPr>
@@ -3057,11 +5183,31 @@
             </w:r>
           </w:p>
         </w:tc>
+        <w:tc>
+          <w:tcPr>
+            <w:tcW w:type="dxa" w:w="1701"/>
+          </w:tcPr>
+          <w:p>
+            <w:pPr>
+              <w:spacing w:before="40" w:after="40"/>
+            </w:pPr>
+            <w:r/>
+            <w:r>
+              <w:rPr>
+                <w:rFonts w:ascii="Arial" w:hAnsi="Arial"/>
+                <w:b w:val="0"/>
+                <w:color w:val="2D3748"/>
+                <w:sz w:val="18"/>
+              </w:rPr>
+              <w:t>Tech</w:t>
+            </w:r>
+          </w:p>
+        </w:tc>
       </w:tr>
       <w:tr>
         <w:tc>
           <w:tcPr>
-            <w:tcW w:type="dxa" w:w="3118"/>
+            <w:tcW w:type="dxa" w:w="2835"/>
             <w:shd w:fill="F0F4F8"/>
           </w:tcPr>
           <w:p>
@@ -3082,7 +5228,7 @@
         </w:tc>
         <w:tc>
           <w:tcPr>
-            <w:tcW w:type="dxa" w:w="3118"/>
+            <w:tcW w:type="dxa" w:w="2835"/>
             <w:shd w:fill="F0F4F8"/>
           </w:tcPr>
           <w:p>
@@ -3103,7 +5249,7 @@
         </w:tc>
         <w:tc>
           <w:tcPr>
-            <w:tcW w:type="dxa" w:w="2835"/>
+            <w:tcW w:type="dxa" w:w="1701"/>
             <w:shd w:fill="F0F4F8"/>
           </w:tcPr>
           <w:p>
@@ -3118,7 +5264,28 @@
                 <w:color w:val="2D3748"/>
                 <w:sz w:val="18"/>
               </w:rPr>
-              <w:t>Avance (Claude Code)</w:t>
+              <w:t>Avance</w:t>
+            </w:r>
+          </w:p>
+        </w:tc>
+        <w:tc>
+          <w:tcPr>
+            <w:tcW w:type="dxa" w:w="1701"/>
+            <w:shd w:fill="F0F4F8"/>
+          </w:tcPr>
+          <w:p>
+            <w:pPr>
+              <w:spacing w:before="40" w:after="40"/>
+            </w:pPr>
+            <w:r/>
+            <w:r>
+              <w:rPr>
+                <w:rFonts w:ascii="Arial" w:hAnsi="Arial"/>
+                <w:b w:val="0"/>
+                <w:color w:val="2D3748"/>
+                <w:sz w:val="18"/>
+              </w:rPr>
+              <w:t>Claude Code</w:t>
             </w:r>
           </w:p>
         </w:tc>
@@ -3174,6 +5341,282 @@
         <w:t>La premiere edition suivant la formation sera pilotee collectivement pour ancrer les reflexes. Un referent newsletter sera designe au sein du CODEV pour assurer la continuite.</w:t>
       </w:r>
     </w:p>
+    <w:p>
+      <w:r>
+        <w:br w:type="page"/>
+      </w:r>
+    </w:p>
+    <w:p>
+      <w:pPr>
+        <w:pStyle w:val="Heading1"/>
+      </w:pPr>
+      <w:r>
+        <w:t>Recapitulatif des competences acquises</w:t>
+      </w:r>
+    </w:p>
+    <w:p>
+      <w:pPr>
+        <w:spacing w:before="200"/>
+      </w:pPr>
+      <w:r>
+        <w:rPr>
+          <w:rFonts w:ascii="Arial" w:hAnsi="Arial"/>
+          <w:color w:val="2D3748"/>
+          <w:sz w:val="22"/>
+        </w:rPr>
+        <w:t>A l'issue de cette formation, vous etes capable de :</w:t>
+      </w:r>
+    </w:p>
+    <w:p>
+      <w:pPr>
+        <w:spacing w:before="60" w:after="60"/>
+        <w:ind w:left="567"/>
+      </w:pPr>
+      <w:r>
+        <w:rPr>
+          <w:rFonts w:ascii="Arial" w:hAnsi="Arial"/>
+          <w:b/>
+          <w:color w:val="059669"/>
+          <w:sz w:val="20"/>
+        </w:rPr>
+        <w:t xml:space="preserve">✓  </w:t>
+      </w:r>
+      <w:r>
+        <w:rPr>
+          <w:rFonts w:ascii="Arial" w:hAnsi="Arial"/>
+          <w:color w:val="2D3748"/>
+          <w:sz w:val="20"/>
+        </w:rPr>
+        <w:t>Expliquer le fonctionnement du pipeline de generation de newsletter</w:t>
+      </w:r>
+    </w:p>
+    <w:p>
+      <w:pPr>
+        <w:spacing w:before="60" w:after="60"/>
+        <w:ind w:left="567"/>
+      </w:pPr>
+      <w:r>
+        <w:rPr>
+          <w:rFonts w:ascii="Arial" w:hAnsi="Arial"/>
+          <w:b/>
+          <w:color w:val="059669"/>
+          <w:sz w:val="20"/>
+        </w:rPr>
+        <w:t xml:space="preserve">✓  </w:t>
+      </w:r>
+      <w:r>
+        <w:rPr>
+          <w:rFonts w:ascii="Arial" w:hAnsi="Arial"/>
+          <w:color w:val="2D3748"/>
+          <w:sz w:val="20"/>
+        </w:rPr>
+        <w:t>Naviguer dans le repo GitHub et identifier les fichiers cles</w:t>
+      </w:r>
+    </w:p>
+    <w:p>
+      <w:pPr>
+        <w:spacing w:before="60" w:after="60"/>
+        <w:ind w:left="567"/>
+      </w:pPr>
+      <w:r>
+        <w:rPr>
+          <w:rFonts w:ascii="Arial" w:hAnsi="Arial"/>
+          <w:b/>
+          <w:color w:val="059669"/>
+          <w:sz w:val="20"/>
+        </w:rPr>
+        <w:t xml:space="preserve">✓  </w:t>
+      </w:r>
+      <w:r>
+        <w:rPr>
+          <w:rFonts w:ascii="Arial" w:hAnsi="Arial"/>
+          <w:color w:val="2D3748"/>
+          <w:sz w:val="20"/>
+        </w:rPr>
+        <w:t>Creer des Issues, Milestones et commenter des Pull Requests</w:t>
+      </w:r>
+    </w:p>
+    <w:p>
+      <w:pPr>
+        <w:spacing w:before="60" w:after="60"/>
+        <w:ind w:left="567"/>
+      </w:pPr>
+      <w:r>
+        <w:rPr>
+          <w:rFonts w:ascii="Arial" w:hAnsi="Arial"/>
+          <w:b/>
+          <w:color w:val="059669"/>
+          <w:sz w:val="20"/>
+        </w:rPr>
+        <w:t xml:space="preserve">✓  </w:t>
+      </w:r>
+      <w:r>
+        <w:rPr>
+          <w:rFonts w:ascii="Arial" w:hAnsi="Arial"/>
+          <w:color w:val="2D3748"/>
+          <w:sz w:val="20"/>
+        </w:rPr>
+        <w:t>Lancer une generation de newsletter via la ligne de commande</w:t>
+      </w:r>
+    </w:p>
+    <w:p>
+      <w:pPr>
+        <w:spacing w:before="60" w:after="60"/>
+        <w:ind w:left="567"/>
+      </w:pPr>
+      <w:r>
+        <w:rPr>
+          <w:rFonts w:ascii="Arial" w:hAnsi="Arial"/>
+          <w:b/>
+          <w:color w:val="059669"/>
+          <w:sz w:val="20"/>
+        </w:rPr>
+        <w:t xml:space="preserve">✓  </w:t>
+      </w:r>
+      <w:r>
+        <w:rPr>
+          <w:rFonts w:ascii="Arial" w:hAnsi="Arial"/>
+          <w:color w:val="2D3748"/>
+          <w:sz w:val="20"/>
+        </w:rPr>
+        <w:t>Modifier les sources RSS et les themes editoriaux</w:t>
+      </w:r>
+    </w:p>
+    <w:p>
+      <w:pPr>
+        <w:spacing w:before="60" w:after="60"/>
+        <w:ind w:left="567"/>
+      </w:pPr>
+      <w:r>
+        <w:rPr>
+          <w:rFonts w:ascii="Arial" w:hAnsi="Arial"/>
+          <w:b/>
+          <w:color w:val="059669"/>
+          <w:sz w:val="20"/>
+        </w:rPr>
+        <w:t xml:space="preserve">✓  </w:t>
+      </w:r>
+      <w:r>
+        <w:rPr>
+          <w:rFonts w:ascii="Arial" w:hAnsi="Arial"/>
+          <w:color w:val="2D3748"/>
+          <w:sz w:val="20"/>
+        </w:rPr>
+        <w:t>Effectuer un controle qualite avant diffusion</w:t>
+      </w:r>
+    </w:p>
+    <w:p>
+      <w:pPr>
+        <w:spacing w:before="60" w:after="60"/>
+        <w:ind w:left="567"/>
+      </w:pPr>
+      <w:r>
+        <w:rPr>
+          <w:rFonts w:ascii="Arial" w:hAnsi="Arial"/>
+          <w:b/>
+          <w:color w:val="059669"/>
+          <w:sz w:val="20"/>
+        </w:rPr>
+        <w:t xml:space="preserve">✓  </w:t>
+      </w:r>
+      <w:r>
+        <w:rPr>
+          <w:rFonts w:ascii="Arial" w:hAnsi="Arial"/>
+          <w:color w:val="2D3748"/>
+          <w:sz w:val="20"/>
+        </w:rPr>
+        <w:t>Collaborer efficacement avec l'equipe technique</w:t>
+      </w:r>
+    </w:p>
+    <w:p>
+      <w:pPr>
+        <w:spacing w:before="80" w:after="80"/>
+        <w:pBdr>
+          <w:bottom w:val="single" w:sz="4" w:space="1" w:color="E2E8F0"/>
+        </w:pBdr>
+      </w:pPr>
+    </w:p>
+    <w:p>
+      <w:pPr>
+        <w:pStyle w:val="Heading2"/>
+      </w:pPr>
+      <w:r>
+        <w:t>Ressources complementaires</w:t>
+      </w:r>
+    </w:p>
+    <w:p>
+      <w:pPr>
+        <w:pStyle w:val="ListBullet"/>
+        <w:spacing w:before="40" w:after="40"/>
+        <w:ind w:left="850"/>
+      </w:pPr>
+      <w:r>
+        <w:rPr>
+          <w:rFonts w:ascii="Arial" w:hAnsi="Arial"/>
+          <w:b/>
+          <w:color w:val="2D3748"/>
+          <w:sz w:val="20"/>
+        </w:rPr>
+        <w:t xml:space="preserve">Documentation GitHub : </w:t>
+      </w:r>
+      <w:r>
+        <w:rPr>
+          <w:rFonts w:ascii="Arial" w:hAnsi="Arial"/>
+          <w:color w:val="2D3748"/>
+          <w:sz w:val="20"/>
+        </w:rPr>
+        <w:t>https://docs.github.com/fr</w:t>
+      </w:r>
+    </w:p>
+    <w:p>
+      <w:pPr>
+        <w:pStyle w:val="ListBullet"/>
+        <w:spacing w:before="40" w:after="40"/>
+        <w:ind w:left="850"/>
+      </w:pPr>
+      <w:r>
+        <w:rPr>
+          <w:rFonts w:ascii="Arial" w:hAnsi="Arial"/>
+          <w:b/>
+          <w:color w:val="2D3748"/>
+          <w:sz w:val="20"/>
+        </w:rPr>
+        <w:t xml:space="preserve">Charte graphique Ares &amp; Co : </w:t>
+      </w:r>
+      <w:r>
+        <w:rPr>
+          <w:rFonts w:ascii="Arial" w:hAnsi="Arial"/>
+          <w:color w:val="2D3748"/>
+          <w:sz w:val="20"/>
+        </w:rPr>
+        <w:t>CHARTE_GRAPHIQUE_ARES.md (dans le repo)</w:t>
+      </w:r>
+    </w:p>
+    <w:p>
+      <w:pPr>
+        <w:pStyle w:val="ListBullet"/>
+        <w:spacing w:before="40" w:after="40"/>
+        <w:ind w:left="850"/>
+      </w:pPr>
+      <w:r>
+        <w:rPr>
+          <w:rFonts w:ascii="Arial" w:hAnsi="Arial"/>
+          <w:b/>
+          <w:color w:val="2D3748"/>
+          <w:sz w:val="20"/>
+        </w:rPr>
+        <w:t xml:space="preserve">Support technique : </w:t>
+      </w:r>
+      <w:r>
+        <w:rPr>
+          <w:rFonts w:ascii="Arial" w:hAnsi="Arial"/>
+          <w:color w:val="2D3748"/>
+          <w:sz w:val="20"/>
+        </w:rPr>
+        <w:t>Ouvrir une Issue sur le repo genesis</w:t>
+      </w:r>
+    </w:p>
+    <w:p/>
     <w:p/>
     <w:p>
       <w:pPr>

</xml_diff>

<commit_message>
Mark GitHub Desktop as optional in prerequisites
https://claude.ai/code/session_01AX8JiWSuFaZ7Un1Ws6Zwr3
</commit_message>
<xml_diff>
--- a/Formation_Newsletter_Banking_AresCo.docx
+++ b/Formation_Newsletter_Banking_AresCo.docx
@@ -1196,6 +1196,49 @@
                 <w:sz w:val="18"/>
               </w:rPr>
               <w:t>Acces au repo genesis (lecture minimum, ecriture recommande)</w:t>
+            </w:r>
+          </w:p>
+        </w:tc>
+      </w:tr>
+      <w:tr>
+        <w:tc>
+          <w:tcPr>
+            <w:tcW w:type="dxa" w:w="2268"/>
+            <w:shd w:fill="F0F4F8"/>
+          </w:tcPr>
+          <w:p>
+            <w:pPr>
+              <w:spacing w:before="40" w:after="40"/>
+            </w:pPr>
+            <w:r/>
+            <w:r>
+              <w:rPr>
+                <w:rFonts w:ascii="Arial" w:hAnsi="Arial"/>
+                <w:b/>
+                <w:color w:val="051E3B"/>
+                <w:sz w:val="18"/>
+              </w:rPr>
+              <w:t>GitHub Desktop</w:t>
+            </w:r>
+          </w:p>
+        </w:tc>
+        <w:tc>
+          <w:tcPr>
+            <w:tcW w:type="dxa" w:w="6803"/>
+          </w:tcPr>
+          <w:p>
+            <w:pPr>
+              <w:spacing w:before="40" w:after="40"/>
+            </w:pPr>
+            <w:r/>
+            <w:r>
+              <w:rPr>
+                <w:rFonts w:ascii="Arial" w:hAnsi="Arial"/>
+                <w:b w:val="0"/>
+                <w:color w:val="2D3748"/>
+                <w:sz w:val="18"/>
+              </w:rPr>
+              <w:t>Optionnel - facilite la synchronisation locale</w:t>
             </w:r>
           </w:p>
         </w:tc>
@@ -3651,7 +3694,7 @@
           <w:rFonts w:ascii="Arial" w:hAnsi="Arial"/>
           <w:color w:val="2D3748"/>
         </w:rPr>
-        <w:t>Les fichiers YAML dans config/ sont les seuls que vous modifierez directement. Le reste est geré par l'equipe technique ou via Claude Code.</w:t>
+        <w:t>Les fichiers YAML dans config/ sont les seuls que vous modifierez directement. Le reste est gere par l'equipe technique ou via Claude Code.</w:t>
       </w:r>
     </w:p>
     <w:p>

</xml_diff>

<commit_message>
Add diagrams, Python install, and non-dev guidance
Major updates to training document:
- Add visual flow diagrams (pipeline, iteration cycle, workflow)
- Add Python/Git/Node.js installation instructions with download links
- Add section "When you don't know where to start" with example prompts
  for architecture, decomposition, choosing approaches, getting unstuck
- Add tip: "Claude Code is your developer buddy"
- All PowerShell commands now have explanations

https://claude.ai/code/session_01AX8JiWSuFaZ7Un1Ws6Zwr3
</commit_message>
<xml_diff>
--- a/Formation_Newsletter_Banking_AresCo.docx
+++ b/Formation_Newsletter_Banking_AresCo.docx
@@ -676,6 +676,280 @@
     </w:p>
     <w:p>
       <w:pPr>
+        <w:jc w:val="center"/>
+      </w:pPr>
+      <w:r>
+        <w:rPr>
+          <w:rFonts w:ascii="Arial" w:hAnsi="Arial"/>
+          <w:b/>
+          <w:color w:val="051E5B"/>
+          <w:sz w:val="20"/>
+        </w:rPr>
+        <w:t>SCHEMA : Pipeline de generation</w:t>
+      </w:r>
+    </w:p>
+    <w:tbl>
+      <w:tblPr>
+        <w:tblW w:type="auto" w:w="0"/>
+        <w:jc w:val="center"/>
+        <w:tblLook w:firstColumn="1" w:firstRow="1" w:lastColumn="0" w:lastRow="0" w:noHBand="0" w:noVBand="1" w:val="04A0"/>
+      </w:tblPr>
+      <w:tblGrid>
+        <w:gridCol w:w="907"/>
+        <w:gridCol w:w="907"/>
+        <w:gridCol w:w="907"/>
+        <w:gridCol w:w="907"/>
+        <w:gridCol w:w="907"/>
+        <w:gridCol w:w="907"/>
+        <w:gridCol w:w="907"/>
+        <w:gridCol w:w="907"/>
+        <w:gridCol w:w="907"/>
+        <w:gridCol w:w="907"/>
+        <w:gridCol w:w="907"/>
+      </w:tblGrid>
+      <w:tr>
+        <w:tc>
+          <w:tcPr>
+            <w:tcW w:type="dxa" w:w="1247"/>
+            <w:shd w:fill="051E3B"/>
+          </w:tcPr>
+          <w:p>
+            <w:pPr>
+              <w:spacing w:before="40" w:after="40"/>
+              <w:jc w:val="center"/>
+            </w:pPr>
+            <w:r/>
+            <w:r>
+              <w:rPr>
+                <w:rFonts w:ascii="Arial" w:hAnsi="Arial"/>
+                <w:b/>
+                <w:color w:val="FFFFFF"/>
+                <w:sz w:val="16"/>
+              </w:rPr>
+              <w:t>Sources RSS</w:t>
+            </w:r>
+          </w:p>
+        </w:tc>
+        <w:tc>
+          <w:tcPr>
+            <w:tcW w:type="dxa" w:w="567"/>
+          </w:tcPr>
+          <w:p>
+            <w:pPr>
+              <w:spacing w:before="40" w:after="40"/>
+              <w:jc w:val="center"/>
+            </w:pPr>
+            <w:r/>
+            <w:r>
+              <w:rPr>
+                <w:rFonts w:ascii="Arial" w:hAnsi="Arial"/>
+                <w:b/>
+                <w:color w:val="57AEE0"/>
+                <w:sz w:val="24"/>
+              </w:rPr>
+              <w:t xml:space="preserve">  →  </w:t>
+            </w:r>
+          </w:p>
+        </w:tc>
+        <w:tc>
+          <w:tcPr>
+            <w:tcW w:type="dxa" w:w="1247"/>
+            <w:shd w:fill="57AEE0"/>
+          </w:tcPr>
+          <w:p>
+            <w:pPr>
+              <w:spacing w:before="40" w:after="40"/>
+              <w:jc w:val="center"/>
+            </w:pPr>
+            <w:r/>
+            <w:r>
+              <w:rPr>
+                <w:rFonts w:ascii="Arial" w:hAnsi="Arial"/>
+                <w:b/>
+                <w:color w:val="FFFFFF"/>
+                <w:sz w:val="16"/>
+              </w:rPr>
+              <w:t>Collecte</w:t>
+            </w:r>
+          </w:p>
+        </w:tc>
+        <w:tc>
+          <w:tcPr>
+            <w:tcW w:type="dxa" w:w="567"/>
+          </w:tcPr>
+          <w:p>
+            <w:pPr>
+              <w:spacing w:before="40" w:after="40"/>
+              <w:jc w:val="center"/>
+            </w:pPr>
+            <w:r/>
+            <w:r>
+              <w:rPr>
+                <w:rFonts w:ascii="Arial" w:hAnsi="Arial"/>
+                <w:b/>
+                <w:color w:val="57AEE0"/>
+                <w:sz w:val="24"/>
+              </w:rPr>
+              <w:t xml:space="preserve">  →  </w:t>
+            </w:r>
+          </w:p>
+        </w:tc>
+        <w:tc>
+          <w:tcPr>
+            <w:tcW w:type="dxa" w:w="1247"/>
+            <w:shd w:fill="57AEE0"/>
+          </w:tcPr>
+          <w:p>
+            <w:pPr>
+              <w:spacing w:before="40" w:after="40"/>
+              <w:jc w:val="center"/>
+            </w:pPr>
+            <w:r/>
+            <w:r>
+              <w:rPr>
+                <w:rFonts w:ascii="Arial" w:hAnsi="Arial"/>
+                <w:b/>
+                <w:color w:val="FFFFFF"/>
+                <w:sz w:val="16"/>
+              </w:rPr>
+              <w:t>Analyse IA</w:t>
+            </w:r>
+          </w:p>
+        </w:tc>
+        <w:tc>
+          <w:tcPr>
+            <w:tcW w:type="dxa" w:w="567"/>
+          </w:tcPr>
+          <w:p>
+            <w:pPr>
+              <w:spacing w:before="40" w:after="40"/>
+              <w:jc w:val="center"/>
+            </w:pPr>
+            <w:r/>
+            <w:r>
+              <w:rPr>
+                <w:rFonts w:ascii="Arial" w:hAnsi="Arial"/>
+                <w:b/>
+                <w:color w:val="57AEE0"/>
+                <w:sz w:val="24"/>
+              </w:rPr>
+              <w:t xml:space="preserve">  →  </w:t>
+            </w:r>
+          </w:p>
+        </w:tc>
+        <w:tc>
+          <w:tcPr>
+            <w:tcW w:type="dxa" w:w="1247"/>
+            <w:shd w:fill="57AEE0"/>
+          </w:tcPr>
+          <w:p>
+            <w:pPr>
+              <w:spacing w:before="40" w:after="40"/>
+              <w:jc w:val="center"/>
+            </w:pPr>
+            <w:r/>
+            <w:r>
+              <w:rPr>
+                <w:rFonts w:ascii="Arial" w:hAnsi="Arial"/>
+                <w:b/>
+                <w:color w:val="FFFFFF"/>
+                <w:sz w:val="16"/>
+              </w:rPr>
+              <w:t>Curation</w:t>
+            </w:r>
+          </w:p>
+        </w:tc>
+        <w:tc>
+          <w:tcPr>
+            <w:tcW w:type="dxa" w:w="567"/>
+          </w:tcPr>
+          <w:p>
+            <w:pPr>
+              <w:spacing w:before="40" w:after="40"/>
+              <w:jc w:val="center"/>
+            </w:pPr>
+            <w:r/>
+            <w:r>
+              <w:rPr>
+                <w:rFonts w:ascii="Arial" w:hAnsi="Arial"/>
+                <w:b/>
+                <w:color w:val="57AEE0"/>
+                <w:sz w:val="24"/>
+              </w:rPr>
+              <w:t xml:space="preserve">  →  </w:t>
+            </w:r>
+          </w:p>
+        </w:tc>
+        <w:tc>
+          <w:tcPr>
+            <w:tcW w:type="dxa" w:w="1247"/>
+            <w:shd w:fill="57AEE0"/>
+          </w:tcPr>
+          <w:p>
+            <w:pPr>
+              <w:spacing w:before="40" w:after="40"/>
+              <w:jc w:val="center"/>
+            </w:pPr>
+            <w:r/>
+            <w:r>
+              <w:rPr>
+                <w:rFonts w:ascii="Arial" w:hAnsi="Arial"/>
+                <w:b/>
+                <w:color w:val="FFFFFF"/>
+                <w:sz w:val="16"/>
+              </w:rPr>
+              <w:t>Redaction</w:t>
+            </w:r>
+          </w:p>
+        </w:tc>
+        <w:tc>
+          <w:tcPr>
+            <w:tcW w:type="dxa" w:w="567"/>
+          </w:tcPr>
+          <w:p>
+            <w:pPr>
+              <w:spacing w:before="40" w:after="40"/>
+              <w:jc w:val="center"/>
+            </w:pPr>
+            <w:r/>
+            <w:r>
+              <w:rPr>
+                <w:rFonts w:ascii="Arial" w:hAnsi="Arial"/>
+                <w:b/>
+                <w:color w:val="57AEE0"/>
+                <w:sz w:val="24"/>
+              </w:rPr>
+              <w:t xml:space="preserve">  →  </w:t>
+            </w:r>
+          </w:p>
+        </w:tc>
+        <w:tc>
+          <w:tcPr>
+            <w:tcW w:type="dxa" w:w="1247"/>
+            <w:shd w:fill="051E3B"/>
+          </w:tcPr>
+          <w:p>
+            <w:pPr>
+              <w:spacing w:before="40" w:after="40"/>
+              <w:jc w:val="center"/>
+            </w:pPr>
+            <w:r/>
+            <w:r>
+              <w:rPr>
+                <w:rFonts w:ascii="Arial" w:hAnsi="Arial"/>
+                <w:b/>
+                <w:color w:val="FFFFFF"/>
+                <w:sz w:val="16"/>
+              </w:rPr>
+              <w:t>HTML</w:t>
+            </w:r>
+          </w:p>
+        </w:tc>
+      </w:tr>
+    </w:tbl>
+    <w:p/>
+    <w:p>
+      <w:pPr>
         <w:pStyle w:val="ListBullet"/>
         <w:spacing w:before="20" w:after="20"/>
         <w:ind w:left="680"/>
@@ -1242,21 +1516,7 @@
         <w:pStyle w:val="Heading2"/>
       </w:pPr>
       <w:r>
-        <w:t>Architecture du pipeline</w:t>
-      </w:r>
-    </w:p>
-    <w:p>
-      <w:pPr>
-        <w:jc w:val="center"/>
-      </w:pPr>
-      <w:r>
-        <w:rPr>
-          <w:rFonts w:ascii="Consolas" w:hAnsi="Consolas"/>
-          <w:b/>
-          <w:color w:val="051E5B"/>
-          <w:sz w:val="20"/>
-        </w:rPr>
-        <w:t>RSS → collector.py → analyzer.py → curator.py → writer.py → HTML</w:t>
+        <w:t>Architecture technique</w:t>
       </w:r>
     </w:p>
     <w:tbl>
@@ -1671,6 +1931,312 @@
         <w:pStyle w:val="Heading2"/>
       </w:pPr>
       <w:r>
+        <w:t>Le cycle de developpement avec Claude Code</w:t>
+      </w:r>
+    </w:p>
+    <w:p>
+      <w:pPr>
+        <w:spacing w:before="100"/>
+        <w:jc w:val="center"/>
+      </w:pPr>
+      <w:r>
+        <w:rPr>
+          <w:rFonts w:ascii="Arial" w:hAnsi="Arial"/>
+          <w:b/>
+          <w:color w:val="051E5B"/>
+          <w:sz w:val="20"/>
+        </w:rPr>
+        <w:t>SCHEMA : Cycle d'iteration</w:t>
+      </w:r>
+    </w:p>
+    <w:tbl>
+      <w:tblPr>
+        <w:tblW w:type="auto" w:w="0"/>
+        <w:jc w:val="center"/>
+        <w:tblLook w:firstColumn="1" w:firstRow="1" w:lastColumn="0" w:lastRow="0" w:noHBand="0" w:noVBand="1" w:val="04A0"/>
+      </w:tblPr>
+      <w:tblGrid>
+        <w:gridCol w:w="1994"/>
+        <w:gridCol w:w="1994"/>
+        <w:gridCol w:w="1994"/>
+        <w:gridCol w:w="1994"/>
+        <w:gridCol w:w="1994"/>
+      </w:tblGrid>
+      <w:tr>
+        <w:tc>
+          <w:tcPr>
+            <w:tcW w:type="dxa" w:w="1417"/>
+            <w:shd w:fill="051E3B"/>
+          </w:tcPr>
+          <w:p>
+            <w:pPr>
+              <w:spacing w:before="40" w:after="40"/>
+              <w:jc w:val="center"/>
+            </w:pPr>
+            <w:r/>
+            <w:r>
+              <w:rPr>
+                <w:rFonts w:ascii="Arial" w:hAnsi="Arial"/>
+                <w:b/>
+                <w:color w:val="FFFFFF"/>
+                <w:sz w:val="16"/>
+              </w:rPr>
+              <w:t>1. PROMPT</w:t>
+            </w:r>
+          </w:p>
+        </w:tc>
+        <w:tc>
+          <w:tcPr>
+            <w:tcW w:type="dxa" w:w="1417"/>
+          </w:tcPr>
+          <w:p>
+            <w:pPr>
+              <w:spacing w:before="40" w:after="40"/>
+              <w:jc w:val="center"/>
+            </w:pPr>
+            <w:r/>
+            <w:r>
+              <w:rPr>
+                <w:rFonts w:ascii="Arial" w:hAnsi="Arial"/>
+                <w:b/>
+                <w:color w:val="57AEE0"/>
+                <w:sz w:val="24"/>
+              </w:rPr>
+              <w:t>→</w:t>
+            </w:r>
+          </w:p>
+        </w:tc>
+        <w:tc>
+          <w:tcPr>
+            <w:tcW w:type="dxa" w:w="1417"/>
+            <w:shd w:fill="57AEE0"/>
+          </w:tcPr>
+          <w:p>
+            <w:pPr>
+              <w:spacing w:before="40" w:after="40"/>
+              <w:jc w:val="center"/>
+            </w:pPr>
+            <w:r/>
+            <w:r>
+              <w:rPr>
+                <w:rFonts w:ascii="Arial" w:hAnsi="Arial"/>
+                <w:b/>
+                <w:color w:val="FFFFFF"/>
+                <w:sz w:val="16"/>
+              </w:rPr>
+              <w:t>2. GENERER</w:t>
+            </w:r>
+          </w:p>
+        </w:tc>
+        <w:tc>
+          <w:tcPr>
+            <w:tcW w:type="dxa" w:w="1417"/>
+          </w:tcPr>
+          <w:p>
+            <w:pPr>
+              <w:spacing w:before="40" w:after="40"/>
+              <w:jc w:val="center"/>
+            </w:pPr>
+            <w:r/>
+            <w:r>
+              <w:rPr>
+                <w:rFonts w:ascii="Arial" w:hAnsi="Arial"/>
+                <w:b/>
+                <w:color w:val="57AEE0"/>
+                <w:sz w:val="24"/>
+              </w:rPr>
+              <w:t>→</w:t>
+            </w:r>
+          </w:p>
+        </w:tc>
+        <w:tc>
+          <w:tcPr>
+            <w:tcW w:type="dxa" w:w="1417"/>
+            <w:shd w:fill="57AEE0"/>
+          </w:tcPr>
+          <w:p>
+            <w:pPr>
+              <w:spacing w:before="40" w:after="40"/>
+              <w:jc w:val="center"/>
+            </w:pPr>
+            <w:r/>
+            <w:r>
+              <w:rPr>
+                <w:rFonts w:ascii="Arial" w:hAnsi="Arial"/>
+                <w:b/>
+                <w:color w:val="FFFFFF"/>
+                <w:sz w:val="16"/>
+              </w:rPr>
+              <w:t>3. TESTER</w:t>
+            </w:r>
+          </w:p>
+        </w:tc>
+      </w:tr>
+      <w:tr>
+        <w:tc>
+          <w:tcPr>
+            <w:tcW w:type="dxa" w:w="1417"/>
+          </w:tcPr>
+          <w:p>
+            <w:pPr>
+              <w:spacing w:before="40" w:after="40"/>
+              <w:jc w:val="center"/>
+            </w:pPr>
+            <w:r/>
+            <w:r>
+              <w:rPr>
+                <w:rFonts w:ascii="Arial" w:hAnsi="Arial"/>
+                <w:b/>
+                <w:color w:val="57AEE0"/>
+                <w:sz w:val="24"/>
+              </w:rPr>
+              <w:t>↑</w:t>
+            </w:r>
+          </w:p>
+        </w:tc>
+        <w:tc>
+          <w:tcPr>
+            <w:tcW w:type="dxa" w:w="1417"/>
+          </w:tcPr>
+          <w:p/>
+        </w:tc>
+        <w:tc>
+          <w:tcPr>
+            <w:tcW w:type="dxa" w:w="1417"/>
+          </w:tcPr>
+          <w:p/>
+        </w:tc>
+        <w:tc>
+          <w:tcPr>
+            <w:tcW w:type="dxa" w:w="1417"/>
+          </w:tcPr>
+          <w:p/>
+        </w:tc>
+        <w:tc>
+          <w:tcPr>
+            <w:tcW w:type="dxa" w:w="1417"/>
+          </w:tcPr>
+          <w:p>
+            <w:pPr>
+              <w:spacing w:before="40" w:after="40"/>
+              <w:jc w:val="center"/>
+            </w:pPr>
+            <w:r/>
+            <w:r>
+              <w:rPr>
+                <w:rFonts w:ascii="Arial" w:hAnsi="Arial"/>
+                <w:b/>
+                <w:color w:val="57AEE0"/>
+                <w:sz w:val="24"/>
+              </w:rPr>
+              <w:t>↓</w:t>
+            </w:r>
+          </w:p>
+        </w:tc>
+      </w:tr>
+      <w:tr>
+        <w:tc>
+          <w:tcPr>
+            <w:tcW w:type="dxa" w:w="1417"/>
+            <w:shd w:fill="059669"/>
+          </w:tcPr>
+          <w:p>
+            <w:pPr>
+              <w:spacing w:before="40" w:after="40"/>
+              <w:jc w:val="center"/>
+            </w:pPr>
+            <w:r/>
+            <w:r>
+              <w:rPr>
+                <w:rFonts w:ascii="Arial" w:hAnsi="Arial"/>
+                <w:b/>
+                <w:color w:val="FFFFFF"/>
+                <w:sz w:val="16"/>
+              </w:rPr>
+              <w:t>5. VALIDER</w:t>
+            </w:r>
+          </w:p>
+        </w:tc>
+        <w:tc>
+          <w:tcPr>
+            <w:tcW w:type="dxa" w:w="1417"/>
+          </w:tcPr>
+          <w:p>
+            <w:pPr>
+              <w:spacing w:before="40" w:after="40"/>
+              <w:jc w:val="center"/>
+            </w:pPr>
+            <w:r/>
+            <w:r>
+              <w:rPr>
+                <w:rFonts w:ascii="Arial" w:hAnsi="Arial"/>
+                <w:b/>
+                <w:color w:val="57AEE0"/>
+                <w:sz w:val="24"/>
+              </w:rPr>
+              <w:t>←</w:t>
+            </w:r>
+          </w:p>
+        </w:tc>
+        <w:tc>
+          <w:tcPr>
+            <w:tcW w:type="dxa" w:w="1417"/>
+            <w:shd w:fill="EA580C"/>
+          </w:tcPr>
+          <w:p>
+            <w:pPr>
+              <w:spacing w:before="40" w:after="40"/>
+              <w:jc w:val="center"/>
+            </w:pPr>
+            <w:r/>
+            <w:r>
+              <w:rPr>
+                <w:rFonts w:ascii="Arial" w:hAnsi="Arial"/>
+                <w:b/>
+                <w:color w:val="FFFFFF"/>
+                <w:sz w:val="16"/>
+              </w:rPr>
+              <w:t>4. CORRIGER</w:t>
+            </w:r>
+          </w:p>
+        </w:tc>
+        <w:tc>
+          <w:tcPr>
+            <w:tcW w:type="dxa" w:w="1417"/>
+          </w:tcPr>
+          <w:p>
+            <w:pPr>
+              <w:spacing w:before="40" w:after="40"/>
+              <w:jc w:val="center"/>
+            </w:pPr>
+            <w:r/>
+            <w:r>
+              <w:rPr>
+                <w:rFonts w:ascii="Arial" w:hAnsi="Arial"/>
+                <w:b/>
+                <w:color w:val="57AEE0"/>
+                <w:sz w:val="24"/>
+              </w:rPr>
+              <w:t>←</w:t>
+            </w:r>
+          </w:p>
+        </w:tc>
+        <w:tc>
+          <w:tcPr>
+            <w:tcW w:type="dxa" w:w="1417"/>
+          </w:tcPr>
+          <w:p>
+            <w:r/>
+          </w:p>
+        </w:tc>
+      </w:tr>
+    </w:tbl>
+    <w:p/>
+    <w:p>
+      <w:pPr>
+        <w:pStyle w:val="Heading2"/>
+      </w:pPr>
+      <w:r>
         <w:t>Les 4 regles d'or</w:t>
       </w:r>
     </w:p>
@@ -1727,35 +2293,7 @@
     </w:p>
     <w:p>
       <w:pPr>
-        <w:spacing w:before="0" w:after="0"/>
-        <w:ind w:left="283"/>
-      </w:pPr>
-      <w:r>
-        <w:rPr>
-          <w:rFonts w:ascii="Consolas" w:hAnsi="Consolas"/>
-          <w:color w:val="051E5B"/>
-          <w:sz w:val="16"/>
-        </w:rPr>
-        <w:t>✅ "Maintenant, cree un module qui analyse un article avec Claude API"</w:t>
-      </w:r>
-    </w:p>
-    <w:p>
-      <w:pPr>
-        <w:spacing w:before="0" w:after="0"/>
-        <w:ind w:left="283"/>
-      </w:pPr>
-      <w:r>
-        <w:rPr>
-          <w:rFonts w:ascii="Consolas" w:hAnsi="Consolas"/>
-          <w:color w:val="051E5B"/>
-          <w:sz w:val="16"/>
-        </w:rPr>
-        <w:t>✅ "Maintenant, cree un module qui selectionne les 6 meilleurs articles"</w:t>
-      </w:r>
-    </w:p>
-    <w:p>
-      <w:pPr>
-        <w:spacing w:before="200"/>
+        <w:spacing w:before="160"/>
       </w:pPr>
       <w:r>
         <w:rPr>
@@ -1804,40 +2342,12 @@
           <w:color w:val="051E5B"/>
           <w:sz w:val="16"/>
         </w:rPr>
-        <w:t>✅ "Genere un resume de 2-3 phrases pour un DG de banque.</w:t>
+        <w:t>✅ "Genere un resume pour un DG de banque, avec implications strategiques"</w:t>
       </w:r>
     </w:p>
     <w:p>
       <w:pPr>
-        <w:spacing w:before="0" w:after="0"/>
-        <w:ind w:left="283"/>
-      </w:pPr>
-      <w:r>
-        <w:rPr>
-          <w:rFonts w:ascii="Consolas" w:hAnsi="Consolas"/>
-          <w:color w:val="051E5B"/>
-          <w:sz w:val="16"/>
-        </w:rPr>
-        <w:t xml:space="preserve">   L'objectif est d'identifier les implications strategiques,</w:t>
-      </w:r>
-    </w:p>
-    <w:p>
-      <w:pPr>
-        <w:spacing w:before="0" w:after="0"/>
-        <w:ind w:left="283"/>
-      </w:pPr>
-      <w:r>
-        <w:rPr>
-          <w:rFonts w:ascii="Consolas" w:hAnsi="Consolas"/>
-          <w:color w:val="051E5B"/>
-          <w:sz w:val="16"/>
-        </w:rPr>
-        <w:t xml:space="preserve">   pas juste de resumer les faits."</w:t>
-      </w:r>
-    </w:p>
-    <w:p>
-      <w:pPr>
-        <w:spacing w:before="200"/>
+        <w:spacing w:before="160"/>
       </w:pPr>
       <w:r>
         <w:rPr>
@@ -1858,82 +2368,12 @@
           <w:color w:val="2D3748"/>
           <w:sz w:val="20"/>
         </w:rPr>
-        <w:t>Tester chaque brique avant de passer a la suivante. Le cycle :</w:t>
+        <w:t>Tester chaque brique avant de passer a la suivante. Si erreur : coller le message dans Claude Code.</w:t>
       </w:r>
     </w:p>
     <w:p>
       <w:pPr>
-        <w:spacing w:before="0" w:after="0"/>
-        <w:ind w:left="283"/>
-      </w:pPr>
-      <w:r>
-        <w:rPr>
-          <w:rFonts w:ascii="Consolas" w:hAnsi="Consolas"/>
-          <w:color w:val="051E5B"/>
-          <w:sz w:val="16"/>
-        </w:rPr>
-        <w:t>1. Prompt → Claude genere le code</w:t>
-      </w:r>
-    </w:p>
-    <w:p>
-      <w:pPr>
-        <w:spacing w:before="0" w:after="0"/>
-        <w:ind w:left="283"/>
-      </w:pPr>
-      <w:r>
-        <w:rPr>
-          <w:rFonts w:ascii="Consolas" w:hAnsi="Consolas"/>
-          <w:color w:val="051E5B"/>
-          <w:sz w:val="16"/>
-        </w:rPr>
-        <w:t>2. Lancer → Observer le resultat</w:t>
-      </w:r>
-    </w:p>
-    <w:p>
-      <w:pPr>
-        <w:spacing w:before="0" w:after="0"/>
-        <w:ind w:left="283"/>
-      </w:pPr>
-      <w:r>
-        <w:rPr>
-          <w:rFonts w:ascii="Consolas" w:hAnsi="Consolas"/>
-          <w:color w:val="051E5B"/>
-          <w:sz w:val="16"/>
-        </w:rPr>
-        <w:t>3. Corriger → "Ca plante avec cette erreur: [coller l'erreur]"</w:t>
-      </w:r>
-    </w:p>
-    <w:p>
-      <w:pPr>
-        <w:spacing w:before="0" w:after="0"/>
-        <w:ind w:left="283"/>
-      </w:pPr>
-      <w:r>
-        <w:rPr>
-          <w:rFonts w:ascii="Consolas" w:hAnsi="Consolas"/>
-          <w:color w:val="051E5B"/>
-          <w:sz w:val="16"/>
-        </w:rPr>
-        <w:t>4. Ameliorer → "Le ton est trop neutre, rends-le plus assertif"</w:t>
-      </w:r>
-    </w:p>
-    <w:p>
-      <w:pPr>
-        <w:spacing w:before="0" w:after="0"/>
-        <w:ind w:left="283"/>
-      </w:pPr>
-      <w:r>
-        <w:rPr>
-          <w:rFonts w:ascii="Consolas" w:hAnsi="Consolas"/>
-          <w:color w:val="051E5B"/>
-          <w:sz w:val="16"/>
-        </w:rPr>
-        <w:t>5. Valider → Passer a la brique suivante</w:t>
-      </w:r>
-    </w:p>
-    <w:p>
-      <w:pPr>
-        <w:spacing w:before="200"/>
+        <w:spacing w:before="160"/>
       </w:pPr>
       <w:r>
         <w:rPr>
@@ -1954,63 +2394,7 @@
           <w:color w:val="2D3748"/>
           <w:sz w:val="20"/>
         </w:rPr>
-        <w:t>Un exemple vaut 1000 mots d'instructions :</w:t>
-      </w:r>
-    </w:p>
-    <w:p>
-      <w:pPr>
-        <w:spacing w:before="0" w:after="0"/>
-        <w:ind w:left="283"/>
-      </w:pPr>
-      <w:r>
-        <w:rPr>
-          <w:rFonts w:ascii="Consolas" w:hAnsi="Consolas"/>
-          <w:color w:val="051E5B"/>
-          <w:sz w:val="16"/>
-        </w:rPr>
-        <w:t>❌ "Ecris un editorial de qualite"</w:t>
-      </w:r>
-    </w:p>
-    <w:p>
-      <w:pPr>
-        <w:spacing w:before="0" w:after="0"/>
-        <w:ind w:left="283"/>
-      </w:pPr>
-      <w:r>
-        <w:rPr>
-          <w:rFonts w:ascii="Consolas" w:hAnsi="Consolas"/>
-          <w:color w:val="051E5B"/>
-          <w:sz w:val="16"/>
-        </w:rPr>
-        <w:t>✅ "Ecris un editorial dans ce style :</w:t>
-      </w:r>
-    </w:p>
-    <w:p>
-      <w:pPr>
-        <w:spacing w:before="0" w:after="0"/>
-        <w:ind w:left="283"/>
-      </w:pPr>
-      <w:r>
-        <w:rPr>
-          <w:rFonts w:ascii="Consolas" w:hAnsi="Consolas"/>
-          <w:color w:val="051E5B"/>
-          <w:sz w:val="16"/>
-        </w:rPr>
-        <w:t xml:space="preserve">   EXEMPLE BON: 'Trois signaux convergents cette semaine dessinent...'</w:t>
-      </w:r>
-    </w:p>
-    <w:p>
-      <w:pPr>
-        <w:spacing w:before="0" w:after="0"/>
-        <w:ind w:left="283"/>
-      </w:pPr>
-      <w:r>
-        <w:rPr>
-          <w:rFonts w:ascii="Consolas" w:hAnsi="Consolas"/>
-          <w:color w:val="051E5B"/>
-          <w:sz w:val="16"/>
-        </w:rPr>
-        <w:t xml:space="preserve">   EXEMPLE MAUVAIS: 'Ce mois a ete riche en actualites...'"</w:t>
+        <w:t>Un exemple vaut 1000 mots. Donner un BON et un MAUVAIS exemple dans le prompt.</w:t>
       </w:r>
     </w:p>
     <w:tbl>
@@ -2036,7 +2420,264 @@
                 <w:color w:val="059669"/>
                 <w:sz w:val="18"/>
               </w:rPr>
-              <w:t>💡 Garder l'historique de conversation : Claude Code retient le contexte. Pas besoin de tout re-expliquer a chaque prompt.</w:t>
+              <w:t>💡 Claude Code garde l'historique : pas besoin de tout re-expliquer a chaque prompt.</w:t>
+            </w:r>
+          </w:p>
+        </w:tc>
+      </w:tr>
+    </w:tbl>
+    <w:p>
+      <w:pPr>
+        <w:pStyle w:val="Heading2"/>
+      </w:pPr>
+      <w:r>
+        <w:t>Quand on ne sait pas par ou commencer</w:t>
+      </w:r>
+    </w:p>
+    <w:p>
+      <w:pPr>
+        <w:spacing w:after="80"/>
+      </w:pPr>
+      <w:r>
+        <w:rPr>
+          <w:rFonts w:ascii="Arial" w:hAnsi="Arial"/>
+          <w:color w:val="2D3748"/>
+          <w:sz w:val="20"/>
+        </w:rPr>
+        <w:t>Claude Code peut vous aider a structurer votre reflexion AVANT de coder. Exemples de prompts :</w:t>
+      </w:r>
+    </w:p>
+    <w:p>
+      <w:pPr>
+        <w:spacing w:before="0" w:after="0"/>
+        <w:ind w:left="283"/>
+      </w:pPr>
+      <w:r>
+        <w:rPr>
+          <w:rFonts w:ascii="Consolas" w:hAnsi="Consolas"/>
+          <w:color w:val="051E5B"/>
+          <w:sz w:val="16"/>
+        </w:rPr>
+        <w:t># Pour comprendre l'architecture :</w:t>
+      </w:r>
+    </w:p>
+    <w:p>
+      <w:pPr>
+        <w:spacing w:before="0" w:after="0"/>
+        <w:ind w:left="283"/>
+      </w:pPr>
+      <w:r>
+        <w:rPr>
+          <w:rFonts w:ascii="Consolas" w:hAnsi="Consolas"/>
+          <w:color w:val="051E5B"/>
+          <w:sz w:val="16"/>
+        </w:rPr>
+        <w:t>"Je veux creer une newsletter automatisee. Quelles sont les briques</w:t>
+      </w:r>
+    </w:p>
+    <w:p>
+      <w:pPr>
+        <w:spacing w:before="0" w:after="0"/>
+        <w:ind w:left="283"/>
+      </w:pPr>
+      <w:r>
+        <w:rPr>
+          <w:rFonts w:ascii="Consolas" w:hAnsi="Consolas"/>
+          <w:color w:val="051E5B"/>
+          <w:sz w:val="16"/>
+        </w:rPr>
+        <w:t xml:space="preserve"> techniques necessaires ? Propose-moi une architecture simple."</w:t>
+      </w:r>
+    </w:p>
+    <w:p>
+      <w:pPr>
+        <w:spacing w:before="0" w:after="0"/>
+        <w:ind w:left="283"/>
+      </w:pPr>
+      <w:r>
+        <w:rPr>
+          <w:rFonts w:ascii="Consolas" w:hAnsi="Consolas"/>
+          <w:color w:val="051E5B"/>
+          <w:sz w:val="16"/>
+        </w:rPr>
+      </w:r>
+    </w:p>
+    <w:p>
+      <w:pPr>
+        <w:spacing w:before="0" w:after="0"/>
+        <w:ind w:left="283"/>
+      </w:pPr>
+      <w:r>
+        <w:rPr>
+          <w:rFonts w:ascii="Consolas" w:hAnsi="Consolas"/>
+          <w:color w:val="051E5B"/>
+          <w:sz w:val="16"/>
+        </w:rPr>
+        <w:t># Pour decomposer une tache :</w:t>
+      </w:r>
+    </w:p>
+    <w:p>
+      <w:pPr>
+        <w:spacing w:before="0" w:after="0"/>
+        <w:ind w:left="283"/>
+      </w:pPr>
+      <w:r>
+        <w:rPr>
+          <w:rFonts w:ascii="Consolas" w:hAnsi="Consolas"/>
+          <w:color w:val="051E5B"/>
+          <w:sz w:val="16"/>
+        </w:rPr>
+        <w:t>"Je dois analyser des articles avec l'IA. Decompose cette tache en</w:t>
+      </w:r>
+    </w:p>
+    <w:p>
+      <w:pPr>
+        <w:spacing w:before="0" w:after="0"/>
+        <w:ind w:left="283"/>
+      </w:pPr>
+      <w:r>
+        <w:rPr>
+          <w:rFonts w:ascii="Consolas" w:hAnsi="Consolas"/>
+          <w:color w:val="051E5B"/>
+          <w:sz w:val="16"/>
+        </w:rPr>
+        <w:t xml:space="preserve"> etapes simples que je peux implementer une par une."</w:t>
+      </w:r>
+    </w:p>
+    <w:p>
+      <w:pPr>
+        <w:spacing w:before="0" w:after="0"/>
+        <w:ind w:left="283"/>
+      </w:pPr>
+      <w:r>
+        <w:rPr>
+          <w:rFonts w:ascii="Consolas" w:hAnsi="Consolas"/>
+          <w:color w:val="051E5B"/>
+          <w:sz w:val="16"/>
+        </w:rPr>
+      </w:r>
+    </w:p>
+    <w:p>
+      <w:pPr>
+        <w:spacing w:before="0" w:after="0"/>
+        <w:ind w:left="283"/>
+      </w:pPr>
+      <w:r>
+        <w:rPr>
+          <w:rFonts w:ascii="Consolas" w:hAnsi="Consolas"/>
+          <w:color w:val="051E5B"/>
+          <w:sz w:val="16"/>
+        </w:rPr>
+        <w:t># Pour choisir une approche :</w:t>
+      </w:r>
+    </w:p>
+    <w:p>
+      <w:pPr>
+        <w:spacing w:before="0" w:after="0"/>
+        <w:ind w:left="283"/>
+      </w:pPr>
+      <w:r>
+        <w:rPr>
+          <w:rFonts w:ascii="Consolas" w:hAnsi="Consolas"/>
+          <w:color w:val="051E5B"/>
+          <w:sz w:val="16"/>
+        </w:rPr>
+        <w:t>"Pour stocker mes sources RSS, vaut-il mieux un fichier YAML, JSON,</w:t>
+      </w:r>
+    </w:p>
+    <w:p>
+      <w:pPr>
+        <w:spacing w:before="0" w:after="0"/>
+        <w:ind w:left="283"/>
+      </w:pPr>
+      <w:r>
+        <w:rPr>
+          <w:rFonts w:ascii="Consolas" w:hAnsi="Consolas"/>
+          <w:color w:val="051E5B"/>
+          <w:sz w:val="16"/>
+        </w:rPr>
+        <w:t xml:space="preserve"> ou une base de donnees ? Compare les options pour mon cas."</w:t>
+      </w:r>
+    </w:p>
+    <w:p>
+      <w:pPr>
+        <w:spacing w:before="0" w:after="0"/>
+        <w:ind w:left="283"/>
+      </w:pPr>
+      <w:r>
+        <w:rPr>
+          <w:rFonts w:ascii="Consolas" w:hAnsi="Consolas"/>
+          <w:color w:val="051E5B"/>
+          <w:sz w:val="16"/>
+        </w:rPr>
+      </w:r>
+    </w:p>
+    <w:p>
+      <w:pPr>
+        <w:spacing w:before="0" w:after="0"/>
+        <w:ind w:left="283"/>
+      </w:pPr>
+      <w:r>
+        <w:rPr>
+          <w:rFonts w:ascii="Consolas" w:hAnsi="Consolas"/>
+          <w:color w:val="051E5B"/>
+          <w:sz w:val="16"/>
+        </w:rPr>
+        <w:t># Quand on est bloque :</w:t>
+      </w:r>
+    </w:p>
+    <w:p>
+      <w:pPr>
+        <w:spacing w:before="0" w:after="0"/>
+        <w:ind w:left="283"/>
+      </w:pPr>
+      <w:r>
+        <w:rPr>
+          <w:rFonts w:ascii="Consolas" w:hAnsi="Consolas"/>
+          <w:color w:val="051E5B"/>
+          <w:sz w:val="16"/>
+        </w:rPr>
+        <w:t>"Je ne comprends pas comment fonctionne feedparser. Montre-moi un</w:t>
+      </w:r>
+    </w:p>
+    <w:p>
+      <w:pPr>
+        <w:spacing w:before="0" w:after="0"/>
+        <w:ind w:left="283"/>
+      </w:pPr>
+      <w:r>
+        <w:rPr>
+          <w:rFonts w:ascii="Consolas" w:hAnsi="Consolas"/>
+          <w:color w:val="051E5B"/>
+          <w:sz w:val="16"/>
+        </w:rPr>
+        <w:t xml:space="preserve"> exemple minimal qui recupere les articles d'un flux RSS."</w:t>
+      </w:r>
+    </w:p>
+    <w:tbl>
+      <w:tblPr>
+        <w:tblStyle w:val="TableGrid"/>
+        <w:tblW w:type="auto" w:w="0"/>
+        <w:tblLook w:firstColumn="1" w:firstRow="1" w:lastColumn="0" w:lastRow="0" w:noHBand="0" w:noVBand="1" w:val="04A0"/>
+      </w:tblPr>
+      <w:tblGrid>
+        <w:gridCol w:w="9972"/>
+      </w:tblGrid>
+      <w:tr>
+        <w:tc>
+          <w:tcPr>
+            <w:tcW w:type="dxa" w:w="9972"/>
+            <w:shd w:fill="E3F2FD"/>
+          </w:tcPr>
+          <w:p>
+            <w:r/>
+            <w:r>
+              <w:rPr>
+                <w:rFonts w:ascii="Arial" w:hAnsi="Arial"/>
+                <w:color w:val="57AEE0"/>
+                <w:sz w:val="18"/>
+              </w:rPr>
+              <w:t>ℹ️ Claude Code est votre binome developpeur. N'hesitez pas a lui demander d'expliquer, de simplifier, ou de proposer des alternatives.</w:t>
             </w:r>
           </w:p>
         </w:tc>
@@ -2060,7 +2701,249 @@
         <w:pStyle w:val="Heading2"/>
       </w:pPr>
       <w:r>
-        <w:t>Prerequis : preparer l'environnement</w:t>
+        <w:t>Etape 0 : Installer les prerequis</w:t>
+      </w:r>
+    </w:p>
+    <w:p>
+      <w:pPr>
+        <w:jc w:val="center"/>
+      </w:pPr>
+      <w:r>
+        <w:rPr>
+          <w:rFonts w:ascii="Arial" w:hAnsi="Arial"/>
+          <w:b/>
+          <w:color w:val="051E5B"/>
+          <w:sz w:val="20"/>
+        </w:rPr>
+        <w:t>SCHEMA : Prerequis a installer</w:t>
+      </w:r>
+    </w:p>
+    <w:tbl>
+      <w:tblPr>
+        <w:tblW w:type="auto" w:w="0"/>
+        <w:jc w:val="center"/>
+        <w:tblLook w:firstColumn="1" w:firstRow="1" w:lastColumn="0" w:lastRow="0" w:noHBand="0" w:noVBand="1" w:val="04A0"/>
+      </w:tblPr>
+      <w:tblGrid>
+        <w:gridCol w:w="1108"/>
+        <w:gridCol w:w="1108"/>
+        <w:gridCol w:w="1108"/>
+        <w:gridCol w:w="1108"/>
+        <w:gridCol w:w="1108"/>
+        <w:gridCol w:w="1108"/>
+        <w:gridCol w:w="1108"/>
+        <w:gridCol w:w="1108"/>
+        <w:gridCol w:w="1108"/>
+      </w:tblGrid>
+      <w:tr>
+        <w:tc>
+          <w:tcPr>
+            <w:tcW w:type="dxa" w:w="1247"/>
+            <w:shd w:fill="051E3B"/>
+          </w:tcPr>
+          <w:p>
+            <w:pPr>
+              <w:spacing w:before="40" w:after="40"/>
+              <w:jc w:val="center"/>
+            </w:pPr>
+            <w:r/>
+            <w:r>
+              <w:rPr>
+                <w:rFonts w:ascii="Arial" w:hAnsi="Arial"/>
+                <w:b/>
+                <w:color w:val="FFFFFF"/>
+                <w:sz w:val="16"/>
+              </w:rPr>
+              <w:t>Python</w:t>
+            </w:r>
+          </w:p>
+        </w:tc>
+        <w:tc>
+          <w:tcPr>
+            <w:tcW w:type="dxa" w:w="567"/>
+          </w:tcPr>
+          <w:p>
+            <w:pPr>
+              <w:spacing w:before="40" w:after="40"/>
+              <w:jc w:val="center"/>
+            </w:pPr>
+            <w:r/>
+            <w:r>
+              <w:rPr>
+                <w:rFonts w:ascii="Arial" w:hAnsi="Arial"/>
+                <w:b/>
+                <w:color w:val="57AEE0"/>
+                <w:sz w:val="24"/>
+              </w:rPr>
+              <w:t xml:space="preserve">  →  </w:t>
+            </w:r>
+          </w:p>
+        </w:tc>
+        <w:tc>
+          <w:tcPr>
+            <w:tcW w:type="dxa" w:w="1247"/>
+            <w:shd w:fill="57AEE0"/>
+          </w:tcPr>
+          <w:p>
+            <w:pPr>
+              <w:spacing w:before="40" w:after="40"/>
+              <w:jc w:val="center"/>
+            </w:pPr>
+            <w:r/>
+            <w:r>
+              <w:rPr>
+                <w:rFonts w:ascii="Arial" w:hAnsi="Arial"/>
+                <w:b/>
+                <w:color w:val="FFFFFF"/>
+                <w:sz w:val="16"/>
+              </w:rPr>
+              <w:t>Git</w:t>
+            </w:r>
+          </w:p>
+        </w:tc>
+        <w:tc>
+          <w:tcPr>
+            <w:tcW w:type="dxa" w:w="567"/>
+          </w:tcPr>
+          <w:p>
+            <w:pPr>
+              <w:spacing w:before="40" w:after="40"/>
+              <w:jc w:val="center"/>
+            </w:pPr>
+            <w:r/>
+            <w:r>
+              <w:rPr>
+                <w:rFonts w:ascii="Arial" w:hAnsi="Arial"/>
+                <w:b/>
+                <w:color w:val="57AEE0"/>
+                <w:sz w:val="24"/>
+              </w:rPr>
+              <w:t xml:space="preserve">  →  </w:t>
+            </w:r>
+          </w:p>
+        </w:tc>
+        <w:tc>
+          <w:tcPr>
+            <w:tcW w:type="dxa" w:w="1247"/>
+            <w:shd w:fill="57AEE0"/>
+          </w:tcPr>
+          <w:p>
+            <w:pPr>
+              <w:spacing w:before="40" w:after="40"/>
+              <w:jc w:val="center"/>
+            </w:pPr>
+            <w:r/>
+            <w:r>
+              <w:rPr>
+                <w:rFonts w:ascii="Arial" w:hAnsi="Arial"/>
+                <w:b/>
+                <w:color w:val="FFFFFF"/>
+                <w:sz w:val="16"/>
+              </w:rPr>
+              <w:t>VS Code</w:t>
+            </w:r>
+          </w:p>
+        </w:tc>
+        <w:tc>
+          <w:tcPr>
+            <w:tcW w:type="dxa" w:w="567"/>
+          </w:tcPr>
+          <w:p>
+            <w:pPr>
+              <w:spacing w:before="40" w:after="40"/>
+              <w:jc w:val="center"/>
+            </w:pPr>
+            <w:r/>
+            <w:r>
+              <w:rPr>
+                <w:rFonts w:ascii="Arial" w:hAnsi="Arial"/>
+                <w:b/>
+                <w:color w:val="57AEE0"/>
+                <w:sz w:val="24"/>
+              </w:rPr>
+              <w:t xml:space="preserve">  →  </w:t>
+            </w:r>
+          </w:p>
+        </w:tc>
+        <w:tc>
+          <w:tcPr>
+            <w:tcW w:type="dxa" w:w="1247"/>
+            <w:shd w:fill="57AEE0"/>
+          </w:tcPr>
+          <w:p>
+            <w:pPr>
+              <w:spacing w:before="40" w:after="40"/>
+              <w:jc w:val="center"/>
+            </w:pPr>
+            <w:r/>
+            <w:r>
+              <w:rPr>
+                <w:rFonts w:ascii="Arial" w:hAnsi="Arial"/>
+                <w:b/>
+                <w:color w:val="FFFFFF"/>
+                <w:sz w:val="16"/>
+              </w:rPr>
+              <w:t>Claude Code</w:t>
+            </w:r>
+          </w:p>
+        </w:tc>
+        <w:tc>
+          <w:tcPr>
+            <w:tcW w:type="dxa" w:w="567"/>
+          </w:tcPr>
+          <w:p>
+            <w:pPr>
+              <w:spacing w:before="40" w:after="40"/>
+              <w:jc w:val="center"/>
+            </w:pPr>
+            <w:r/>
+            <w:r>
+              <w:rPr>
+                <w:rFonts w:ascii="Arial" w:hAnsi="Arial"/>
+                <w:b/>
+                <w:color w:val="57AEE0"/>
+                <w:sz w:val="24"/>
+              </w:rPr>
+              <w:t xml:space="preserve">  →  </w:t>
+            </w:r>
+          </w:p>
+        </w:tc>
+        <w:tc>
+          <w:tcPr>
+            <w:tcW w:type="dxa" w:w="1247"/>
+            <w:shd w:fill="051E3B"/>
+          </w:tcPr>
+          <w:p>
+            <w:pPr>
+              <w:spacing w:before="40" w:after="40"/>
+              <w:jc w:val="center"/>
+            </w:pPr>
+            <w:r/>
+            <w:r>
+              <w:rPr>
+                <w:rFonts w:ascii="Arial" w:hAnsi="Arial"/>
+                <w:b/>
+                <w:color w:val="FFFFFF"/>
+                <w:sz w:val="16"/>
+              </w:rPr>
+              <w:t>Cle API</w:t>
+            </w:r>
+          </w:p>
+        </w:tc>
+      </w:tr>
+    </w:tbl>
+    <w:p/>
+    <w:p>
+      <w:pPr>
+        <w:spacing w:before="200"/>
+      </w:pPr>
+      <w:r>
+        <w:rPr>
+          <w:b/>
+          <w:color w:val="051E5B"/>
+          <w:sz w:val="20"/>
+        </w:rPr>
+        <w:t>1. Installer Python</w:t>
       </w:r>
     </w:p>
     <w:p>
@@ -2073,17 +2956,7 @@
           <w:color w:val="2D3748"/>
           <w:sz w:val="20"/>
         </w:rPr>
-        <w:t>Avant de commencer, ouvrir un terminal PowerShell et executer :</w:t>
-      </w:r>
-    </w:p>
-    <w:p>
-      <w:r>
-        <w:rPr>
-          <w:b/>
-          <w:color w:val="051E5B"/>
-          <w:sz w:val="20"/>
-        </w:rPr>
-        <w:t>Commande 1 : Creer le dossier projet</w:t>
+        <w:t>Telecharger Python depuis le site officiel et l'installer :</w:t>
       </w:r>
     </w:p>
     <w:p>
@@ -2097,30 +2970,7 @@
           <w:color w:val="051E5B"/>
           <w:sz w:val="16"/>
         </w:rPr>
-        <w:t>mkdir C:\Projets\newsletter-agent &amp;&amp; cd C:\Projets\newsletter-agent</w:t>
-      </w:r>
-    </w:p>
-    <w:p>
-      <w:pPr>
-        <w:spacing w:after="80"/>
-      </w:pPr>
-      <w:r>
-        <w:rPr>
-          <w:rFonts w:ascii="Arial" w:hAnsi="Arial"/>
-          <w:color w:val="2D3748"/>
-          <w:sz w:val="20"/>
-        </w:rPr>
-        <w:t>→ Cree un dossier 'newsletter-agent' et s'y positionne.</w:t>
-      </w:r>
-    </w:p>
-    <w:p>
-      <w:r>
-        <w:rPr>
-          <w:b/>
-          <w:color w:val="051E5B"/>
-          <w:sz w:val="20"/>
-        </w:rPr>
-        <w:t>Commande 2 : Initialiser Git</w:t>
+        <w:t># Telechargement</w:t>
       </w:r>
     </w:p>
     <w:p>
@@ -2134,30 +2984,7 @@
           <w:color w:val="051E5B"/>
           <w:sz w:val="16"/>
         </w:rPr>
-        <w:t>git init</w:t>
-      </w:r>
-    </w:p>
-    <w:p>
-      <w:pPr>
-        <w:spacing w:after="80"/>
-      </w:pPr>
-      <w:r>
-        <w:rPr>
-          <w:rFonts w:ascii="Arial" w:hAnsi="Arial"/>
-          <w:color w:val="2D3748"/>
-          <w:sz w:val="20"/>
-        </w:rPr>
-        <w:t>→ Initialise un depot Git pour versionner le code.</w:t>
-      </w:r>
-    </w:p>
-    <w:p>
-      <w:r>
-        <w:rPr>
-          <w:b/>
-          <w:color w:val="051E5B"/>
-          <w:sz w:val="20"/>
-        </w:rPr>
-        <w:t>Commande 3 : Creer l'environnement Python</w:t>
+        <w:t>https://www.python.org/downloads/</w:t>
       </w:r>
     </w:p>
     <w:p>
@@ -2171,7 +2998,6 @@
           <w:color w:val="051E5B"/>
           <w:sz w:val="16"/>
         </w:rPr>
-        <w:t>python -m venv venv</w:t>
       </w:r>
     </w:p>
     <w:p>
@@ -2185,30 +3011,7 @@
           <w:color w:val="051E5B"/>
           <w:sz w:val="16"/>
         </w:rPr>
-        <w:t>.\venv\Scripts\Activate</w:t>
-      </w:r>
-    </w:p>
-    <w:p>
-      <w:pPr>
-        <w:spacing w:after="80"/>
-      </w:pPr>
-      <w:r>
-        <w:rPr>
-          <w:rFonts w:ascii="Arial" w:hAnsi="Arial"/>
-          <w:color w:val="2D3748"/>
-          <w:sz w:val="20"/>
-        </w:rPr>
-        <w:t>→ Cree un environnement virtuel isole et l'active.</w:t>
-      </w:r>
-    </w:p>
-    <w:p>
-      <w:r>
-        <w:rPr>
-          <w:b/>
-          <w:color w:val="051E5B"/>
-          <w:sz w:val="20"/>
-        </w:rPr>
-        <w:t>Commande 4 : Installer les dependances</w:t>
+        <w:t># IMPORTANT : Cocher 'Add Python to PATH' lors de l'installation</w:t>
       </w:r>
     </w:p>
     <w:p>
@@ -2222,30 +3025,6 @@
           <w:color w:val="051E5B"/>
           <w:sz w:val="16"/>
         </w:rPr>
-        <w:t>pip install anthropic feedparser pyyaml jinja2 python-dotenv rich</w:t>
-      </w:r>
-    </w:p>
-    <w:p>
-      <w:pPr>
-        <w:spacing w:after="80"/>
-      </w:pPr>
-      <w:r>
-        <w:rPr>
-          <w:rFonts w:ascii="Arial" w:hAnsi="Arial"/>
-          <w:color w:val="2D3748"/>
-          <w:sz w:val="20"/>
-        </w:rPr>
-        <w:t>→ Installe les librairies necessaires (API Claude, RSS, templates, etc.).</w:t>
-      </w:r>
-    </w:p>
-    <w:p>
-      <w:r>
-        <w:rPr>
-          <w:b/>
-          <w:color w:val="051E5B"/>
-          <w:sz w:val="20"/>
-        </w:rPr>
-        <w:t>Commande 5 : Configurer la cle API</w:t>
       </w:r>
     </w:p>
     <w:p>
@@ -2259,30 +3038,7 @@
           <w:color w:val="051E5B"/>
           <w:sz w:val="16"/>
         </w:rPr>
-        <w:t>echo ANTHROPIC_API_KEY=sk-ant-xxxxx &gt; .env</w:t>
-      </w:r>
-    </w:p>
-    <w:p>
-      <w:pPr>
-        <w:spacing w:after="80"/>
-      </w:pPr>
-      <w:r>
-        <w:rPr>
-          <w:rFonts w:ascii="Arial" w:hAnsi="Arial"/>
-          <w:color w:val="2D3748"/>
-          <w:sz w:val="20"/>
-        </w:rPr>
-        <w:t>→ Stocke la cle API Claude dans un fichier .env (ne pas commiter).</w:t>
-      </w:r>
-    </w:p>
-    <w:p>
-      <w:r>
-        <w:rPr>
-          <w:b/>
-          <w:color w:val="051E5B"/>
-          <w:sz w:val="20"/>
-        </w:rPr>
-        <w:t>Commande 6 : Lancer Claude Code</w:t>
+        <w:t># Verification dans PowerShell :</w:t>
       </w:r>
     </w:p>
     <w:p>
@@ -2296,20 +3052,212 @@
           <w:color w:val="051E5B"/>
           <w:sz w:val="16"/>
         </w:rPr>
-        <w:t>claude</w:t>
+        <w:t>python --version    # Doit afficher 'Python 3.11.x' ou superieur</w:t>
       </w:r>
     </w:p>
     <w:p>
       <w:pPr>
-        <w:spacing w:after="80"/>
+        <w:spacing w:before="160"/>
       </w:pPr>
       <w:r>
         <w:rPr>
-          <w:rFonts w:ascii="Arial" w:hAnsi="Arial"/>
-          <w:color w:val="2D3748"/>
+          <w:b/>
+          <w:color w:val="051E5B"/>
           <w:sz w:val="20"/>
         </w:rPr>
-        <w:t>→ Demarre Claude Code dans le dossier courant. Pret a coder !</w:t>
+        <w:t>2. Installer Git</w:t>
+      </w:r>
+    </w:p>
+    <w:p>
+      <w:pPr>
+        <w:spacing w:before="0" w:after="0"/>
+        <w:ind w:left="283"/>
+      </w:pPr>
+      <w:r>
+        <w:rPr>
+          <w:rFonts w:ascii="Consolas" w:hAnsi="Consolas"/>
+          <w:color w:val="051E5B"/>
+          <w:sz w:val="16"/>
+        </w:rPr>
+        <w:t># Telechargement</w:t>
+      </w:r>
+    </w:p>
+    <w:p>
+      <w:pPr>
+        <w:spacing w:before="0" w:after="0"/>
+        <w:ind w:left="283"/>
+      </w:pPr>
+      <w:r>
+        <w:rPr>
+          <w:rFonts w:ascii="Consolas" w:hAnsi="Consolas"/>
+          <w:color w:val="051E5B"/>
+          <w:sz w:val="16"/>
+        </w:rPr>
+        <w:t>https://git-scm.com/download/win</w:t>
+      </w:r>
+    </w:p>
+    <w:p>
+      <w:pPr>
+        <w:spacing w:before="0" w:after="0"/>
+        <w:ind w:left="283"/>
+      </w:pPr>
+      <w:r>
+        <w:rPr>
+          <w:rFonts w:ascii="Consolas" w:hAnsi="Consolas"/>
+          <w:color w:val="051E5B"/>
+          <w:sz w:val="16"/>
+        </w:rPr>
+      </w:r>
+    </w:p>
+    <w:p>
+      <w:pPr>
+        <w:spacing w:before="0" w:after="0"/>
+        <w:ind w:left="283"/>
+      </w:pPr>
+      <w:r>
+        <w:rPr>
+          <w:rFonts w:ascii="Consolas" w:hAnsi="Consolas"/>
+          <w:color w:val="051E5B"/>
+          <w:sz w:val="16"/>
+        </w:rPr>
+        <w:t># Verification :</w:t>
+      </w:r>
+    </w:p>
+    <w:p>
+      <w:pPr>
+        <w:spacing w:before="0" w:after="0"/>
+        <w:ind w:left="283"/>
+      </w:pPr>
+      <w:r>
+        <w:rPr>
+          <w:rFonts w:ascii="Consolas" w:hAnsi="Consolas"/>
+          <w:color w:val="051E5B"/>
+          <w:sz w:val="16"/>
+        </w:rPr>
+        <w:t>git --version       # Doit afficher 'git version 2.x.x'</w:t>
+      </w:r>
+    </w:p>
+    <w:p>
+      <w:pPr>
+        <w:spacing w:before="160"/>
+      </w:pPr>
+      <w:r>
+        <w:rPr>
+          <w:b/>
+          <w:color w:val="051E5B"/>
+          <w:sz w:val="20"/>
+        </w:rPr>
+        <w:t>3. Installer Claude Code</w:t>
+      </w:r>
+    </w:p>
+    <w:p>
+      <w:pPr>
+        <w:spacing w:before="0" w:after="0"/>
+        <w:ind w:left="283"/>
+      </w:pPr>
+      <w:r>
+        <w:rPr>
+          <w:rFonts w:ascii="Consolas" w:hAnsi="Consolas"/>
+          <w:color w:val="051E5B"/>
+          <w:sz w:val="16"/>
+        </w:rPr>
+        <w:t># Dans PowerShell (en administrateur) :</w:t>
+      </w:r>
+    </w:p>
+    <w:p>
+      <w:pPr>
+        <w:spacing w:before="0" w:after="0"/>
+        <w:ind w:left="283"/>
+      </w:pPr>
+      <w:r>
+        <w:rPr>
+          <w:rFonts w:ascii="Consolas" w:hAnsi="Consolas"/>
+          <w:color w:val="051E5B"/>
+          <w:sz w:val="16"/>
+        </w:rPr>
+        <w:t>npm install -g @anthropic-ai/claude-code</w:t>
+      </w:r>
+    </w:p>
+    <w:p>
+      <w:pPr>
+        <w:spacing w:before="0" w:after="0"/>
+        <w:ind w:left="283"/>
+      </w:pPr>
+      <w:r>
+        <w:rPr>
+          <w:rFonts w:ascii="Consolas" w:hAnsi="Consolas"/>
+          <w:color w:val="051E5B"/>
+          <w:sz w:val="16"/>
+        </w:rPr>
+      </w:r>
+    </w:p>
+    <w:p>
+      <w:pPr>
+        <w:spacing w:before="0" w:after="0"/>
+        <w:ind w:left="283"/>
+      </w:pPr>
+      <w:r>
+        <w:rPr>
+          <w:rFonts w:ascii="Consolas" w:hAnsi="Consolas"/>
+          <w:color w:val="051E5B"/>
+          <w:sz w:val="16"/>
+        </w:rPr>
+        <w:t># Si npm n'est pas installe, installer Node.js d'abord :</w:t>
+      </w:r>
+    </w:p>
+    <w:p>
+      <w:pPr>
+        <w:spacing w:before="0" w:after="0"/>
+        <w:ind w:left="283"/>
+      </w:pPr>
+      <w:r>
+        <w:rPr>
+          <w:rFonts w:ascii="Consolas" w:hAnsi="Consolas"/>
+          <w:color w:val="051E5B"/>
+          <w:sz w:val="16"/>
+        </w:rPr>
+        <w:t>https://nodejs.org/</w:t>
+      </w:r>
+    </w:p>
+    <w:p>
+      <w:pPr>
+        <w:spacing w:before="0" w:after="0"/>
+        <w:ind w:left="283"/>
+      </w:pPr>
+      <w:r>
+        <w:rPr>
+          <w:rFonts w:ascii="Consolas" w:hAnsi="Consolas"/>
+          <w:color w:val="051E5B"/>
+          <w:sz w:val="16"/>
+        </w:rPr>
+      </w:r>
+    </w:p>
+    <w:p>
+      <w:pPr>
+        <w:spacing w:before="0" w:after="0"/>
+        <w:ind w:left="283"/>
+      </w:pPr>
+      <w:r>
+        <w:rPr>
+          <w:rFonts w:ascii="Consolas" w:hAnsi="Consolas"/>
+          <w:color w:val="051E5B"/>
+          <w:sz w:val="16"/>
+        </w:rPr>
+        <w:t># Verification :</w:t>
+      </w:r>
+    </w:p>
+    <w:p>
+      <w:pPr>
+        <w:spacing w:before="0" w:after="0"/>
+        <w:ind w:left="283"/>
+      </w:pPr>
+      <w:r>
+        <w:rPr>
+          <w:rFonts w:ascii="Consolas" w:hAnsi="Consolas"/>
+          <w:color w:val="051E5B"/>
+          <w:sz w:val="16"/>
+        </w:rPr>
+        <w:t>claude --version</w:t>
       </w:r>
     </w:p>
     <w:p>
@@ -2325,7 +3273,458 @@
         <w:pStyle w:val="Heading2"/>
       </w:pPr>
       <w:r>
-        <w:t>Etape 1 : Le collecteur RSS (7 min)</w:t>
+        <w:t>Etape 1 : Preparer l'environnement projet</w:t>
+      </w:r>
+    </w:p>
+    <w:p>
+      <w:r>
+        <w:rPr>
+          <w:b/>
+          <w:color w:val="051E5B"/>
+        </w:rPr>
+        <w:t>Commandes PowerShell a executer :</w:t>
+      </w:r>
+    </w:p>
+    <w:tbl>
+      <w:tblPr>
+        <w:tblStyle w:val="TableGrid"/>
+        <w:tblW w:type="auto" w:w="0"/>
+        <w:jc w:val="center"/>
+        <w:tblLook w:firstColumn="1" w:firstRow="1" w:lastColumn="0" w:lastRow="0" w:noHBand="0" w:noVBand="1" w:val="04A0"/>
+      </w:tblPr>
+      <w:tblGrid>
+        <w:gridCol w:w="4986"/>
+        <w:gridCol w:w="4986"/>
+      </w:tblGrid>
+      <w:tr>
+        <w:tc>
+          <w:tcPr>
+            <w:tcW w:type="dxa" w:w="4535"/>
+            <w:shd w:fill="051E3B"/>
+          </w:tcPr>
+          <w:p>
+            <w:pPr>
+              <w:spacing w:before="40" w:after="40"/>
+            </w:pPr>
+            <w:r/>
+            <w:r>
+              <w:rPr>
+                <w:rFonts w:ascii="Arial" w:hAnsi="Arial"/>
+                <w:b/>
+                <w:color w:val="FFFFFF"/>
+                <w:sz w:val="18"/>
+              </w:rPr>
+              <w:t>Commande</w:t>
+            </w:r>
+          </w:p>
+        </w:tc>
+        <w:tc>
+          <w:tcPr>
+            <w:tcW w:type="dxa" w:w="4535"/>
+            <w:shd w:fill="051E3B"/>
+          </w:tcPr>
+          <w:p>
+            <w:pPr>
+              <w:spacing w:before="40" w:after="40"/>
+            </w:pPr>
+            <w:r/>
+            <w:r>
+              <w:rPr>
+                <w:rFonts w:ascii="Arial" w:hAnsi="Arial"/>
+                <w:b/>
+                <w:color w:val="FFFFFF"/>
+                <w:sz w:val="18"/>
+              </w:rPr>
+              <w:t>Explication</w:t>
+            </w:r>
+          </w:p>
+        </w:tc>
+      </w:tr>
+      <w:tr>
+        <w:tc>
+          <w:tcPr>
+            <w:tcW w:type="dxa" w:w="4535"/>
+          </w:tcPr>
+          <w:p>
+            <w:pPr>
+              <w:spacing w:before="40" w:after="40"/>
+            </w:pPr>
+            <w:r/>
+            <w:r>
+              <w:rPr>
+                <w:rFonts w:ascii="Arial" w:hAnsi="Arial"/>
+                <w:b w:val="0"/>
+                <w:color w:val="2D3748"/>
+                <w:sz w:val="18"/>
+              </w:rPr>
+              <w:t>mkdir C:\Projets\newsletter</w:t>
+            </w:r>
+          </w:p>
+        </w:tc>
+        <w:tc>
+          <w:tcPr>
+            <w:tcW w:type="dxa" w:w="4535"/>
+          </w:tcPr>
+          <w:p>
+            <w:pPr>
+              <w:spacing w:before="40" w:after="40"/>
+            </w:pPr>
+            <w:r/>
+            <w:r>
+              <w:rPr>
+                <w:rFonts w:ascii="Arial" w:hAnsi="Arial"/>
+                <w:b w:val="0"/>
+                <w:color w:val="2D3748"/>
+                <w:sz w:val="18"/>
+              </w:rPr>
+              <w:t>Cree le dossier du projet</w:t>
+            </w:r>
+          </w:p>
+        </w:tc>
+      </w:tr>
+      <w:tr>
+        <w:tc>
+          <w:tcPr>
+            <w:tcW w:type="dxa" w:w="4535"/>
+            <w:shd w:fill="F0F4F8"/>
+          </w:tcPr>
+          <w:p>
+            <w:pPr>
+              <w:spacing w:before="40" w:after="40"/>
+            </w:pPr>
+            <w:r/>
+            <w:r>
+              <w:rPr>
+                <w:rFonts w:ascii="Arial" w:hAnsi="Arial"/>
+                <w:b w:val="0"/>
+                <w:color w:val="2D3748"/>
+                <w:sz w:val="18"/>
+              </w:rPr>
+              <w:t>cd C:\Projets\newsletter</w:t>
+            </w:r>
+          </w:p>
+        </w:tc>
+        <w:tc>
+          <w:tcPr>
+            <w:tcW w:type="dxa" w:w="4535"/>
+            <w:shd w:fill="F0F4F8"/>
+          </w:tcPr>
+          <w:p>
+            <w:pPr>
+              <w:spacing w:before="40" w:after="40"/>
+            </w:pPr>
+            <w:r/>
+            <w:r>
+              <w:rPr>
+                <w:rFonts w:ascii="Arial" w:hAnsi="Arial"/>
+                <w:b w:val="0"/>
+                <w:color w:val="2D3748"/>
+                <w:sz w:val="18"/>
+              </w:rPr>
+              <w:t>Se positionne dans le dossier</w:t>
+            </w:r>
+          </w:p>
+        </w:tc>
+      </w:tr>
+      <w:tr>
+        <w:tc>
+          <w:tcPr>
+            <w:tcW w:type="dxa" w:w="4535"/>
+          </w:tcPr>
+          <w:p>
+            <w:pPr>
+              <w:spacing w:before="40" w:after="40"/>
+            </w:pPr>
+            <w:r/>
+            <w:r>
+              <w:rPr>
+                <w:rFonts w:ascii="Arial" w:hAnsi="Arial"/>
+                <w:b w:val="0"/>
+                <w:color w:val="2D3748"/>
+                <w:sz w:val="18"/>
+              </w:rPr>
+              <w:t>git init</w:t>
+            </w:r>
+          </w:p>
+        </w:tc>
+        <w:tc>
+          <w:tcPr>
+            <w:tcW w:type="dxa" w:w="4535"/>
+          </w:tcPr>
+          <w:p>
+            <w:pPr>
+              <w:spacing w:before="40" w:after="40"/>
+            </w:pPr>
+            <w:r/>
+            <w:r>
+              <w:rPr>
+                <w:rFonts w:ascii="Arial" w:hAnsi="Arial"/>
+                <w:b w:val="0"/>
+                <w:color w:val="2D3748"/>
+                <w:sz w:val="18"/>
+              </w:rPr>
+              <w:t>Initialise le versioning Git</w:t>
+            </w:r>
+          </w:p>
+        </w:tc>
+      </w:tr>
+      <w:tr>
+        <w:tc>
+          <w:tcPr>
+            <w:tcW w:type="dxa" w:w="4535"/>
+            <w:shd w:fill="F0F4F8"/>
+          </w:tcPr>
+          <w:p>
+            <w:pPr>
+              <w:spacing w:before="40" w:after="40"/>
+            </w:pPr>
+            <w:r/>
+            <w:r>
+              <w:rPr>
+                <w:rFonts w:ascii="Arial" w:hAnsi="Arial"/>
+                <w:b w:val="0"/>
+                <w:color w:val="2D3748"/>
+                <w:sz w:val="18"/>
+              </w:rPr>
+              <w:t>python -m venv venv</w:t>
+            </w:r>
+          </w:p>
+        </w:tc>
+        <w:tc>
+          <w:tcPr>
+            <w:tcW w:type="dxa" w:w="4535"/>
+            <w:shd w:fill="F0F4F8"/>
+          </w:tcPr>
+          <w:p>
+            <w:pPr>
+              <w:spacing w:before="40" w:after="40"/>
+            </w:pPr>
+            <w:r/>
+            <w:r>
+              <w:rPr>
+                <w:rFonts w:ascii="Arial" w:hAnsi="Arial"/>
+                <w:b w:val="0"/>
+                <w:color w:val="2D3748"/>
+                <w:sz w:val="18"/>
+              </w:rPr>
+              <w:t>Cree un environnement Python isole</w:t>
+            </w:r>
+          </w:p>
+        </w:tc>
+      </w:tr>
+      <w:tr>
+        <w:tc>
+          <w:tcPr>
+            <w:tcW w:type="dxa" w:w="4535"/>
+          </w:tcPr>
+          <w:p>
+            <w:pPr>
+              <w:spacing w:before="40" w:after="40"/>
+            </w:pPr>
+            <w:r/>
+            <w:r>
+              <w:rPr>
+                <w:rFonts w:ascii="Arial" w:hAnsi="Arial"/>
+                <w:b w:val="0"/>
+                <w:color w:val="2D3748"/>
+                <w:sz w:val="18"/>
+              </w:rPr>
+              <w:t>.\venv\Scripts\Activate</w:t>
+            </w:r>
+          </w:p>
+        </w:tc>
+        <w:tc>
+          <w:tcPr>
+            <w:tcW w:type="dxa" w:w="4535"/>
+          </w:tcPr>
+          <w:p>
+            <w:pPr>
+              <w:spacing w:before="40" w:after="40"/>
+            </w:pPr>
+            <w:r/>
+            <w:r>
+              <w:rPr>
+                <w:rFonts w:ascii="Arial" w:hAnsi="Arial"/>
+                <w:b w:val="0"/>
+                <w:color w:val="2D3748"/>
+                <w:sz w:val="18"/>
+              </w:rPr>
+              <w:t>Active l'environnement (prompt change)</w:t>
+            </w:r>
+          </w:p>
+        </w:tc>
+      </w:tr>
+      <w:tr>
+        <w:tc>
+          <w:tcPr>
+            <w:tcW w:type="dxa" w:w="4535"/>
+            <w:shd w:fill="F0F4F8"/>
+          </w:tcPr>
+          <w:p>
+            <w:pPr>
+              <w:spacing w:before="40" w:after="40"/>
+            </w:pPr>
+            <w:r/>
+            <w:r>
+              <w:rPr>
+                <w:rFonts w:ascii="Arial" w:hAnsi="Arial"/>
+                <w:b w:val="0"/>
+                <w:color w:val="2D3748"/>
+                <w:sz w:val="18"/>
+              </w:rPr>
+              <w:t>pip install anthropic feedparser pyyaml jinja2 rich python-dotenv</w:t>
+            </w:r>
+          </w:p>
+        </w:tc>
+        <w:tc>
+          <w:tcPr>
+            <w:tcW w:type="dxa" w:w="4535"/>
+            <w:shd w:fill="F0F4F8"/>
+          </w:tcPr>
+          <w:p>
+            <w:pPr>
+              <w:spacing w:before="40" w:after="40"/>
+            </w:pPr>
+            <w:r/>
+            <w:r>
+              <w:rPr>
+                <w:rFonts w:ascii="Arial" w:hAnsi="Arial"/>
+                <w:b w:val="0"/>
+                <w:color w:val="2D3748"/>
+                <w:sz w:val="18"/>
+              </w:rPr>
+              <w:t>Installe les librairies necessaires</w:t>
+            </w:r>
+          </w:p>
+        </w:tc>
+      </w:tr>
+      <w:tr>
+        <w:tc>
+          <w:tcPr>
+            <w:tcW w:type="dxa" w:w="4535"/>
+          </w:tcPr>
+          <w:p>
+            <w:pPr>
+              <w:spacing w:before="40" w:after="40"/>
+            </w:pPr>
+            <w:r/>
+            <w:r>
+              <w:rPr>
+                <w:rFonts w:ascii="Arial" w:hAnsi="Arial"/>
+                <w:b w:val="0"/>
+                <w:color w:val="2D3748"/>
+                <w:sz w:val="18"/>
+              </w:rPr>
+              <w:t>echo ANTHROPIC_API_KEY=sk-ant-xxx &gt; .env</w:t>
+            </w:r>
+          </w:p>
+        </w:tc>
+        <w:tc>
+          <w:tcPr>
+            <w:tcW w:type="dxa" w:w="4535"/>
+          </w:tcPr>
+          <w:p>
+            <w:pPr>
+              <w:spacing w:before="40" w:after="40"/>
+            </w:pPr>
+            <w:r/>
+            <w:r>
+              <w:rPr>
+                <w:rFonts w:ascii="Arial" w:hAnsi="Arial"/>
+                <w:b w:val="0"/>
+                <w:color w:val="2D3748"/>
+                <w:sz w:val="18"/>
+              </w:rPr>
+              <w:t>Stocke la cle API Claude (remplacer xxx)</w:t>
+            </w:r>
+          </w:p>
+        </w:tc>
+      </w:tr>
+      <w:tr>
+        <w:tc>
+          <w:tcPr>
+            <w:tcW w:type="dxa" w:w="4535"/>
+            <w:shd w:fill="F0F4F8"/>
+          </w:tcPr>
+          <w:p>
+            <w:pPr>
+              <w:spacing w:before="40" w:after="40"/>
+            </w:pPr>
+            <w:r/>
+            <w:r>
+              <w:rPr>
+                <w:rFonts w:ascii="Arial" w:hAnsi="Arial"/>
+                <w:b w:val="0"/>
+                <w:color w:val="2D3748"/>
+                <w:sz w:val="18"/>
+              </w:rPr>
+              <w:t>claude</w:t>
+            </w:r>
+          </w:p>
+        </w:tc>
+        <w:tc>
+          <w:tcPr>
+            <w:tcW w:type="dxa" w:w="4535"/>
+            <w:shd w:fill="F0F4F8"/>
+          </w:tcPr>
+          <w:p>
+            <w:pPr>
+              <w:spacing w:before="40" w:after="40"/>
+            </w:pPr>
+            <w:r/>
+            <w:r>
+              <w:rPr>
+                <w:rFonts w:ascii="Arial" w:hAnsi="Arial"/>
+                <w:b w:val="0"/>
+                <w:color w:val="2D3748"/>
+                <w:sz w:val="18"/>
+              </w:rPr>
+              <w:t>Lance Claude Code - pret a coder !</w:t>
+            </w:r>
+          </w:p>
+        </w:tc>
+      </w:tr>
+    </w:tbl>
+    <w:tbl>
+      <w:tblPr>
+        <w:tblStyle w:val="TableGrid"/>
+        <w:tblW w:type="auto" w:w="0"/>
+        <w:tblLook w:firstColumn="1" w:firstRow="1" w:lastColumn="0" w:lastRow="0" w:noHBand="0" w:noVBand="1" w:val="04A0"/>
+      </w:tblPr>
+      <w:tblGrid>
+        <w:gridCol w:w="9972"/>
+      </w:tblGrid>
+      <w:tr>
+        <w:tc>
+          <w:tcPr>
+            <w:tcW w:type="dxa" w:w="9972"/>
+            <w:shd w:fill="FFF3E0"/>
+          </w:tcPr>
+          <w:p>
+            <w:r/>
+            <w:r>
+              <w:rPr>
+                <w:rFonts w:ascii="Arial" w:hAnsi="Arial"/>
+                <w:color w:val="EA580C"/>
+                <w:sz w:val="18"/>
+              </w:rPr>
+              <w:t>⚠️ La cle API Claude s'obtient sur console.anthropic.com. Ne jamais la partager ou la commiter.</w:t>
+            </w:r>
+          </w:p>
+        </w:tc>
+      </w:tr>
+    </w:tbl>
+    <w:p>
+      <w:r>
+        <w:br w:type="page"/>
+      </w:r>
+    </w:p>
+    <w:p>
+      <w:pPr>
+        <w:pStyle w:val="Heading2"/>
+      </w:pPr>
+      <w:r>
+        <w:t>Etape 2 : Le collecteur RSS (7 min)</w:t>
       </w:r>
     </w:p>
     <w:p>
@@ -2436,7 +3835,7 @@
         <w:pStyle w:val="Heading2"/>
       </w:pPr>
       <w:r>
-        <w:t>Etape 2 : L'analyseur IA (7 min)</w:t>
+        <w:t>Etape 3 : L'analyseur IA (7 min)</w:t>
       </w:r>
     </w:p>
     <w:p>
@@ -2489,12 +3888,8 @@
               <w:br/>
               <w:t>- key_facts: liste de 2-3 faits cles actionnables</w:t>
               <w:br/>
-              <w:t>- title_fr: traduction du titre en francais si article anglais</w:t>
-              <w:br/>
               <w:br/>
               <w:t>Utilise le modele claude-sonnet-4-20250514.</w:t>
-              <w:br/>
-              <w:t>Traite les articles par batch de 5 pour optimiser les appels API.</w:t>
               <w:br/>
               <w:t>Le system prompt doit incarner un Senior Partner conseil en strategie bancaire.</w:t>
             </w:r>
@@ -2525,7 +3920,7 @@
         <w:pStyle w:val="Heading2"/>
       </w:pPr>
       <w:r>
-        <w:t>Etape 3 : Le curateur (7 min)</w:t>
+        <w:t>Etape 4 : Le curateur (7 min)</w:t>
       </w:r>
     </w:p>
     <w:p>
@@ -2576,16 +3971,7 @@
               <w:br/>
               <w:t>3. Diversite des categories (pas plus de 2 articles par categorie)</w:t>
               <w:br/>
-              <w:t>4. Filtre par theme du mois si specifie (mots-cles dans config/themes.yaml)</w:t>
-              <w:br/>
-              <w:br/>
-              <w:t>Le module doit :</w:t>
-              <w:br/>
-              <w:t>- Trier par score decroissant</w:t>
-              <w:br/>
-              <w:t>- Appliquer les filtres</w:t>
-              <w:br/>
-              <w:t>- Retourner un objet CuratedSelection avec top_articles et articles_by_category</w:t>
+              <w:t>4. Filtre par theme du mois si specifie</w:t>
             </w:r>
           </w:p>
         </w:tc>
@@ -2614,7 +4000,7 @@
         <w:pStyle w:val="Heading2"/>
       </w:pPr>
       <w:r>
-        <w:t>Etape 4 : Le redacteur (7 min)</w:t>
+        <w:t>Etape 5 : Le redacteur (7 min)</w:t>
       </w:r>
     </w:p>
     <w:p>
@@ -2657,29 +4043,16 @@
               <w:t>Cree un module writer.py avec une methode generate_editorial().</w:t>
               <w:br/>
               <w:br/>
-              <w:t>L'editorial doit :</w:t>
+              <w:t>L'editorial doit faire 450-550 mots, style Senior Partner McKinsey.</w:t>
               <w:br/>
-              <w:t>- Faire 450-550 mots, 4-5 paragraphes</w:t>
+              <w:t>Structure : These centrale → Preuves → So what → Conviction Ares &amp; Co</w:t>
               <w:br/>
-              <w:t>- Style Senior Partner McKinsey/BCG (assertif, structure)</w:t>
-              <w:br/>
-              <w:t>- Structure : These centrale → Preuves → So what → Conviction Ares &amp; Co</w:t>
+              <w:t>Terminer par : **Notre conviction : [phrase].**</w:t>
               <w:br/>
               <w:br/>
-              <w:t>Inclus ce system prompt pour Claude :</w:t>
+              <w:t>Ajoute aussi generate_terrain() pour un mini-cas anonymise :</w:t>
               <w:br/>
-              <w:t>"Tu es Senior Partner chez Ares &amp; Co avec 25 ans d'experience bancaire.</w:t>
-              <w:br/>
-              <w:t>Tu ecris pour des DG et CFO de banques francaises.</w:t>
-              <w:br/>
-              <w:t>Style : assertif, analytique, oriente decideur.</w:t>
-              <w:br/>
-              <w:t>Termine par une conviction en gras : **Notre conviction : [phrase].**"</w:t>
-              <w:br/>
-              <w:br/>
-              <w:t>Genere aussi une methode generate_terrain() pour creer un mini-cas anonymise</w:t>
-              <w:br/>
-              <w:t>avec structure : Titre → Probleme → Approche → Resultats.</w:t>
+              <w:t>Titre → Probleme → Approche → Resultats</w:t>
             </w:r>
           </w:p>
         </w:tc>
@@ -2708,7 +4081,7 @@
         <w:pStyle w:val="Heading2"/>
       </w:pPr>
       <w:r>
-        <w:t>Etape 5 : L'orchestrateur (7 min)</w:t>
+        <w:t>Etape 6 : L'orchestrateur (7 min)</w:t>
       </w:r>
     </w:p>
     <w:p>
@@ -2750,37 +4123,16 @@
               </w:rPr>
               <w:t>Cree agent.py qui orchestre tout le pipeline avec argparse :</w:t>
               <w:br/>
-              <w:t>- python agent.py --list-themes : affiche les themes disponibles</w:t>
+              <w:t>- python agent.py --list-themes</w:t>
               <w:br/>
-              <w:t>- python agent.py --theme growth_distribution : lance pour ce theme</w:t>
+              <w:t>- python agent.py --theme growth_distribution</w:t>
               <w:br/>
-              <w:t>- python agent.py --month "Mars 2026" : specifie le mois</w:t>
+              <w:t>- python agent.py --month "Mars 2026"</w:t>
               <w:br/>
               <w:br/>
-              <w:t>Le workflow :</w:t>
+              <w:t>Cree aussi templates/newsletter_v2.html avec header bleu marine (#051E3B),</w:t>
               <w:br/>
-              <w:t>1. Charger config (sources.yaml, themes.yaml)</w:t>
-              <w:br/>
-              <w:t>2. Collecter les articles (collector)</w:t>
-              <w:br/>
-              <w:t>3. Analyser avec Claude (analyzer)</w:t>
-              <w:br/>
-              <w:t>4. Selectionner les meilleurs (curator)</w:t>
-              <w:br/>
-              <w:t>5. Generer editorial + terrain (writer)</w:t>
-              <w:br/>
-              <w:t>6. Produire le HTML dans output/</w:t>
-              <w:br/>
-              <w:br/>
-              <w:t>Cree aussi un template Jinja2 templates/newsletter_v2.html avec :</w:t>
-              <w:br/>
-              <w:t>- Header gradient bleu marine (#051E3B)</w:t>
-              <w:br/>
-              <w:t>- Sections : Edito, Radar (6 articles), Terrain, CTA</w:t>
-              <w:br/>
-              <w:t>- Responsive mobile</w:t>
-              <w:br/>
-              <w:t>- Bouton "Partager par email" (mailto:)</w:t>
+              <w:t>sections Edito/Radar/Terrain/CTA, responsive mobile, bouton Partager.</w:t>
             </w:r>
           </w:p>
         </w:tc>
@@ -2804,35 +4156,6 @@
         <w:t>Claude genere agent.py + template HTML complet</w:t>
       </w:r>
     </w:p>
-    <w:tbl>
-      <w:tblPr>
-        <w:tblStyle w:val="TableGrid"/>
-        <w:tblW w:type="auto" w:w="0"/>
-        <w:tblLook w:firstColumn="1" w:firstRow="1" w:lastColumn="0" w:lastRow="0" w:noHBand="0" w:noVBand="1" w:val="04A0"/>
-      </w:tblPr>
-      <w:tblGrid>
-        <w:gridCol w:w="9972"/>
-      </w:tblGrid>
-      <w:tr>
-        <w:tc>
-          <w:tcPr>
-            <w:tcW w:type="dxa" w:w="9972"/>
-            <w:shd w:fill="FFF3E0"/>
-          </w:tcPr>
-          <w:p>
-            <w:r/>
-            <w:r>
-              <w:rPr>
-                <w:rFonts w:ascii="Arial" w:hAnsi="Arial"/>
-                <w:color w:val="EA580C"/>
-                <w:sz w:val="18"/>
-              </w:rPr>
-              <w:t>⚠️ Si une etape echoue : coller l'erreur complete dans Claude Code. Il corrigera automatiquement.</w:t>
-            </w:r>
-          </w:p>
-        </w:tc>
-      </w:tr>
-    </w:tbl>
     <w:p>
       <w:r>
         <w:br w:type="page"/>
@@ -2870,54 +4193,328 @@
     <w:p>
       <w:r>
         <w:rPr>
+          <w:rFonts w:ascii="Arial" w:hAnsi="Arial"/>
           <w:b/>
+          <w:color w:val="051E5B"/>
+          <w:sz w:val="20"/>
         </w:rPr>
-        <w:t>Etapes :</w:t>
+        <w:t>SCHEMA : Workflow de l'exercice</w:t>
+      </w:r>
+    </w:p>
+    <w:tbl>
+      <w:tblPr>
+        <w:tblW w:type="auto" w:w="0"/>
+        <w:jc w:val="left"/>
+        <w:tblLook w:firstColumn="1" w:firstRow="1" w:lastColumn="0" w:lastRow="0" w:noHBand="0" w:noVBand="1" w:val="04A0"/>
+      </w:tblPr>
+      <w:tblGrid>
+        <w:gridCol w:w="4986"/>
+        <w:gridCol w:w="4986"/>
+      </w:tblGrid>
+      <w:tr>
+        <w:tc>
+          <w:tcPr>
+            <w:tcW w:type="dxa" w:w="454"/>
+            <w:shd w:fill="57AEE0"/>
+          </w:tcPr>
+          <w:p>
+            <w:pPr>
+              <w:spacing w:before="40" w:after="40"/>
+              <w:jc w:val="center"/>
+            </w:pPr>
+            <w:r/>
+            <w:r>
+              <w:rPr>
+                <w:rFonts w:ascii="Arial" w:hAnsi="Arial"/>
+                <w:b/>
+                <w:color w:val="FFFFFF"/>
+                <w:sz w:val="20"/>
+              </w:rPr>
+              <w:t>1</w:t>
+            </w:r>
+          </w:p>
+        </w:tc>
+        <w:tc>
+          <w:tcPr>
+            <w:tcW w:type="dxa" w:w="7937"/>
+          </w:tcPr>
+          <w:p>
+            <w:r/>
+            <w:r>
+              <w:rPr>
+                <w:rFonts w:ascii="Arial" w:hAnsi="Arial"/>
+                <w:b/>
+                <w:color w:val="051E3B"/>
+                <w:sz w:val="18"/>
+              </w:rPr>
+              <w:t>Ouvrir src/writer.py</w:t>
+            </w:r>
+            <w:r>
+              <w:rPr>
+                <w:rFonts w:ascii="Arial" w:hAnsi="Arial"/>
+                <w:color w:val="718096"/>
+                <w:sz w:val="16"/>
+              </w:rPr>
+              <w:br/>
+              <w:t>Trouver la methode generate_editorial</w:t>
+            </w:r>
+          </w:p>
+        </w:tc>
+      </w:tr>
+    </w:tbl>
+    <w:p>
+      <w:pPr>
+        <w:spacing w:before="0" w:after="0"/>
+        <w:ind w:left="142"/>
+        <w:jc w:val="left"/>
+      </w:pPr>
+      <w:r>
+        <w:rPr>
+          <w:b/>
+          <w:color w:val="57AEE0"/>
+          <w:sz w:val="24"/>
+        </w:rPr>
+        <w:t>↓</w:t>
+      </w:r>
+    </w:p>
+    <w:tbl>
+      <w:tblPr>
+        <w:tblW w:type="auto" w:w="0"/>
+        <w:jc w:val="left"/>
+        <w:tblLook w:firstColumn="1" w:firstRow="1" w:lastColumn="0" w:lastRow="0" w:noHBand="0" w:noVBand="1" w:val="04A0"/>
+      </w:tblPr>
+      <w:tblGrid>
+        <w:gridCol w:w="4986"/>
+        <w:gridCol w:w="4986"/>
+      </w:tblGrid>
+      <w:tr>
+        <w:tc>
+          <w:tcPr>
+            <w:tcW w:type="dxa" w:w="454"/>
+            <w:shd w:fill="57AEE0"/>
+          </w:tcPr>
+          <w:p>
+            <w:pPr>
+              <w:spacing w:before="40" w:after="40"/>
+              <w:jc w:val="center"/>
+            </w:pPr>
+            <w:r/>
+            <w:r>
+              <w:rPr>
+                <w:rFonts w:ascii="Arial" w:hAnsi="Arial"/>
+                <w:b/>
+                <w:color w:val="FFFFFF"/>
+                <w:sz w:val="20"/>
+              </w:rPr>
+              <w:t>2</w:t>
+            </w:r>
+          </w:p>
+        </w:tc>
+        <w:tc>
+          <w:tcPr>
+            <w:tcW w:type="dxa" w:w="7937"/>
+          </w:tcPr>
+          <w:p>
+            <w:r/>
+            <w:r>
+              <w:rPr>
+                <w:rFonts w:ascii="Arial" w:hAnsi="Arial"/>
+                <w:b/>
+                <w:color w:val="051E3B"/>
+                <w:sz w:val="18"/>
+              </w:rPr>
+              <w:t>Demander a Claude Code</w:t>
+            </w:r>
+            <w:r>
+              <w:rPr>
+                <w:rFonts w:ascii="Arial" w:hAnsi="Arial"/>
+                <w:color w:val="718096"/>
+                <w:sz w:val="16"/>
+              </w:rPr>
+              <w:br/>
+              <w:t>Voir prompt ci-dessous</w:t>
+            </w:r>
+          </w:p>
+        </w:tc>
+      </w:tr>
+    </w:tbl>
+    <w:p>
+      <w:pPr>
+        <w:spacing w:before="0" w:after="0"/>
+        <w:ind w:left="142"/>
+        <w:jc w:val="left"/>
+      </w:pPr>
+      <w:r>
+        <w:rPr>
+          <w:b/>
+          <w:color w:val="57AEE0"/>
+          <w:sz w:val="24"/>
+        </w:rPr>
+        <w:t>↓</w:t>
+      </w:r>
+    </w:p>
+    <w:tbl>
+      <w:tblPr>
+        <w:tblW w:type="auto" w:w="0"/>
+        <w:jc w:val="left"/>
+        <w:tblLook w:firstColumn="1" w:firstRow="1" w:lastColumn="0" w:lastRow="0" w:noHBand="0" w:noVBand="1" w:val="04A0"/>
+      </w:tblPr>
+      <w:tblGrid>
+        <w:gridCol w:w="4986"/>
+        <w:gridCol w:w="4986"/>
+      </w:tblGrid>
+      <w:tr>
+        <w:tc>
+          <w:tcPr>
+            <w:tcW w:type="dxa" w:w="454"/>
+            <w:shd w:fill="57AEE0"/>
+          </w:tcPr>
+          <w:p>
+            <w:pPr>
+              <w:spacing w:before="40" w:after="40"/>
+              <w:jc w:val="center"/>
+            </w:pPr>
+            <w:r/>
+            <w:r>
+              <w:rPr>
+                <w:rFonts w:ascii="Arial" w:hAnsi="Arial"/>
+                <w:b/>
+                <w:color w:val="FFFFFF"/>
+                <w:sz w:val="20"/>
+              </w:rPr>
+              <w:t>3</w:t>
+            </w:r>
+          </w:p>
+        </w:tc>
+        <w:tc>
+          <w:tcPr>
+            <w:tcW w:type="dxa" w:w="7937"/>
+          </w:tcPr>
+          <w:p>
+            <w:r/>
+            <w:r>
+              <w:rPr>
+                <w:rFonts w:ascii="Arial" w:hAnsi="Arial"/>
+                <w:b/>
+                <w:color w:val="051E3B"/>
+                <w:sz w:val="18"/>
+              </w:rPr>
+              <w:t>Tester</w:t>
+            </w:r>
+            <w:r>
+              <w:rPr>
+                <w:rFonts w:ascii="Arial" w:hAnsi="Arial"/>
+                <w:color w:val="718096"/>
+                <w:sz w:val="16"/>
+              </w:rPr>
+              <w:br/>
+              <w:t>python agent.py --theme customer_experience</w:t>
+            </w:r>
+          </w:p>
+        </w:tc>
+      </w:tr>
+    </w:tbl>
+    <w:p>
+      <w:pPr>
+        <w:spacing w:before="0" w:after="0"/>
+        <w:ind w:left="142"/>
+        <w:jc w:val="left"/>
+      </w:pPr>
+      <w:r>
+        <w:rPr>
+          <w:b/>
+          <w:color w:val="57AEE0"/>
+          <w:sz w:val="24"/>
+        </w:rPr>
+        <w:t>↓</w:t>
+      </w:r>
+    </w:p>
+    <w:tbl>
+      <w:tblPr>
+        <w:tblW w:type="auto" w:w="0"/>
+        <w:jc w:val="left"/>
+        <w:tblLook w:firstColumn="1" w:firstRow="1" w:lastColumn="0" w:lastRow="0" w:noHBand="0" w:noVBand="1" w:val="04A0"/>
+      </w:tblPr>
+      <w:tblGrid>
+        <w:gridCol w:w="4986"/>
+        <w:gridCol w:w="4986"/>
+      </w:tblGrid>
+      <w:tr>
+        <w:tc>
+          <w:tcPr>
+            <w:tcW w:type="dxa" w:w="454"/>
+            <w:shd w:fill="57AEE0"/>
+          </w:tcPr>
+          <w:p>
+            <w:pPr>
+              <w:spacing w:before="40" w:after="40"/>
+              <w:jc w:val="center"/>
+            </w:pPr>
+            <w:r/>
+            <w:r>
+              <w:rPr>
+                <w:rFonts w:ascii="Arial" w:hAnsi="Arial"/>
+                <w:b/>
+                <w:color w:val="FFFFFF"/>
+                <w:sz w:val="20"/>
+              </w:rPr>
+              <w:t>4</w:t>
+            </w:r>
+          </w:p>
+        </w:tc>
+        <w:tc>
+          <w:tcPr>
+            <w:tcW w:type="dxa" w:w="7937"/>
+          </w:tcPr>
+          <w:p>
+            <w:r/>
+            <w:r>
+              <w:rPr>
+                <w:rFonts w:ascii="Arial" w:hAnsi="Arial"/>
+                <w:b/>
+                <w:color w:val="051E3B"/>
+                <w:sz w:val="18"/>
+              </w:rPr>
+              <w:t>Verifier le HTML</w:t>
+            </w:r>
+            <w:r>
+              <w:rPr>
+                <w:rFonts w:ascii="Arial" w:hAnsi="Arial"/>
+                <w:color w:val="718096"/>
+                <w:sz w:val="16"/>
+              </w:rPr>
+              <w:br/>
+              <w:t>Ouvrir output/newsletter-xxx.html</w:t>
+            </w:r>
+          </w:p>
+        </w:tc>
+      </w:tr>
+    </w:tbl>
+    <w:p>
+      <w:pPr>
+        <w:spacing w:before="0" w:after="0"/>
+        <w:ind w:left="283"/>
+      </w:pPr>
+      <w:r>
+        <w:rPr>
+          <w:rFonts w:ascii="Consolas" w:hAnsi="Consolas"/>
+          <w:color w:val="051E5B"/>
+          <w:sz w:val="16"/>
+        </w:rPr>
+        <w:t>Prompt a utiliser dans Claude Code :</w:t>
       </w:r>
     </w:p>
     <w:p>
       <w:pPr>
-        <w:pStyle w:val="ListBullet"/>
-        <w:spacing w:before="20" w:after="20"/>
-        <w:ind w:left="680"/>
+        <w:spacing w:before="0" w:after="0"/>
+        <w:ind w:left="283"/>
       </w:pPr>
       <w:r>
         <w:rPr>
-          <w:rFonts w:ascii="Arial" w:hAnsi="Arial"/>
-          <w:color w:val="2D3748"/>
-          <w:sz w:val="20"/>
+          <w:rFonts w:ascii="Consolas" w:hAnsi="Consolas"/>
+          <w:color w:val="051E5B"/>
+          <w:sz w:val="16"/>
         </w:rPr>
-        <w:t>Ouvrir src/writer.py</w:t>
-      </w:r>
-    </w:p>
-    <w:p>
-      <w:pPr>
-        <w:pStyle w:val="ListBullet"/>
-        <w:spacing w:before="20" w:after="20"/>
-        <w:ind w:left="680"/>
-      </w:pPr>
-      <w:r>
-        <w:rPr>
-          <w:rFonts w:ascii="Arial" w:hAnsi="Arial"/>
-          <w:color w:val="2D3748"/>
-          <w:sz w:val="20"/>
-        </w:rPr>
-        <w:t>Trouver le prompt editorial (methode generate_editorial)</w:t>
-      </w:r>
-    </w:p>
-    <w:p>
-      <w:pPr>
-        <w:pStyle w:val="ListBullet"/>
-        <w:spacing w:before="20" w:after="20"/>
-        <w:ind w:left="680"/>
-      </w:pPr>
-      <w:r>
-        <w:rPr>
-          <w:rFonts w:ascii="Arial" w:hAnsi="Arial"/>
-          <w:color w:val="2D3748"/>
-          <w:sz w:val="20"/>
-        </w:rPr>
-        <w:t>Demander a Claude Code :</w:t>
       </w:r>
     </w:p>
     <w:p>
@@ -2974,36 +4571,6 @@
           <w:sz w:val="16"/>
         </w:rPr>
         <w:t>- Terminer par une question ouverte au lieu d'une conviction"</w:t>
-      </w:r>
-    </w:p>
-    <w:p>
-      <w:pPr>
-        <w:pStyle w:val="ListBullet"/>
-        <w:spacing w:before="20" w:after="20"/>
-        <w:ind w:left="680"/>
-      </w:pPr>
-      <w:r>
-        <w:rPr>
-          <w:rFonts w:ascii="Arial" w:hAnsi="Arial"/>
-          <w:color w:val="2D3748"/>
-          <w:sz w:val="20"/>
-        </w:rPr>
-        <w:t>Tester avec : python agent.py --theme customer_experience</w:t>
-      </w:r>
-    </w:p>
-    <w:p>
-      <w:pPr>
-        <w:pStyle w:val="ListBullet"/>
-        <w:spacing w:before="20" w:after="20"/>
-        <w:ind w:left="680"/>
-      </w:pPr>
-      <w:r>
-        <w:rPr>
-          <w:rFonts w:ascii="Arial" w:hAnsi="Arial"/>
-          <w:color w:val="2D3748"/>
-          <w:sz w:val="20"/>
-        </w:rPr>
-        <w:t>Verifier le HTML genere dans output/</w:t>
       </w:r>
     </w:p>
     <w:p>
@@ -3114,7 +4681,7 @@
                 <w:color w:val="2D3748"/>
                 <w:sz w:val="18"/>
               </w:rPr>
-              <w:t>"Ajoute Le Monde Economie dans sources.yaml avec l'URL [...]"</w:t>
+              <w:t>"Ajoute Le Monde Economie dans sources.yaml"</w:t>
             </w:r>
           </w:p>
         </w:tc>
@@ -3158,7 +4725,7 @@
                 <w:color w:val="2D3748"/>
                 <w:sz w:val="18"/>
               </w:rPr>
-              <w:t>"Modifie newsletter_v2.html pour utiliser du vert #059669 au lieu du bleu"</w:t>
+              <w:t>"Utilise du vert #059669 au lieu du bleu dans le template"</w:t>
             </w:r>
           </w:p>
         </w:tc>
@@ -3200,7 +4767,7 @@
                 <w:color w:val="2D3748"/>
                 <w:sz w:val="18"/>
               </w:rPr>
-              <w:t>"Ajoute une section 'Chiffre de la semaine' entre Edito et Radar"</w:t>
+              <w:t>"Ajoute une section 'Chiffre de la semaine' apres l'Edito"</w:t>
             </w:r>
           </w:p>
         </w:tc>
@@ -3263,6 +4830,390 @@
         <w:t>Annexe A : Vue complete du produit</w:t>
       </w:r>
     </w:p>
+    <w:p>
+      <w:pPr>
+        <w:pStyle w:val="Heading2"/>
+      </w:pPr>
+      <w:r>
+        <w:t>Workflow mensuel de production</w:t>
+      </w:r>
+    </w:p>
+    <w:p>
+      <w:r>
+        <w:rPr>
+          <w:rFonts w:ascii="Arial" w:hAnsi="Arial"/>
+          <w:b/>
+          <w:color w:val="051E5B"/>
+          <w:sz w:val="20"/>
+        </w:rPr>
+        <w:t>SCHEMA : Cycle de production mensuel</w:t>
+      </w:r>
+    </w:p>
+    <w:tbl>
+      <w:tblPr>
+        <w:tblW w:type="auto" w:w="0"/>
+        <w:jc w:val="left"/>
+        <w:tblLook w:firstColumn="1" w:firstRow="1" w:lastColumn="0" w:lastRow="0" w:noHBand="0" w:noVBand="1" w:val="04A0"/>
+      </w:tblPr>
+      <w:tblGrid>
+        <w:gridCol w:w="4986"/>
+        <w:gridCol w:w="4986"/>
+      </w:tblGrid>
+      <w:tr>
+        <w:tc>
+          <w:tcPr>
+            <w:tcW w:type="dxa" w:w="454"/>
+            <w:shd w:fill="57AEE0"/>
+          </w:tcPr>
+          <w:p>
+            <w:pPr>
+              <w:spacing w:before="40" w:after="40"/>
+              <w:jc w:val="center"/>
+            </w:pPr>
+            <w:r/>
+            <w:r>
+              <w:rPr>
+                <w:rFonts w:ascii="Arial" w:hAnsi="Arial"/>
+                <w:b/>
+                <w:color w:val="FFFFFF"/>
+                <w:sz w:val="20"/>
+              </w:rPr>
+              <w:t>1</w:t>
+            </w:r>
+          </w:p>
+        </w:tc>
+        <w:tc>
+          <w:tcPr>
+            <w:tcW w:type="dxa" w:w="7937"/>
+          </w:tcPr>
+          <w:p>
+            <w:r/>
+            <w:r>
+              <w:rPr>
+                <w:rFonts w:ascii="Arial" w:hAnsi="Arial"/>
+                <w:b/>
+                <w:color w:val="051E3B"/>
+                <w:sz w:val="18"/>
+              </w:rPr>
+              <w:t>Choisir le theme du mois</w:t>
+            </w:r>
+            <w:r>
+              <w:rPr>
+                <w:rFonts w:ascii="Arial" w:hAnsi="Arial"/>
+                <w:color w:val="718096"/>
+                <w:sz w:val="16"/>
+              </w:rPr>
+              <w:br/>
+              <w:t>Dans config/themes.yaml ou via --theme</w:t>
+            </w:r>
+          </w:p>
+        </w:tc>
+      </w:tr>
+    </w:tbl>
+    <w:p>
+      <w:pPr>
+        <w:spacing w:before="0" w:after="0"/>
+        <w:ind w:left="142"/>
+        <w:jc w:val="left"/>
+      </w:pPr>
+      <w:r>
+        <w:rPr>
+          <w:b/>
+          <w:color w:val="57AEE0"/>
+          <w:sz w:val="24"/>
+        </w:rPr>
+        <w:t>↓</w:t>
+      </w:r>
+    </w:p>
+    <w:tbl>
+      <w:tblPr>
+        <w:tblW w:type="auto" w:w="0"/>
+        <w:jc w:val="left"/>
+        <w:tblLook w:firstColumn="1" w:firstRow="1" w:lastColumn="0" w:lastRow="0" w:noHBand="0" w:noVBand="1" w:val="04A0"/>
+      </w:tblPr>
+      <w:tblGrid>
+        <w:gridCol w:w="4986"/>
+        <w:gridCol w:w="4986"/>
+      </w:tblGrid>
+      <w:tr>
+        <w:tc>
+          <w:tcPr>
+            <w:tcW w:type="dxa" w:w="454"/>
+            <w:shd w:fill="57AEE0"/>
+          </w:tcPr>
+          <w:p>
+            <w:pPr>
+              <w:spacing w:before="40" w:after="40"/>
+              <w:jc w:val="center"/>
+            </w:pPr>
+            <w:r/>
+            <w:r>
+              <w:rPr>
+                <w:rFonts w:ascii="Arial" w:hAnsi="Arial"/>
+                <w:b/>
+                <w:color w:val="FFFFFF"/>
+                <w:sz w:val="20"/>
+              </w:rPr>
+              <w:t>2</w:t>
+            </w:r>
+          </w:p>
+        </w:tc>
+        <w:tc>
+          <w:tcPr>
+            <w:tcW w:type="dxa" w:w="7937"/>
+          </w:tcPr>
+          <w:p>
+            <w:r/>
+            <w:r>
+              <w:rPr>
+                <w:rFonts w:ascii="Arial" w:hAnsi="Arial"/>
+                <w:b/>
+                <w:color w:val="051E3B"/>
+                <w:sz w:val="18"/>
+              </w:rPr>
+              <w:t>Lancer la generation</w:t>
+            </w:r>
+            <w:r>
+              <w:rPr>
+                <w:rFonts w:ascii="Arial" w:hAnsi="Arial"/>
+                <w:color w:val="718096"/>
+                <w:sz w:val="16"/>
+              </w:rPr>
+              <w:br/>
+              <w:t>python agent.py --theme xxx --month 'Mars 2026'</w:t>
+            </w:r>
+          </w:p>
+        </w:tc>
+      </w:tr>
+    </w:tbl>
+    <w:p>
+      <w:pPr>
+        <w:spacing w:before="0" w:after="0"/>
+        <w:ind w:left="142"/>
+        <w:jc w:val="left"/>
+      </w:pPr>
+      <w:r>
+        <w:rPr>
+          <w:b/>
+          <w:color w:val="57AEE0"/>
+          <w:sz w:val="24"/>
+        </w:rPr>
+        <w:t>↓</w:t>
+      </w:r>
+    </w:p>
+    <w:tbl>
+      <w:tblPr>
+        <w:tblW w:type="auto" w:w="0"/>
+        <w:jc w:val="left"/>
+        <w:tblLook w:firstColumn="1" w:firstRow="1" w:lastColumn="0" w:lastRow="0" w:noHBand="0" w:noVBand="1" w:val="04A0"/>
+      </w:tblPr>
+      <w:tblGrid>
+        <w:gridCol w:w="4986"/>
+        <w:gridCol w:w="4986"/>
+      </w:tblGrid>
+      <w:tr>
+        <w:tc>
+          <w:tcPr>
+            <w:tcW w:type="dxa" w:w="454"/>
+            <w:shd w:fill="57AEE0"/>
+          </w:tcPr>
+          <w:p>
+            <w:pPr>
+              <w:spacing w:before="40" w:after="40"/>
+              <w:jc w:val="center"/>
+            </w:pPr>
+            <w:r/>
+            <w:r>
+              <w:rPr>
+                <w:rFonts w:ascii="Arial" w:hAnsi="Arial"/>
+                <w:b/>
+                <w:color w:val="FFFFFF"/>
+                <w:sz w:val="20"/>
+              </w:rPr>
+              <w:t>3</w:t>
+            </w:r>
+          </w:p>
+        </w:tc>
+        <w:tc>
+          <w:tcPr>
+            <w:tcW w:type="dxa" w:w="7937"/>
+          </w:tcPr>
+          <w:p>
+            <w:r/>
+            <w:r>
+              <w:rPr>
+                <w:rFonts w:ascii="Arial" w:hAnsi="Arial"/>
+                <w:b/>
+                <w:color w:val="051E3B"/>
+                <w:sz w:val="18"/>
+              </w:rPr>
+              <w:t>Relire le HTML genere</w:t>
+            </w:r>
+            <w:r>
+              <w:rPr>
+                <w:rFonts w:ascii="Arial" w:hAnsi="Arial"/>
+                <w:color w:val="718096"/>
+                <w:sz w:val="16"/>
+              </w:rPr>
+              <w:br/>
+              <w:t>Verifier editorial, articles, terrain</w:t>
+            </w:r>
+          </w:p>
+        </w:tc>
+      </w:tr>
+    </w:tbl>
+    <w:p>
+      <w:pPr>
+        <w:spacing w:before="0" w:after="0"/>
+        <w:ind w:left="142"/>
+        <w:jc w:val="left"/>
+      </w:pPr>
+      <w:r>
+        <w:rPr>
+          <w:b/>
+          <w:color w:val="57AEE0"/>
+          <w:sz w:val="24"/>
+        </w:rPr>
+        <w:t>↓</w:t>
+      </w:r>
+    </w:p>
+    <w:tbl>
+      <w:tblPr>
+        <w:tblW w:type="auto" w:w="0"/>
+        <w:jc w:val="left"/>
+        <w:tblLook w:firstColumn="1" w:firstRow="1" w:lastColumn="0" w:lastRow="0" w:noHBand="0" w:noVBand="1" w:val="04A0"/>
+      </w:tblPr>
+      <w:tblGrid>
+        <w:gridCol w:w="4986"/>
+        <w:gridCol w:w="4986"/>
+      </w:tblGrid>
+      <w:tr>
+        <w:tc>
+          <w:tcPr>
+            <w:tcW w:type="dxa" w:w="454"/>
+            <w:shd w:fill="57AEE0"/>
+          </w:tcPr>
+          <w:p>
+            <w:pPr>
+              <w:spacing w:before="40" w:after="40"/>
+              <w:jc w:val="center"/>
+            </w:pPr>
+            <w:r/>
+            <w:r>
+              <w:rPr>
+                <w:rFonts w:ascii="Arial" w:hAnsi="Arial"/>
+                <w:b/>
+                <w:color w:val="FFFFFF"/>
+                <w:sz w:val="20"/>
+              </w:rPr>
+              <w:t>4</w:t>
+            </w:r>
+          </w:p>
+        </w:tc>
+        <w:tc>
+          <w:tcPr>
+            <w:tcW w:type="dxa" w:w="7937"/>
+          </w:tcPr>
+          <w:p>
+            <w:r/>
+            <w:r>
+              <w:rPr>
+                <w:rFonts w:ascii="Arial" w:hAnsi="Arial"/>
+                <w:b/>
+                <w:color w:val="051E3B"/>
+                <w:sz w:val="18"/>
+              </w:rPr>
+              <w:t>Ajuster si necessaire</w:t>
+            </w:r>
+            <w:r>
+              <w:rPr>
+                <w:rFonts w:ascii="Arial" w:hAnsi="Arial"/>
+                <w:color w:val="718096"/>
+                <w:sz w:val="16"/>
+              </w:rPr>
+              <w:br/>
+              <w:t>Modifier sources, prompts, relancer</w:t>
+            </w:r>
+          </w:p>
+        </w:tc>
+      </w:tr>
+    </w:tbl>
+    <w:p>
+      <w:pPr>
+        <w:spacing w:before="0" w:after="0"/>
+        <w:ind w:left="142"/>
+        <w:jc w:val="left"/>
+      </w:pPr>
+      <w:r>
+        <w:rPr>
+          <w:b/>
+          <w:color w:val="57AEE0"/>
+          <w:sz w:val="24"/>
+        </w:rPr>
+        <w:t>↓</w:t>
+      </w:r>
+    </w:p>
+    <w:tbl>
+      <w:tblPr>
+        <w:tblW w:type="auto" w:w="0"/>
+        <w:jc w:val="left"/>
+        <w:tblLook w:firstColumn="1" w:firstRow="1" w:lastColumn="0" w:lastRow="0" w:noHBand="0" w:noVBand="1" w:val="04A0"/>
+      </w:tblPr>
+      <w:tblGrid>
+        <w:gridCol w:w="4986"/>
+        <w:gridCol w:w="4986"/>
+      </w:tblGrid>
+      <w:tr>
+        <w:tc>
+          <w:tcPr>
+            <w:tcW w:type="dxa" w:w="454"/>
+            <w:shd w:fill="57AEE0"/>
+          </w:tcPr>
+          <w:p>
+            <w:pPr>
+              <w:spacing w:before="40" w:after="40"/>
+              <w:jc w:val="center"/>
+            </w:pPr>
+            <w:r/>
+            <w:r>
+              <w:rPr>
+                <w:rFonts w:ascii="Arial" w:hAnsi="Arial"/>
+                <w:b/>
+                <w:color w:val="FFFFFF"/>
+                <w:sz w:val="20"/>
+              </w:rPr>
+              <w:t>5</w:t>
+            </w:r>
+          </w:p>
+        </w:tc>
+        <w:tc>
+          <w:tcPr>
+            <w:tcW w:type="dxa" w:w="7937"/>
+          </w:tcPr>
+          <w:p>
+            <w:r/>
+            <w:r>
+              <w:rPr>
+                <w:rFonts w:ascii="Arial" w:hAnsi="Arial"/>
+                <w:b/>
+                <w:color w:val="051E3B"/>
+                <w:sz w:val="18"/>
+              </w:rPr>
+              <w:t>Partager</w:t>
+            </w:r>
+            <w:r>
+              <w:rPr>
+                <w:rFonts w:ascii="Arial" w:hAnsi="Arial"/>
+                <w:color w:val="718096"/>
+                <w:sz w:val="16"/>
+              </w:rPr>
+              <w:br/>
+              <w:t>Bouton email integre ou export PDF</w:t>
+            </w:r>
+          </w:p>
+        </w:tc>
+      </w:tr>
+    </w:tbl>
     <w:p>
       <w:pPr>
         <w:pStyle w:val="Heading2"/>
@@ -3492,7 +5443,7 @@
           <w:color w:val="051E5B"/>
           <w:sz w:val="16"/>
         </w:rPr>
-        <w:t>└── requirements.txt       # Dependances Python</w:t>
+        <w:t>└── requirements.txt</w:t>
       </w:r>
     </w:p>
     <w:p>
@@ -3817,7 +5768,7 @@
         </w:tc>
         <w:tc>
           <w:tcPr>
-            <w:tcW w:type="dxa" w:w="4535"/>
+            <w:tcW w:type="dxa" w:w="3969"/>
             <w:shd w:fill="051E3B"/>
           </w:tcPr>
           <w:p>
@@ -3881,7 +5832,7 @@
         </w:tc>
         <w:tc>
           <w:tcPr>
-            <w:tcW w:type="dxa" w:w="4535"/>
+            <w:tcW w:type="dxa" w:w="3969"/>
           </w:tcPr>
           <w:p>
             <w:pPr>
@@ -3895,7 +5846,7 @@
                 <w:color w:val="2D3748"/>
                 <w:sz w:val="18"/>
               </w:rPr>
-              <w:t>agences, conquete, parts de marche, reseau</w:t>
+              <w:t>agences, conquete, parts de marche</w:t>
             </w:r>
           </w:p>
         </w:tc>
@@ -3944,7 +5895,7 @@
         </w:tc>
         <w:tc>
           <w:tcPr>
-            <w:tcW w:type="dxa" w:w="4535"/>
+            <w:tcW w:type="dxa" w:w="3969"/>
             <w:shd w:fill="F0F4F8"/>
           </w:tcPr>
           <w:p>
@@ -3959,7 +5910,7 @@
                 <w:color w:val="2D3748"/>
                 <w:sz w:val="18"/>
               </w:rPr>
-              <w:t>digital, parcours, NPS, omnicanal, app</w:t>
+              <w:t>digital, parcours, NPS, omnicanal</w:t>
             </w:r>
           </w:p>
         </w:tc>
@@ -4008,7 +5959,7 @@
         </w:tc>
         <w:tc>
           <w:tcPr>
-            <w:tcW w:type="dxa" w:w="4535"/>
+            <w:tcW w:type="dxa" w:w="3969"/>
           </w:tcPr>
           <w:p>
             <w:pPr>
@@ -4022,7 +5973,7 @@
                 <w:color w:val="2D3748"/>
                 <w:sz w:val="18"/>
               </w:rPr>
-              <w:t>couts, efficacite, automatisation, IA</w:t>
+              <w:t>couts, efficacite, automatisation</w:t>
             </w:r>
           </w:p>
         </w:tc>
@@ -4071,7 +6022,7 @@
         </w:tc>
         <w:tc>
           <w:tcPr>
-            <w:tcW w:type="dxa" w:w="4535"/>
+            <w:tcW w:type="dxa" w:w="3969"/>
             <w:shd w:fill="F0F4F8"/>
           </w:tcPr>
           <w:p>
@@ -4135,7 +6086,7 @@
         </w:tc>
         <w:tc>
           <w:tcPr>
-            <w:tcW w:type="dxa" w:w="4535"/>
+            <w:tcW w:type="dxa" w:w="3969"/>
           </w:tcPr>
           <w:p>
             <w:pPr>
@@ -4198,7 +6149,7 @@
         </w:tc>
         <w:tc>
           <w:tcPr>
-            <w:tcW w:type="dxa" w:w="4535"/>
+            <w:tcW w:type="dxa" w:w="3969"/>
             <w:shd w:fill="F0F4F8"/>
           </w:tcPr>
           <w:p>
@@ -4272,7 +6223,7 @@
           <w:color w:val="051E5B"/>
           <w:sz w:val="16"/>
         </w:rPr>
-        <w:t>Tu es un Senior Partner d'un cabinet de conseil en strategie de premier plan</w:t>
+        <w:t>Tu es un Senior Partner d'un cabinet de conseil en strategie (McKinsey, BCG),</w:t>
       </w:r>
     </w:p>
     <w:p>
@@ -4286,35 +6237,7 @@
           <w:color w:val="051E5B"/>
           <w:sz w:val="16"/>
         </w:rPr>
-        <w:t>(niveau McKinsey, BCG, Oliver Wyman), avec 25 ans d'experience dans le secteur</w:t>
-      </w:r>
-    </w:p>
-    <w:p>
-      <w:pPr>
-        <w:spacing w:before="0" w:after="0"/>
-        <w:ind w:left="283"/>
-      </w:pPr>
-      <w:r>
-        <w:rPr>
-          <w:rFonts w:ascii="Consolas" w:hAnsi="Consolas"/>
-          <w:color w:val="051E5B"/>
-          <w:sz w:val="16"/>
-        </w:rPr>
-        <w:t>bancaire. Tu as conseille BNP Paribas, Societe Generale, Credit Agricole, BPCE,</w:t>
-      </w:r>
-    </w:p>
-    <w:p>
-      <w:pPr>
-        <w:spacing w:before="0" w:after="0"/>
-        <w:ind w:left="283"/>
-      </w:pPr>
-      <w:r>
-        <w:rPr>
-          <w:rFonts w:ascii="Consolas" w:hAnsi="Consolas"/>
-          <w:color w:val="051E5B"/>
-          <w:sz w:val="16"/>
-        </w:rPr>
-        <w:t>Deutsche Bank, Santander, UBS, HSBC, JPMorgan, Goldman Sachs.</w:t>
+        <w:t>avec 25 ans d'experience bancaire. Tu as conseille BNP Paribas, SG, CASA, BPCE.</w:t>
       </w:r>
     </w:p>
     <w:p>
@@ -4341,7 +6264,7 @@
           <w:color w:val="051E5B"/>
           <w:sz w:val="16"/>
         </w:rPr>
-        <w:t>TON STYLE REDACTIONNEL :</w:t>
+        <w:t>STYLE : Analytique, concis, oriente decideur, assertif.</w:t>
       </w:r>
     </w:p>
     <w:p>
@@ -4355,7 +6278,7 @@
           <w:color w:val="051E5B"/>
           <w:sz w:val="16"/>
         </w:rPr>
-        <w:t>1. ANALYTIQUE ET STRUCTURE - Situation → Implications → Perspectives</w:t>
+        <w:t>STRUCTURE : Situation → Implications → Perspectives</w:t>
       </w:r>
     </w:p>
     <w:p>
@@ -4369,49 +6292,7 @@
           <w:color w:val="051E5B"/>
           <w:sz w:val="16"/>
         </w:rPr>
-        <w:t>2. CONCIS ET IMPACTANT - Phrases courtes, un message cle par paragraphe</w:t>
-      </w:r>
-    </w:p>
-    <w:p>
-      <w:pPr>
-        <w:spacing w:before="0" w:after="0"/>
-        <w:ind w:left="283"/>
-      </w:pPr>
-      <w:r>
-        <w:rPr>
-          <w:rFonts w:ascii="Consolas" w:hAnsi="Consolas"/>
-          <w:color w:val="051E5B"/>
-          <w:sz w:val="16"/>
-        </w:rPr>
-        <w:t>3. ORIENTE DECIDEUR - Toujours repondre au 'so what?'</w:t>
-      </w:r>
-    </w:p>
-    <w:p>
-      <w:pPr>
-        <w:spacing w:before="0" w:after="0"/>
-        <w:ind w:left="283"/>
-      </w:pPr>
-      <w:r>
-        <w:rPr>
-          <w:rFonts w:ascii="Consolas" w:hAnsi="Consolas"/>
-          <w:color w:val="051E5B"/>
-          <w:sz w:val="16"/>
-        </w:rPr>
-        <w:t>4. VISION MACRO - Relier aux tendances de fond, paralleles FR/EU/US</w:t>
-      </w:r>
-    </w:p>
-    <w:p>
-      <w:pPr>
-        <w:spacing w:before="0" w:after="0"/>
-        <w:ind w:left="283"/>
-      </w:pPr>
-      <w:r>
-        <w:rPr>
-          <w:rFonts w:ascii="Consolas" w:hAnsi="Consolas"/>
-          <w:color w:val="051E5B"/>
-          <w:sz w:val="16"/>
-        </w:rPr>
-        <w:t>5. TON ASSERTIF - Point de vue affirme, eviter les hedges</w:t>
+        <w:t>REGLE : Toujours repondre au 'so what?' pour un DG de banque.</w:t>
       </w:r>
     </w:p>
     <w:p>
@@ -4433,7 +6314,7 @@
           <w:color w:val="051E5B"/>
           <w:sz w:val="16"/>
         </w:rPr>
-        <w:t>STRUCTURE DE L'EDITORIAL (450-550 mots, 4-5 paragraphes) :</w:t>
+        <w:t>STRUCTURE (450-550 mots, 4-5 paragraphes) :</w:t>
       </w:r>
     </w:p>
     <w:p>
@@ -4460,7 +6341,7 @@
           <w:color w:val="051E5B"/>
           <w:sz w:val="16"/>
         </w:rPr>
-        <w:t>1. THESE CENTRALE - Ouvre avec une affirmation forte et differenciante</w:t>
+        <w:t>1. THESE CENTRALE - Affirmation forte : 'Ce mois confirme...', 'Une rupture...'</w:t>
       </w:r>
     </w:p>
     <w:p>
@@ -4474,7 +6355,135 @@
           <w:color w:val="051E5B"/>
           <w:sz w:val="16"/>
         </w:rPr>
-        <w:t xml:space="preserve">   'Ce mois confirme...', 'Une rupture se dessine...', 'Le marche envoie un signal clair...'</w:t>
+        <w:t>2. PREUVES (2 para) - Connexions entre actualites, chiffres, implications</w:t>
+      </w:r>
+    </w:p>
+    <w:p>
+      <w:pPr>
+        <w:spacing w:before="0" w:after="0"/>
+        <w:ind w:left="283"/>
+      </w:pPr>
+      <w:r>
+        <w:rPr>
+          <w:rFonts w:ascii="Consolas" w:hAnsi="Consolas"/>
+          <w:color w:val="051E5B"/>
+          <w:sz w:val="16"/>
+        </w:rPr>
+        <w:t>3. SO WHAT - Enjeux concrets pour un DG, questions strategiques</w:t>
+      </w:r>
+    </w:p>
+    <w:p>
+      <w:pPr>
+        <w:spacing w:before="0" w:after="0"/>
+        <w:ind w:left="283"/>
+      </w:pPr>
+      <w:r>
+        <w:rPr>
+          <w:rFonts w:ascii="Consolas" w:hAnsi="Consolas"/>
+          <w:color w:val="051E5B"/>
+          <w:sz w:val="16"/>
+        </w:rPr>
+        <w:t>4. CONVICTION - **Notre conviction : [affirmation tranchee].**</w:t>
+      </w:r>
+    </w:p>
+    <w:p>
+      <w:pPr>
+        <w:pStyle w:val="Heading2"/>
+      </w:pPr>
+      <w:r>
+        <w:t>Prompt 3 : Enrichissement connaissances</w:t>
+      </w:r>
+    </w:p>
+    <w:p>
+      <w:pPr>
+        <w:spacing w:before="0" w:after="0"/>
+        <w:ind w:left="283"/>
+      </w:pPr>
+      <w:r>
+        <w:rPr>
+          <w:rFonts w:ascii="Consolas" w:hAnsi="Consolas"/>
+          <w:color w:val="051E5B"/>
+          <w:sz w:val="16"/>
+        </w:rPr>
+        <w:t>ENRICHIS avec tes connaissances sectorielles :</w:t>
+      </w:r>
+    </w:p>
+    <w:p>
+      <w:pPr>
+        <w:spacing w:before="0" w:after="0"/>
+        <w:ind w:left="283"/>
+      </w:pPr>
+      <w:r>
+        <w:rPr>
+          <w:rFonts w:ascii="Consolas" w:hAnsi="Consolas"/>
+          <w:color w:val="051E5B"/>
+          <w:sz w:val="16"/>
+        </w:rPr>
+        <w:t>- CONTEXTE MACRO : Taux, reglementation (Bale IV, DSP3, DORA, MiCA)</w:t>
+      </w:r>
+    </w:p>
+    <w:p>
+      <w:pPr>
+        <w:spacing w:before="0" w:after="0"/>
+        <w:ind w:left="283"/>
+      </w:pPr>
+      <w:r>
+        <w:rPr>
+          <w:rFonts w:ascii="Consolas" w:hAnsi="Consolas"/>
+          <w:color w:val="051E5B"/>
+          <w:sz w:val="16"/>
+        </w:rPr>
+        <w:t>- BENCHMARKS : Banques US, UK, nordiques - best practices</w:t>
+      </w:r>
+    </w:p>
+    <w:p>
+      <w:pPr>
+        <w:spacing w:before="0" w:after="0"/>
+        <w:ind w:left="283"/>
+      </w:pPr>
+      <w:r>
+        <w:rPr>
+          <w:rFonts w:ascii="Consolas" w:hAnsi="Consolas"/>
+          <w:color w:val="051E5B"/>
+          <w:sz w:val="16"/>
+        </w:rPr>
+        <w:t>- FRAMEWORKS : Open banking, BaaS, economie de plateforme</w:t>
+      </w:r>
+    </w:p>
+    <w:p>
+      <w:pPr>
+        <w:spacing w:before="0" w:after="0"/>
+        <w:ind w:left="283"/>
+      </w:pPr>
+      <w:r>
+        <w:rPr>
+          <w:rFonts w:ascii="Consolas" w:hAnsi="Consolas"/>
+          <w:color w:val="051E5B"/>
+          <w:sz w:val="16"/>
+        </w:rPr>
+        <w:t>- DONNEES : ROE sectoriels, cost-to-income, tendances M&amp;A</w:t>
+      </w:r>
+    </w:p>
+    <w:p>
+      <w:pPr>
+        <w:pStyle w:val="Heading2"/>
+      </w:pPr>
+      <w:r>
+        <w:t>Prompt 4 : Mini-cas Terrain</w:t>
+      </w:r>
+    </w:p>
+    <w:p>
+      <w:pPr>
+        <w:spacing w:before="0" w:after="0"/>
+        <w:ind w:left="283"/>
+      </w:pPr>
+      <w:r>
+        <w:rPr>
+          <w:rFonts w:ascii="Consolas" w:hAnsi="Consolas"/>
+          <w:color w:val="051E5B"/>
+          <w:sz w:val="16"/>
+        </w:rPr>
+        <w:t>Genere un mini-cas anonymise (max 150 mots) :</w:t>
       </w:r>
     </w:p>
     <w:p>
@@ -4501,7 +6510,7 @@
           <w:color w:val="051E5B"/>
           <w:sz w:val="16"/>
         </w:rPr>
-        <w:t>2. PREUVES ET SIGNAUX (2 para) - Developpe 2-3 dynamiques, fais des CONNEXIONS</w:t>
+        <w:t>TITRE: [Ex: 'Optimisation reseau agences banque regionale']</w:t>
       </w:r>
     </w:p>
     <w:p>
@@ -4515,7 +6524,7 @@
           <w:color w:val="051E5B"/>
           <w:sz w:val="16"/>
         </w:rPr>
-        <w:t xml:space="preserve">   entre les actualites, quantifie, montre les implications de second ordre</w:t>
+        <w:t>PROBLEME: [2-3 phrases - contexte, enjeux, chiffres]</w:t>
       </w:r>
     </w:p>
     <w:p>
@@ -4529,394 +6538,7 @@
           <w:color w:val="051E5B"/>
           <w:sz w:val="16"/>
         </w:rPr>
-      </w:r>
-    </w:p>
-    <w:p>
-      <w:pPr>
-        <w:spacing w:before="0" w:after="0"/>
-        <w:ind w:left="283"/>
-      </w:pPr>
-      <w:r>
-        <w:rPr>
-          <w:rFonts w:ascii="Consolas" w:hAnsi="Consolas"/>
-          <w:color w:val="051E5B"/>
-          <w:sz w:val="16"/>
-        </w:rPr>
-        <w:t>3. SO WHAT - Traduis en enjeux concrets pour un DG de banque</w:t>
-      </w:r>
-    </w:p>
-    <w:p>
-      <w:pPr>
-        <w:spacing w:before="0" w:after="0"/>
-        <w:ind w:left="283"/>
-      </w:pPr>
-      <w:r>
-        <w:rPr>
-          <w:rFonts w:ascii="Consolas" w:hAnsi="Consolas"/>
-          <w:color w:val="051E5B"/>
-          <w:sz w:val="16"/>
-        </w:rPr>
-        <w:t xml:space="preserve">   Quelles questions strategiques ? Quels arbitrages ?</w:t>
-      </w:r>
-    </w:p>
-    <w:p>
-      <w:pPr>
-        <w:spacing w:before="0" w:after="0"/>
-        <w:ind w:left="283"/>
-      </w:pPr>
-      <w:r>
-        <w:rPr>
-          <w:rFonts w:ascii="Consolas" w:hAnsi="Consolas"/>
-          <w:color w:val="051E5B"/>
-          <w:sz w:val="16"/>
-        </w:rPr>
-      </w:r>
-    </w:p>
-    <w:p>
-      <w:pPr>
-        <w:spacing w:before="0" w:after="0"/>
-        <w:ind w:left="283"/>
-      </w:pPr>
-      <w:r>
-        <w:rPr>
-          <w:rFonts w:ascii="Consolas" w:hAnsi="Consolas"/>
-          <w:color w:val="051E5B"/>
-          <w:sz w:val="16"/>
-        </w:rPr>
-        <w:t>4. CONVICTION ARES &amp; CO - Une phrase finale en gras, memorable</w:t>
-      </w:r>
-    </w:p>
-    <w:p>
-      <w:pPr>
-        <w:spacing w:before="0" w:after="0"/>
-        <w:ind w:left="283"/>
-      </w:pPr>
-      <w:r>
-        <w:rPr>
-          <w:rFonts w:ascii="Consolas" w:hAnsi="Consolas"/>
-          <w:color w:val="051E5B"/>
-          <w:sz w:val="16"/>
-        </w:rPr>
-        <w:t xml:space="preserve">   Format : **Notre conviction : [affirmation tranchee].**</w:t>
-      </w:r>
-    </w:p>
-    <w:p>
-      <w:pPr>
-        <w:pStyle w:val="Heading2"/>
-      </w:pPr>
-      <w:r>
-        <w:t>Prompt 3 : Enrichissement avec connaissances Claude</w:t>
-      </w:r>
-    </w:p>
-    <w:p>
-      <w:pPr>
-        <w:spacing w:before="0" w:after="0"/>
-        <w:ind w:left="283"/>
-      </w:pPr>
-      <w:r>
-        <w:rPr>
-          <w:rFonts w:ascii="Consolas" w:hAnsi="Consolas"/>
-          <w:color w:val="051E5B"/>
-          <w:sz w:val="16"/>
-        </w:rPr>
-        <w:t>IMPORTANT : Ne te limite PAS aux actualites ci-dessus. ENRICHIS avec :</w:t>
-      </w:r>
-    </w:p>
-    <w:p>
-      <w:pPr>
-        <w:spacing w:before="0" w:after="0"/>
-        <w:ind w:left="283"/>
-      </w:pPr>
-      <w:r>
-        <w:rPr>
-          <w:rFonts w:ascii="Consolas" w:hAnsi="Consolas"/>
-          <w:color w:val="051E5B"/>
-          <w:sz w:val="16"/>
-        </w:rPr>
-      </w:r>
-    </w:p>
-    <w:p>
-      <w:pPr>
-        <w:spacing w:before="0" w:after="0"/>
-        <w:ind w:left="283"/>
-      </w:pPr>
-      <w:r>
-        <w:rPr>
-          <w:rFonts w:ascii="Consolas" w:hAnsi="Consolas"/>
-          <w:color w:val="051E5B"/>
-          <w:sz w:val="16"/>
-        </w:rPr>
-        <w:t>1. CONTEXTE MACRO : Taux d'interet, pression reglementaire (Bale IV, DSP3,</w:t>
-      </w:r>
-    </w:p>
-    <w:p>
-      <w:pPr>
-        <w:spacing w:before="0" w:after="0"/>
-        <w:ind w:left="283"/>
-      </w:pPr>
-      <w:r>
-        <w:rPr>
-          <w:rFonts w:ascii="Consolas" w:hAnsi="Consolas"/>
-          <w:color w:val="051E5B"/>
-          <w:sz w:val="16"/>
-        </w:rPr>
-        <w:t xml:space="preserve">   DORA, MiCA), transformation digitale, consolidation europeenne</w:t>
-      </w:r>
-    </w:p>
-    <w:p>
-      <w:pPr>
-        <w:spacing w:before="0" w:after="0"/>
-        <w:ind w:left="283"/>
-      </w:pPr>
-      <w:r>
-        <w:rPr>
-          <w:rFonts w:ascii="Consolas" w:hAnsi="Consolas"/>
-          <w:color w:val="051E5B"/>
-          <w:sz w:val="16"/>
-        </w:rPr>
-      </w:r>
-    </w:p>
-    <w:p>
-      <w:pPr>
-        <w:spacing w:before="0" w:after="0"/>
-        <w:ind w:left="283"/>
-      </w:pPr>
-      <w:r>
-        <w:rPr>
-          <w:rFonts w:ascii="Consolas" w:hAnsi="Consolas"/>
-          <w:color w:val="051E5B"/>
-          <w:sz w:val="16"/>
-        </w:rPr>
-        <w:t>2. BENCHMARKS INTERNATIONAUX : Compare avec banques US, UK, nordiques,</w:t>
-      </w:r>
-    </w:p>
-    <w:p>
-      <w:pPr>
-        <w:spacing w:before="0" w:after="0"/>
-        <w:ind w:left="283"/>
-      </w:pPr>
-      <w:r>
-        <w:rPr>
-          <w:rFonts w:ascii="Consolas" w:hAnsi="Consolas"/>
-          <w:color w:val="051E5B"/>
-          <w:sz w:val="16"/>
-        </w:rPr>
-        <w:t xml:space="preserve">   asiatiques. Best practices et innovations observees a l'etranger.</w:t>
-      </w:r>
-    </w:p>
-    <w:p>
-      <w:pPr>
-        <w:spacing w:before="0" w:after="0"/>
-        <w:ind w:left="283"/>
-      </w:pPr>
-      <w:r>
-        <w:rPr>
-          <w:rFonts w:ascii="Consolas" w:hAnsi="Consolas"/>
-          <w:color w:val="051E5B"/>
-          <w:sz w:val="16"/>
-        </w:rPr>
-      </w:r>
-    </w:p>
-    <w:p>
-      <w:pPr>
-        <w:spacing w:before="0" w:after="0"/>
-        <w:ind w:left="283"/>
-      </w:pPr>
-      <w:r>
-        <w:rPr>
-          <w:rFonts w:ascii="Consolas" w:hAnsi="Consolas"/>
-          <w:color w:val="051E5B"/>
-          <w:sz w:val="16"/>
-        </w:rPr>
-        <w:t>3. CADRES STRATEGIQUES : Economie de plateforme, Open banking, BaaS,</w:t>
-      </w:r>
-    </w:p>
-    <w:p>
-      <w:pPr>
-        <w:spacing w:before="0" w:after="0"/>
-        <w:ind w:left="283"/>
-      </w:pPr>
-      <w:r>
-        <w:rPr>
-          <w:rFonts w:ascii="Consolas" w:hAnsi="Consolas"/>
-          <w:color w:val="051E5B"/>
-          <w:sz w:val="16"/>
-        </w:rPr>
-        <w:t xml:space="preserve">   courbe d'adoption technologique, theorie des jeux concurrentiels</w:t>
-      </w:r>
-    </w:p>
-    <w:p>
-      <w:pPr>
-        <w:spacing w:before="0" w:after="0"/>
-        <w:ind w:left="283"/>
-      </w:pPr>
-      <w:r>
-        <w:rPr>
-          <w:rFonts w:ascii="Consolas" w:hAnsi="Consolas"/>
-          <w:color w:val="051E5B"/>
-          <w:sz w:val="16"/>
-        </w:rPr>
-      </w:r>
-    </w:p>
-    <w:p>
-      <w:pPr>
-        <w:spacing w:before="0" w:after="0"/>
-        <w:ind w:left="283"/>
-      </w:pPr>
-      <w:r>
-        <w:rPr>
-          <w:rFonts w:ascii="Consolas" w:hAnsi="Consolas"/>
-          <w:color w:val="051E5B"/>
-          <w:sz w:val="16"/>
-        </w:rPr>
-        <w:t>4. DONNEES DE REFERENCE : Tailles de marche, ROE sectoriels,</w:t>
-      </w:r>
-    </w:p>
-    <w:p>
-      <w:pPr>
-        <w:spacing w:before="0" w:after="0"/>
-        <w:ind w:left="283"/>
-      </w:pPr>
-      <w:r>
-        <w:rPr>
-          <w:rFonts w:ascii="Consolas" w:hAnsi="Consolas"/>
-          <w:color w:val="051E5B"/>
-          <w:sz w:val="16"/>
-        </w:rPr>
-        <w:t xml:space="preserve">   cost-to-income, tendances IT spend et M&amp;A</w:t>
-      </w:r>
-    </w:p>
-    <w:p>
-      <w:pPr>
-        <w:pStyle w:val="Heading2"/>
-      </w:pPr>
-      <w:r>
-        <w:t>Prompt 4 : Generation mini-cas Terrain</w:t>
-      </w:r>
-    </w:p>
-    <w:p>
-      <w:pPr>
-        <w:spacing w:before="0" w:after="0"/>
-        <w:ind w:left="283"/>
-      </w:pPr>
-      <w:r>
-        <w:rPr>
-          <w:rFonts w:ascii="Consolas" w:hAnsi="Consolas"/>
-          <w:color w:val="051E5B"/>
-          <w:sz w:val="16"/>
-        </w:rPr>
-        <w:t>Genere un mini-cas 'TERRAIN ARES &amp; CO' anonymise et realiste.</w:t>
-      </w:r>
-    </w:p>
-    <w:p>
-      <w:pPr>
-        <w:spacing w:before="0" w:after="0"/>
-        <w:ind w:left="283"/>
-      </w:pPr>
-      <w:r>
-        <w:rPr>
-          <w:rFonts w:ascii="Consolas" w:hAnsi="Consolas"/>
-          <w:color w:val="051E5B"/>
-          <w:sz w:val="16"/>
-        </w:rPr>
-      </w:r>
-    </w:p>
-    <w:p>
-      <w:pPr>
-        <w:spacing w:before="0" w:after="0"/>
-        <w:ind w:left="283"/>
-      </w:pPr>
-      <w:r>
-        <w:rPr>
-          <w:rFonts w:ascii="Consolas" w:hAnsi="Consolas"/>
-          <w:color w:val="051E5B"/>
-          <w:sz w:val="16"/>
-        </w:rPr>
-        <w:t>STRUCTURE STRICTE :</w:t>
-      </w:r>
-    </w:p>
-    <w:p>
-      <w:pPr>
-        <w:spacing w:before="0" w:after="0"/>
-        <w:ind w:left="283"/>
-      </w:pPr>
-      <w:r>
-        <w:rPr>
-          <w:rFonts w:ascii="Consolas" w:hAnsi="Consolas"/>
-          <w:color w:val="051E5B"/>
-          <w:sz w:val="16"/>
-        </w:rPr>
-        <w:t>TITRE: [Ex: 'Optimisation du reseau d'agences d'une banque regionale']</w:t>
-      </w:r>
-    </w:p>
-    <w:p>
-      <w:pPr>
-        <w:spacing w:before="0" w:after="0"/>
-        <w:ind w:left="283"/>
-      </w:pPr>
-      <w:r>
-        <w:rPr>
-          <w:rFonts w:ascii="Consolas" w:hAnsi="Consolas"/>
-          <w:color w:val="051E5B"/>
-          <w:sz w:val="16"/>
-        </w:rPr>
-        <w:t>---</w:t>
-      </w:r>
-    </w:p>
-    <w:p>
-      <w:pPr>
-        <w:spacing w:before="0" w:after="0"/>
-        <w:ind w:left="283"/>
-      </w:pPr>
-      <w:r>
-        <w:rPr>
-          <w:rFonts w:ascii="Consolas" w:hAnsi="Consolas"/>
-          <w:color w:val="051E5B"/>
-          <w:sz w:val="16"/>
-        </w:rPr>
-        <w:t>PROBLEME: [2-3 phrases - contexte, enjeux, chiffres cles]</w:t>
-      </w:r>
-    </w:p>
-    <w:p>
-      <w:pPr>
-        <w:spacing w:before="0" w:after="0"/>
-        <w:ind w:left="283"/>
-      </w:pPr>
-      <w:r>
-        <w:rPr>
-          <w:rFonts w:ascii="Consolas" w:hAnsi="Consolas"/>
-          <w:color w:val="051E5B"/>
-          <w:sz w:val="16"/>
-        </w:rPr>
-        <w:t>---</w:t>
-      </w:r>
-    </w:p>
-    <w:p>
-      <w:pPr>
-        <w:spacing w:before="0" w:after="0"/>
-        <w:ind w:left="283"/>
-      </w:pPr>
-      <w:r>
-        <w:rPr>
-          <w:rFonts w:ascii="Consolas" w:hAnsi="Consolas"/>
-          <w:color w:val="051E5B"/>
-          <w:sz w:val="16"/>
-        </w:rPr>
-        <w:t>APPROCHE: [2-3 phrases - methodologie Ares &amp; Co, phases, outils]</w:t>
-      </w:r>
-    </w:p>
-    <w:p>
-      <w:pPr>
-        <w:spacing w:before="0" w:after="0"/>
-        <w:ind w:left="283"/>
-      </w:pPr>
-      <w:r>
-        <w:rPr>
-          <w:rFonts w:ascii="Consolas" w:hAnsi="Consolas"/>
-          <w:color w:val="051E5B"/>
-          <w:sz w:val="16"/>
-        </w:rPr>
-        <w:t>---</w:t>
+        <w:t>APPROCHE: [2-3 phrases - methodologie, phases]</w:t>
       </w:r>
     </w:p>
     <w:p>
@@ -4934,47 +6556,6 @@
       </w:r>
     </w:p>
     <w:p>
-      <w:pPr>
-        <w:spacing w:before="0" w:after="0"/>
-        <w:ind w:left="283"/>
-      </w:pPr>
-      <w:r>
-        <w:rPr>
-          <w:rFonts w:ascii="Consolas" w:hAnsi="Consolas"/>
-          <w:color w:val="051E5B"/>
-          <w:sz w:val="16"/>
-        </w:rPr>
-      </w:r>
-    </w:p>
-    <w:p>
-      <w:pPr>
-        <w:spacing w:before="0" w:after="0"/>
-        <w:ind w:left="283"/>
-      </w:pPr>
-      <w:r>
-        <w:rPr>
-          <w:rFonts w:ascii="Consolas" w:hAnsi="Consolas"/>
-          <w:color w:val="051E5B"/>
-          <w:sz w:val="16"/>
-        </w:rPr>
-        <w:t>REGLES : Client anonymise, chiffres credibles et precis,</w:t>
-      </w:r>
-    </w:p>
-    <w:p>
-      <w:pPr>
-        <w:spacing w:before="0" w:after="0"/>
-        <w:ind w:left="283"/>
-      </w:pPr>
-      <w:r>
-        <w:rPr>
-          <w:rFonts w:ascii="Consolas" w:hAnsi="Consolas"/>
-          <w:color w:val="051E5B"/>
-          <w:sz w:val="16"/>
-        </w:rPr>
-        <w:t>ton factuel, lien evident avec le theme du mois, max 150 mots total.</w:t>
-      </w:r>
-    </w:p>
-    <w:p>
       <w:r>
         <w:br w:type="page"/>
       </w:r>
@@ -4984,7 +6565,15 @@
         <w:pStyle w:val="Heading1"/>
       </w:pPr>
       <w:r>
-        <w:t>Annexe C : Commandes PowerShell</w:t>
+        <w:t>Annexe C : Aide-memoire commandes</w:t>
+      </w:r>
+    </w:p>
+    <w:p>
+      <w:pPr>
+        <w:pStyle w:val="Heading2"/>
+      </w:pPr>
+      <w:r>
+        <w:t>Commandes PowerShell</w:t>
       </w:r>
     </w:p>
     <w:tbl>
@@ -5037,7 +6626,7 @@
                 <w:color w:val="FFFFFF"/>
                 <w:sz w:val="18"/>
               </w:rPr>
-              <w:t>Description</w:t>
+              <w:t>Explication</w:t>
             </w:r>
           </w:p>
         </w:tc>
@@ -5102,7 +6691,7 @@
                 <w:color w:val="2D3748"/>
                 <w:sz w:val="18"/>
               </w:rPr>
-              <w:t>git init</w:t>
+              <w:t>python --version</w:t>
             </w:r>
           </w:p>
         </w:tc>
@@ -5123,179 +6712,7 @@
                 <w:color w:val="2D3748"/>
                 <w:sz w:val="18"/>
               </w:rPr>
-              <w:t>Initialise un depot Git versionne</w:t>
-            </w:r>
-          </w:p>
-        </w:tc>
-      </w:tr>
-      <w:tr>
-        <w:tc>
-          <w:tcPr>
-            <w:tcW w:type="dxa" w:w="3402"/>
-          </w:tcPr>
-          <w:p>
-            <w:pPr>
-              <w:spacing w:before="40" w:after="40"/>
-            </w:pPr>
-            <w:r/>
-            <w:r>
-              <w:rPr>
-                <w:rFonts w:ascii="Arial" w:hAnsi="Arial"/>
-                <w:b w:val="0"/>
-                <w:color w:val="2D3748"/>
-                <w:sz w:val="18"/>
-              </w:rPr>
-              <w:t>git add .</w:t>
-            </w:r>
-          </w:p>
-        </w:tc>
-        <w:tc>
-          <w:tcPr>
-            <w:tcW w:type="dxa" w:w="5669"/>
-          </w:tcPr>
-          <w:p>
-            <w:pPr>
-              <w:spacing w:before="40" w:after="40"/>
-            </w:pPr>
-            <w:r/>
-            <w:r>
-              <w:rPr>
-                <w:rFonts w:ascii="Arial" w:hAnsi="Arial"/>
-                <w:b w:val="0"/>
-                <w:color w:val="2D3748"/>
-                <w:sz w:val="18"/>
-              </w:rPr>
-              <w:t>Ajoute tous les fichiers modifies au staging</w:t>
-            </w:r>
-          </w:p>
-        </w:tc>
-      </w:tr>
-      <w:tr>
-        <w:tc>
-          <w:tcPr>
-            <w:tcW w:type="dxa" w:w="3402"/>
-            <w:shd w:fill="F0F4F8"/>
-          </w:tcPr>
-          <w:p>
-            <w:pPr>
-              <w:spacing w:before="40" w:after="40"/>
-            </w:pPr>
-            <w:r/>
-            <w:r>
-              <w:rPr>
-                <w:rFonts w:ascii="Arial" w:hAnsi="Arial"/>
-                <w:b w:val="0"/>
-                <w:color w:val="2D3748"/>
-                <w:sz w:val="18"/>
-              </w:rPr>
-              <w:t>git commit -m "message"</w:t>
-            </w:r>
-          </w:p>
-        </w:tc>
-        <w:tc>
-          <w:tcPr>
-            <w:tcW w:type="dxa" w:w="5669"/>
-            <w:shd w:fill="F0F4F8"/>
-          </w:tcPr>
-          <w:p>
-            <w:pPr>
-              <w:spacing w:before="40" w:after="40"/>
-            </w:pPr>
-            <w:r/>
-            <w:r>
-              <w:rPr>
-                <w:rFonts w:ascii="Arial" w:hAnsi="Arial"/>
-                <w:b w:val="0"/>
-                <w:color w:val="2D3748"/>
-                <w:sz w:val="18"/>
-              </w:rPr>
-              <w:t>Cree un commit avec le message</w:t>
-            </w:r>
-          </w:p>
-        </w:tc>
-      </w:tr>
-      <w:tr>
-        <w:tc>
-          <w:tcPr>
-            <w:tcW w:type="dxa" w:w="3402"/>
-          </w:tcPr>
-          <w:p>
-            <w:pPr>
-              <w:spacing w:before="40" w:after="40"/>
-            </w:pPr>
-            <w:r/>
-            <w:r>
-              <w:rPr>
-                <w:rFonts w:ascii="Arial" w:hAnsi="Arial"/>
-                <w:b w:val="0"/>
-                <w:color w:val="2D3748"/>
-                <w:sz w:val="18"/>
-              </w:rPr>
-              <w:t>git push origin main</w:t>
-            </w:r>
-          </w:p>
-        </w:tc>
-        <w:tc>
-          <w:tcPr>
-            <w:tcW w:type="dxa" w:w="5669"/>
-          </w:tcPr>
-          <w:p>
-            <w:pPr>
-              <w:spacing w:before="40" w:after="40"/>
-            </w:pPr>
-            <w:r/>
-            <w:r>
-              <w:rPr>
-                <w:rFonts w:ascii="Arial" w:hAnsi="Arial"/>
-                <w:b w:val="0"/>
-                <w:color w:val="2D3748"/>
-                <w:sz w:val="18"/>
-              </w:rPr>
-              <w:t>Envoie les commits vers GitHub</w:t>
-            </w:r>
-          </w:p>
-        </w:tc>
-      </w:tr>
-      <w:tr>
-        <w:tc>
-          <w:tcPr>
-            <w:tcW w:type="dxa" w:w="3402"/>
-            <w:shd w:fill="F0F4F8"/>
-          </w:tcPr>
-          <w:p>
-            <w:pPr>
-              <w:spacing w:before="40" w:after="40"/>
-            </w:pPr>
-            <w:r/>
-            <w:r>
-              <w:rPr>
-                <w:rFonts w:ascii="Arial" w:hAnsi="Arial"/>
-                <w:b w:val="0"/>
-                <w:color w:val="2D3748"/>
-                <w:sz w:val="18"/>
-              </w:rPr>
-              <w:t>git pull origin main</w:t>
-            </w:r>
-          </w:p>
-        </w:tc>
-        <w:tc>
-          <w:tcPr>
-            <w:tcW w:type="dxa" w:w="5669"/>
-            <w:shd w:fill="F0F4F8"/>
-          </w:tcPr>
-          <w:p>
-            <w:pPr>
-              <w:spacing w:before="40" w:after="40"/>
-            </w:pPr>
-            <w:r/>
-            <w:r>
-              <w:rPr>
-                <w:rFonts w:ascii="Arial" w:hAnsi="Arial"/>
-                <w:b w:val="0"/>
-                <w:color w:val="2D3748"/>
-                <w:sz w:val="18"/>
-              </w:rPr>
-              <w:t>Recupere les commits depuis GitHub</w:t>
+              <w:t>Verifie que Python est installe</w:t>
             </w:r>
           </w:p>
         </w:tc>
@@ -5467,7 +6884,7 @@
                 <w:color w:val="2D3748"/>
                 <w:sz w:val="18"/>
               </w:rPr>
-              <w:t>Exporte les dependances</w:t>
+              <w:t>Exporte la liste des dependances</w:t>
             </w:r>
           </w:p>
         </w:tc>
@@ -5558,6 +6975,70 @@
           </w:p>
         </w:tc>
       </w:tr>
+    </w:tbl>
+    <w:p>
+      <w:pPr>
+        <w:pStyle w:val="Heading2"/>
+      </w:pPr>
+      <w:r>
+        <w:t>Commandes Git</w:t>
+      </w:r>
+    </w:p>
+    <w:tbl>
+      <w:tblPr>
+        <w:tblStyle w:val="TableGrid"/>
+        <w:tblW w:type="auto" w:w="0"/>
+        <w:jc w:val="center"/>
+        <w:tblLook w:firstColumn="1" w:firstRow="1" w:lastColumn="0" w:lastRow="0" w:noHBand="0" w:noVBand="1" w:val="04A0"/>
+      </w:tblPr>
+      <w:tblGrid>
+        <w:gridCol w:w="4986"/>
+        <w:gridCol w:w="4986"/>
+      </w:tblGrid>
+      <w:tr>
+        <w:tc>
+          <w:tcPr>
+            <w:tcW w:type="dxa" w:w="3402"/>
+            <w:shd w:fill="051E3B"/>
+          </w:tcPr>
+          <w:p>
+            <w:pPr>
+              <w:spacing w:before="40" w:after="40"/>
+            </w:pPr>
+            <w:r/>
+            <w:r>
+              <w:rPr>
+                <w:rFonts w:ascii="Arial" w:hAnsi="Arial"/>
+                <w:b/>
+                <w:color w:val="FFFFFF"/>
+                <w:sz w:val="18"/>
+              </w:rPr>
+              <w:t>Commande</w:t>
+            </w:r>
+          </w:p>
+        </w:tc>
+        <w:tc>
+          <w:tcPr>
+            <w:tcW w:type="dxa" w:w="5669"/>
+            <w:shd w:fill="051E3B"/>
+          </w:tcPr>
+          <w:p>
+            <w:pPr>
+              <w:spacing w:before="40" w:after="40"/>
+            </w:pPr>
+            <w:r/>
+            <w:r>
+              <w:rPr>
+                <w:rFonts w:ascii="Arial" w:hAnsi="Arial"/>
+                <w:b/>
+                <w:color w:val="FFFFFF"/>
+                <w:sz w:val="18"/>
+              </w:rPr>
+              <w:t>Explication</w:t>
+            </w:r>
+          </w:p>
+        </w:tc>
+      </w:tr>
       <w:tr>
         <w:tc>
           <w:tcPr>
@@ -5575,7 +7056,7 @@
                 <w:color w:val="2D3748"/>
                 <w:sz w:val="18"/>
               </w:rPr>
-              <w:t>claude</w:t>
+              <w:t>git init</w:t>
             </w:r>
           </w:p>
         </w:tc>
@@ -5595,7 +7076,7 @@
                 <w:color w:val="2D3748"/>
                 <w:sz w:val="18"/>
               </w:rPr>
-              <w:t>Lance Claude Code dans le dossier courant</w:t>
+              <w:t>Initialise un depot Git</w:t>
             </w:r>
           </w:p>
         </w:tc>
@@ -5618,7 +7099,7 @@
                 <w:color w:val="2D3748"/>
                 <w:sz w:val="18"/>
               </w:rPr>
-              <w:t>echo VAR=val &gt; .env</w:t>
+              <w:t>git status</w:t>
             </w:r>
           </w:p>
         </w:tc>
@@ -5639,7 +7120,179 @@
                 <w:color w:val="2D3748"/>
                 <w:sz w:val="18"/>
               </w:rPr>
-              <w:t>Cree un fichier .env avec une variable</w:t>
+              <w:t>Affiche l'etat des fichiers</w:t>
+            </w:r>
+          </w:p>
+        </w:tc>
+      </w:tr>
+      <w:tr>
+        <w:tc>
+          <w:tcPr>
+            <w:tcW w:type="dxa" w:w="3402"/>
+          </w:tcPr>
+          <w:p>
+            <w:pPr>
+              <w:spacing w:before="40" w:after="40"/>
+            </w:pPr>
+            <w:r/>
+            <w:r>
+              <w:rPr>
+                <w:rFonts w:ascii="Arial" w:hAnsi="Arial"/>
+                <w:b w:val="0"/>
+                <w:color w:val="2D3748"/>
+                <w:sz w:val="18"/>
+              </w:rPr>
+              <w:t>git add .</w:t>
+            </w:r>
+          </w:p>
+        </w:tc>
+        <w:tc>
+          <w:tcPr>
+            <w:tcW w:type="dxa" w:w="5669"/>
+          </w:tcPr>
+          <w:p>
+            <w:pPr>
+              <w:spacing w:before="40" w:after="40"/>
+            </w:pPr>
+            <w:r/>
+            <w:r>
+              <w:rPr>
+                <w:rFonts w:ascii="Arial" w:hAnsi="Arial"/>
+                <w:b w:val="0"/>
+                <w:color w:val="2D3748"/>
+                <w:sz w:val="18"/>
+              </w:rPr>
+              <w:t>Ajoute tous les fichiers modifies</w:t>
+            </w:r>
+          </w:p>
+        </w:tc>
+      </w:tr>
+      <w:tr>
+        <w:tc>
+          <w:tcPr>
+            <w:tcW w:type="dxa" w:w="3402"/>
+            <w:shd w:fill="F0F4F8"/>
+          </w:tcPr>
+          <w:p>
+            <w:pPr>
+              <w:spacing w:before="40" w:after="40"/>
+            </w:pPr>
+            <w:r/>
+            <w:r>
+              <w:rPr>
+                <w:rFonts w:ascii="Arial" w:hAnsi="Arial"/>
+                <w:b w:val="0"/>
+                <w:color w:val="2D3748"/>
+                <w:sz w:val="18"/>
+              </w:rPr>
+              <w:t>git commit -m "message"</w:t>
+            </w:r>
+          </w:p>
+        </w:tc>
+        <w:tc>
+          <w:tcPr>
+            <w:tcW w:type="dxa" w:w="5669"/>
+            <w:shd w:fill="F0F4F8"/>
+          </w:tcPr>
+          <w:p>
+            <w:pPr>
+              <w:spacing w:before="40" w:after="40"/>
+            </w:pPr>
+            <w:r/>
+            <w:r>
+              <w:rPr>
+                <w:rFonts w:ascii="Arial" w:hAnsi="Arial"/>
+                <w:b w:val="0"/>
+                <w:color w:val="2D3748"/>
+                <w:sz w:val="18"/>
+              </w:rPr>
+              <w:t>Cree un commit avec description</w:t>
+            </w:r>
+          </w:p>
+        </w:tc>
+      </w:tr>
+      <w:tr>
+        <w:tc>
+          <w:tcPr>
+            <w:tcW w:type="dxa" w:w="3402"/>
+          </w:tcPr>
+          <w:p>
+            <w:pPr>
+              <w:spacing w:before="40" w:after="40"/>
+            </w:pPr>
+            <w:r/>
+            <w:r>
+              <w:rPr>
+                <w:rFonts w:ascii="Arial" w:hAnsi="Arial"/>
+                <w:b w:val="0"/>
+                <w:color w:val="2D3748"/>
+                <w:sz w:val="18"/>
+              </w:rPr>
+              <w:t>git push origin main</w:t>
+            </w:r>
+          </w:p>
+        </w:tc>
+        <w:tc>
+          <w:tcPr>
+            <w:tcW w:type="dxa" w:w="5669"/>
+          </w:tcPr>
+          <w:p>
+            <w:pPr>
+              <w:spacing w:before="40" w:after="40"/>
+            </w:pPr>
+            <w:r/>
+            <w:r>
+              <w:rPr>
+                <w:rFonts w:ascii="Arial" w:hAnsi="Arial"/>
+                <w:b w:val="0"/>
+                <w:color w:val="2D3748"/>
+                <w:sz w:val="18"/>
+              </w:rPr>
+              <w:t>Envoie vers GitHub</w:t>
+            </w:r>
+          </w:p>
+        </w:tc>
+      </w:tr>
+      <w:tr>
+        <w:tc>
+          <w:tcPr>
+            <w:tcW w:type="dxa" w:w="3402"/>
+            <w:shd w:fill="F0F4F8"/>
+          </w:tcPr>
+          <w:p>
+            <w:pPr>
+              <w:spacing w:before="40" w:after="40"/>
+            </w:pPr>
+            <w:r/>
+            <w:r>
+              <w:rPr>
+                <w:rFonts w:ascii="Arial" w:hAnsi="Arial"/>
+                <w:b w:val="0"/>
+                <w:color w:val="2D3748"/>
+                <w:sz w:val="18"/>
+              </w:rPr>
+              <w:t>git pull origin main</w:t>
+            </w:r>
+          </w:p>
+        </w:tc>
+        <w:tc>
+          <w:tcPr>
+            <w:tcW w:type="dxa" w:w="5669"/>
+            <w:shd w:fill="F0F4F8"/>
+          </w:tcPr>
+          <w:p>
+            <w:pPr>
+              <w:spacing w:before="40" w:after="40"/>
+            </w:pPr>
+            <w:r/>
+            <w:r>
+              <w:rPr>
+                <w:rFonts w:ascii="Arial" w:hAnsi="Arial"/>
+                <w:b w:val="0"/>
+                <w:color w:val="2D3748"/>
+                <w:sz w:val="18"/>
+              </w:rPr>
+              <w:t>Recupere depuis GitHub</w:t>
             </w:r>
           </w:p>
         </w:tc>
@@ -5650,7 +7303,7 @@
         <w:pStyle w:val="Heading2"/>
       </w:pPr>
       <w:r>
-        <w:t>Commandes Claude Code utiles</w:t>
+        <w:t>Dans Claude Code</w:t>
       </w:r>
     </w:p>
     <w:tbl>
@@ -5682,7 +7335,7 @@
                 <w:color w:val="FFFFFF"/>
                 <w:sz w:val="18"/>
               </w:rPr>
-              <w:t>Dans Claude Code</w:t>
+              <w:t>Action</w:t>
             </w:r>
           </w:p>
         </w:tc>
@@ -5745,7 +7398,7 @@
                 <w:color w:val="2D3748"/>
                 <w:sz w:val="18"/>
               </w:rPr>
-              <w:t>Affiche l'aide Claude Code</w:t>
+              <w:t>Affiche l'aide</w:t>
             </w:r>
           </w:p>
         </w:tc>
@@ -5789,7 +7442,7 @@
                 <w:color w:val="2D3748"/>
                 <w:sz w:val="18"/>
               </w:rPr>
-              <w:t>Efface l'historique de conversation</w:t>
+              <w:t>Efface l'historique</w:t>
             </w:r>
           </w:p>
         </w:tc>
@@ -5811,7 +7464,7 @@
                 <w:color w:val="2D3748"/>
                 <w:sz w:val="18"/>
               </w:rPr>
-              <w:t>/status</w:t>
+              <w:t>Ctrl+C</w:t>
             </w:r>
           </w:p>
         </w:tc>
@@ -5831,7 +7484,7 @@
                 <w:color w:val="2D3748"/>
                 <w:sz w:val="18"/>
               </w:rPr>
-              <w:t>Affiche l'etat des fichiers modifies</w:t>
+              <w:t>Interrompt la generation</w:t>
             </w:r>
           </w:p>
         </w:tc>
@@ -5854,7 +7507,7 @@
                 <w:color w:val="2D3748"/>
                 <w:sz w:val="18"/>
               </w:rPr>
-              <w:t>Ctrl+C</w:t>
+              <w:t>Coller une erreur</w:t>
             </w:r>
           </w:p>
         </w:tc>
@@ -5875,7 +7528,7 @@
                 <w:color w:val="2D3748"/>
                 <w:sz w:val="18"/>
               </w:rPr>
-              <w:t>Interrompt une generation en cours</w:t>
+              <w:t>Claude analyse et corrige</w:t>
             </w:r>
           </w:p>
         </w:tc>
@@ -5897,7 +7550,7 @@
                 <w:color w:val="2D3748"/>
                 <w:sz w:val="18"/>
               </w:rPr>
-              <w:t>Coller une erreur</w:t>
+              <w:t>"Lis le fichier X"</w:t>
             </w:r>
           </w:p>
         </w:tc>
@@ -5917,7 +7570,7 @@
                 <w:color w:val="2D3748"/>
                 <w:sz w:val="18"/>
               </w:rPr>
-              <w:t>Claude analyse et corrige automatiquement</w:t>
+              <w:t>Affiche le contenu</w:t>
             </w:r>
           </w:p>
         </w:tc>
@@ -5940,7 +7593,7 @@
                 <w:color w:val="2D3748"/>
                 <w:sz w:val="18"/>
               </w:rPr>
-              <w:t>"Lis le fichier X"</w:t>
+              <w:t>"Montre la structure"</w:t>
             </w:r>
           </w:p>
         </w:tc>
@@ -5961,49 +7614,7 @@
                 <w:color w:val="2D3748"/>
                 <w:sz w:val="18"/>
               </w:rPr>
-              <w:t>Claude affiche le contenu du fichier</w:t>
-            </w:r>
-          </w:p>
-        </w:tc>
-      </w:tr>
-      <w:tr>
-        <w:tc>
-          <w:tcPr>
-            <w:tcW w:type="dxa" w:w="2835"/>
-          </w:tcPr>
-          <w:p>
-            <w:pPr>
-              <w:spacing w:before="40" w:after="40"/>
-            </w:pPr>
-            <w:r/>
-            <w:r>
-              <w:rPr>
-                <w:rFonts w:ascii="Arial" w:hAnsi="Arial"/>
-                <w:b w:val="0"/>
-                <w:color w:val="2D3748"/>
-                <w:sz w:val="18"/>
-              </w:rPr>
-              <w:t>"Montre-moi la structure du projet"</w:t>
-            </w:r>
-          </w:p>
-        </w:tc>
-        <w:tc>
-          <w:tcPr>
-            <w:tcW w:type="dxa" w:w="6236"/>
-          </w:tcPr>
-          <w:p>
-            <w:pPr>
-              <w:spacing w:before="40" w:after="40"/>
-            </w:pPr>
-            <w:r/>
-            <w:r>
-              <w:rPr>
-                <w:rFonts w:ascii="Arial" w:hAnsi="Arial"/>
-                <w:b w:val="0"/>
-                <w:color w:val="2D3748"/>
-                <w:sz w:val="18"/>
-              </w:rPr>
-              <w:t>Claude liste l'arborescence</w:t>
+              <w:t>Liste l'arborescence du projet</w:t>
             </w:r>
           </w:p>
         </w:tc>

</xml_diff>